<commit_message>
Use row-level AIRR records for pGen-SHM plots
</commit_message>
<xml_diff>
--- a/TSVからSHMデータ作成仕様書_20260607.docx
+++ b/TSVからSHMデータ作成仕様書_20260607.docx
@@ -4,28 +4,27 @@
   <w:body>
     <w:p>
       <w:pPr>
-        <w:spacing w:after="80"/>
+        <w:jc w:val="center"/>
       </w:pPr>
       <w:r>
         <w:rPr>
-          <w:rFonts w:ascii="Calibri" w:hAnsi="Calibri" w:eastAsia="Yu Gothic"/>
+          <w:rFonts w:ascii="Yu Gothic" w:hAnsi="Yu Gothic"/>
           <w:b/>
-          <w:color w:val="1F4D78"/>
-          <w:sz w:val="40"/>
+          <w:sz w:val="36"/>
         </w:rPr>
         <w:t>TSVからSHMデータ作成仕様書</w:t>
       </w:r>
     </w:p>
     <w:p>
       <w:pPr>
-        <w:spacing w:after="200"/>
+        <w:jc w:val="center"/>
       </w:pPr>
       <w:r>
         <w:rPr>
-          <w:color w:val="666666"/>
+          <w:rFonts w:ascii="Yu Gothic" w:hAnsi="Yu Gothic"/>
           <w:sz w:val="20"/>
         </w:rPr>
-        <w:t>対象: IgBLAST AIRR outfmt 19 TSV -&gt; SHM histogram / SHM intermediate data</w:t>
+        <w:t>対象: IgBLAST AIRR outfmt 19 TSV -&gt; row-level SHM data / SHM histogram</w:t>
       </w:r>
     </w:p>
     <w:p>
@@ -38,61 +37,197 @@
     </w:p>
     <w:p>
       <w:r>
-        <w:t>本仕様書は、IgBLAST outfmt 19のAIRR TSVからSHMデータを作成する処理を定義する。SHMデータは、pGen-SHM plotの縦軸に使うだけでなく、単独でSHM分布を確認するための中間成果物である。処理の主目的は、read単位のばらつきをそのまま可視化するのではなく、unique junction(nt)単位に集約したmedian SHMを作成し、サンプル内の変異率分布を安定して評価できるようにすることである。</w:t>
+        <w:t>本仕様書は、IgBLAST outfmt 19のAIRR TSVからSHMデータを作成する処理を定義する。現行仕様では、フィルタ後のAIRR各行、すなわちsequence_idごとに1つのSHM値を計算し、pGen-SHM plotの縦軸およびSHM分布図の入力として用いる。</w:t>
+      </w:r>
+    </w:p>
+    <w:p>
+      <w:pPr>
+        <w:pStyle w:val="Heading1"/>
+      </w:pPr>
+      <w:r>
+        <w:t>2. フィルタリング仕様</w:t>
+      </w:r>
+    </w:p>
+    <w:p>
+      <w:pPr>
+        <w:pStyle w:val="ListBullet"/>
+      </w:pPr>
+      <w:r>
+        <w:t>入力は IgBLAST AIRR outfmt 19 TSV とする。FASTAは本ソフトでは直接読まず、前段でAIRR TSVへ変換済みであることを前提とする。</w:t>
+      </w:r>
+    </w:p>
+    <w:p>
+      <w:pPr>
+        <w:pStyle w:val="ListBullet"/>
+      </w:pPr>
+      <w:r>
+        <w:t>必須列 productive, junction, junction_aa, v_identity の存在を確認する。sequence_id は出力列として使用し、欠損時は row_&lt;入力行番号&gt; で補完してQCに記録する。</w:t>
+      </w:r>
+    </w:p>
+    <w:p>
+      <w:pPr>
+        <w:pStyle w:val="ListBullet"/>
+      </w:pPr>
+      <w:r>
+        <w:t>locus列があり値がIGH以外の行は除外する。locus空欄は保持し、kept_empty_locusとしてQC summaryへ記録する。</w:t>
+      </w:r>
+    </w:p>
+    <w:p>
+      <w:pPr>
+        <w:pStyle w:val="ListBullet"/>
+      </w:pPr>
+      <w:r>
+        <w:t>productive が T, TRUE, 1, Y, YES のいずれにも該当しない行は除外する。</w:t>
+      </w:r>
+    </w:p>
+    <w:p>
+      <w:pPr>
+        <w:pStyle w:val="ListBullet"/>
+      </w:pPr>
+      <w:r>
+        <w:t>vj_in_frame列が存在する場合、T相当でない行を除外する。</w:t>
+      </w:r>
+    </w:p>
+    <w:p>
+      <w:pPr>
+        <w:pStyle w:val="ListBullet"/>
+      </w:pPr>
+      <w:r>
+        <w:t>stop_codon列が存在する場合、T相当の行を除外する。</w:t>
+      </w:r>
+    </w:p>
+    <w:p>
+      <w:pPr>
+        <w:pStyle w:val="ListBullet"/>
+      </w:pPr>
+      <w:r>
+        <w:t>junction が空欄、または A/C/G/T 以外を含む行を除外する。</w:t>
+      </w:r>
+    </w:p>
+    <w:p>
+      <w:pPr>
+        <w:pStyle w:val="ListBullet"/>
+      </w:pPr>
+      <w:r>
+        <w:t>junction_aa が空欄、*、X、非英字を含む行を除外する。</w:t>
+      </w:r>
+    </w:p>
+    <w:p>
+      <w:pPr>
+        <w:pStyle w:val="ListBullet"/>
+      </w:pPr>
+      <w:r>
+        <w:t>v_identity が空欄または数値化不能の行を除外する。</w:t>
+      </w:r>
+    </w:p>
+    <w:p>
+      <w:pPr>
+        <w:pStyle w:val="ListBullet"/>
+      </w:pPr>
+      <w:r>
+        <w:t>Min V alignment length が0より大きい場合、V alignment長が閾値未満の行を除外する。</w:t>
+      </w:r>
+    </w:p>
+    <w:p>
+      <w:pPr>
+        <w:pStyle w:val="Heading1"/>
+      </w:pPr>
+      <w:r>
+        <w:t>3. SHM計算仕様</w:t>
+      </w:r>
+    </w:p>
+    <w:p>
+      <w:pPr>
+        <w:pStyle w:val="ListBullet"/>
+      </w:pPr>
+      <w:r>
+        <w:t>SHMは各採用行の v_identity から計算する。</w:t>
+      </w:r>
+    </w:p>
+    <w:p>
+      <w:pPr>
+        <w:pStyle w:val="ListBullet"/>
+      </w:pPr>
+      <w:r>
+        <w:t>v_identity &lt;= 1.2 の場合は0-1スケールとみなし、SHM = (1 - v_identity) * 100 とする。</w:t>
+      </w:r>
+    </w:p>
+    <w:p>
+      <w:pPr>
+        <w:pStyle w:val="ListBullet"/>
+      </w:pPr>
+      <w:r>
+        <w:t>v_identity &gt; 1.2 の場合は0-100スケールとみなし、SHM = 100 - v_identity とする。</w:t>
+      </w:r>
+    </w:p>
+    <w:p>
+      <w:pPr>
+        <w:pStyle w:val="ListBullet"/>
+      </w:pPr>
+      <w:r>
+        <w:t>計算結果が負になる場合は0に丸める。</w:t>
+      </w:r>
+    </w:p>
+    <w:p>
+      <w:pPr>
+        <w:pStyle w:val="ListBullet"/>
+      </w:pPr>
+      <w:r>
+        <w:t>IgBLAST出力例では v_identity は小数3桁であり、SHMも実質的に小数3桁相当の分解能を持つ。</w:t>
+      </w:r>
+    </w:p>
+    <w:p>
+      <w:pPr>
+        <w:pStyle w:val="Heading1"/>
+      </w:pPr>
+      <w:r>
+        <w:t>4. 中間Excel出力</w:t>
+      </w:r>
+    </w:p>
+    <w:p>
+      <w:r>
+        <w:t>採用されたAIRR各行のみを、row-level中間Excelとして出力する。フィルタで除外された行はExcelに含めない。</w:t>
       </w:r>
     </w:p>
     <w:tbl>
       <w:tblPr>
         <w:tblStyle w:val="TableGrid"/>
         <w:tblW w:type="auto" w:w="0"/>
-        <w:jc w:val="left"/>
-        <w:tblLayout w:type="fixed"/>
         <w:tblLook w:firstColumn="1" w:firstRow="1" w:lastColumn="0" w:lastRow="0" w:noHBand="0" w:noVBand="1" w:val="04A0"/>
       </w:tblPr>
       <w:tblGrid>
-        <w:gridCol w:w="4680"/>
-        <w:gridCol w:w="4680"/>
+        <w:gridCol w:w="2880"/>
+        <w:gridCol w:w="2880"/>
+        <w:gridCol w:w="2880"/>
       </w:tblGrid>
       <w:tr>
         <w:tc>
           <w:tcPr>
-            <w:tcW w:type="dxa" w:w="2304"/>
-            <w:shd w:fill="E8EEF5"/>
-            <w:tcMar>
-              <w:top w:w="80" w:type="dxa"/>
-              <w:start w:w="120" w:type="dxa"/>
-              <w:bottom w:w="80" w:type="dxa"/>
-              <w:end w:w="120" w:type="dxa"/>
-            </w:tcMar>
-            <w:vAlign w:val="center"/>
+            <w:tcW w:type="dxa" w:w="2880"/>
           </w:tcPr>
           <w:p>
             <w:r>
-              <w:rPr>
-                <w:b/>
-              </w:rPr>
-              <w:t>項目</w:t>
+              <w:t>列名</w:t>
             </w:r>
           </w:p>
         </w:tc>
         <w:tc>
           <w:tcPr>
-            <w:tcW w:type="dxa" w:w="7056"/>
-            <w:shd w:fill="E8EEF5"/>
-            <w:tcMar>
-              <w:top w:w="80" w:type="dxa"/>
-              <w:start w:w="120" w:type="dxa"/>
-              <w:bottom w:w="80" w:type="dxa"/>
-              <w:end w:w="120" w:type="dxa"/>
-            </w:tcMar>
-            <w:vAlign w:val="center"/>
+            <w:tcW w:type="dxa" w:w="2880"/>
           </w:tcPr>
           <w:p>
             <w:r>
-              <w:rPr>
-                <w:b/>
-              </w:rPr>
-              <w:t>仕様</w:t>
+              <w:t>区分</w:t>
+            </w:r>
+          </w:p>
+        </w:tc>
+        <w:tc>
+          <w:tcPr>
+            <w:tcW w:type="dxa" w:w="2880"/>
+          </w:tcPr>
+          <w:p>
+            <w:r>
+              <w:t>説明</w:t>
             </w:r>
           </w:p>
         </w:tc>
@@ -100,35 +235,31 @@
       <w:tr>
         <w:tc>
           <w:tcPr>
-            <w:tcW w:type="dxa" w:w="2304"/>
-            <w:tcMar>
-              <w:top w:w="80" w:type="dxa"/>
-              <w:start w:w="120" w:type="dxa"/>
-              <w:bottom w:w="80" w:type="dxa"/>
-              <w:end w:w="120" w:type="dxa"/>
-            </w:tcMar>
-            <w:vAlign w:val="center"/>
+            <w:tcW w:type="dxa" w:w="2880"/>
           </w:tcPr>
           <w:p>
             <w:r>
-              <w:t>入力</w:t>
+              <w:t>sequence_id</w:t>
             </w:r>
           </w:p>
         </w:tc>
         <w:tc>
           <w:tcPr>
-            <w:tcW w:type="dxa" w:w="7056"/>
-            <w:tcMar>
-              <w:top w:w="80" w:type="dxa"/>
-              <w:start w:w="120" w:type="dxa"/>
-              <w:bottom w:w="80" w:type="dxa"/>
-              <w:end w:w="120" w:type="dxa"/>
-            </w:tcMar>
-            <w:vAlign w:val="center"/>
+            <w:tcW w:type="dxa" w:w="2880"/>
           </w:tcPr>
           <w:p>
             <w:r>
-              <w:t>IgBLAST AIRR outfmt 19 TSV。FASTAやcounts TSVは入力対象外。</w:t>
+              <w:t>必要データ</w:t>
+            </w:r>
+          </w:p>
+        </w:tc>
+        <w:tc>
+          <w:tcPr>
+            <w:tcW w:type="dxa" w:w="2880"/>
+          </w:tcPr>
+          <w:p>
+            <w:r>
+              <w:t>AIRR TSVのsequence_id。欠損時は row_&lt;入力行番号&gt; で補完する。</w:t>
             </w:r>
           </w:p>
         </w:tc>
@@ -136,35 +267,31 @@
       <w:tr>
         <w:tc>
           <w:tcPr>
-            <w:tcW w:type="dxa" w:w="2304"/>
-            <w:tcMar>
-              <w:top w:w="80" w:type="dxa"/>
-              <w:start w:w="120" w:type="dxa"/>
-              <w:bottom w:w="80" w:type="dxa"/>
-              <w:end w:w="120" w:type="dxa"/>
-            </w:tcMar>
-            <w:vAlign w:val="center"/>
+            <w:tcW w:type="dxa" w:w="2880"/>
           </w:tcPr>
           <w:p>
             <w:r>
-              <w:t>主出力</w:t>
+              <w:t>junction_aa</w:t>
             </w:r>
           </w:p>
         </w:tc>
         <w:tc>
           <w:tcPr>
-            <w:tcW w:type="dxa" w:w="7056"/>
-            <w:tcMar>
-              <w:top w:w="80" w:type="dxa"/>
-              <w:start w:w="120" w:type="dxa"/>
-              <w:bottom w:w="80" w:type="dxa"/>
-              <w:end w:w="120" w:type="dxa"/>
-            </w:tcMar>
-            <w:vAlign w:val="center"/>
+            <w:tcW w:type="dxa" w:w="2880"/>
           </w:tcPr>
           <w:p>
             <w:r>
-              <w:t>&lt;sample&gt;_shm_hist.tsv, &lt;sample&gt;_shm_hist.png</w:t>
+              <w:t>必要データ</w:t>
+            </w:r>
+          </w:p>
+        </w:tc>
+        <w:tc>
+          <w:tcPr>
+            <w:tcW w:type="dxa" w:w="2880"/>
+          </w:tcPr>
+          <w:p>
+            <w:r>
+              <w:t>pGen計算に使用するCDR3アミノ酸配列。</w:t>
             </w:r>
           </w:p>
         </w:tc>
@@ -172,35 +299,31 @@
       <w:tr>
         <w:tc>
           <w:tcPr>
-            <w:tcW w:type="dxa" w:w="2304"/>
-            <w:tcMar>
-              <w:top w:w="80" w:type="dxa"/>
-              <w:start w:w="120" w:type="dxa"/>
-              <w:bottom w:w="80" w:type="dxa"/>
-              <w:end w:w="120" w:type="dxa"/>
-            </w:tcMar>
-            <w:vAlign w:val="center"/>
+            <w:tcW w:type="dxa" w:w="2880"/>
           </w:tcPr>
           <w:p>
             <w:r>
-              <w:t>中間出力</w:t>
+              <w:t>shm</w:t>
             </w:r>
           </w:p>
         </w:tc>
         <w:tc>
           <w:tcPr>
-            <w:tcW w:type="dxa" w:w="7056"/>
-            <w:tcMar>
-              <w:top w:w="80" w:type="dxa"/>
-              <w:start w:w="120" w:type="dxa"/>
-              <w:bottom w:w="80" w:type="dxa"/>
-              <w:end w:w="120" w:type="dxa"/>
-            </w:tcMar>
-            <w:vAlign w:val="center"/>
+            <w:tcW w:type="dxa" w:w="2880"/>
           </w:tcPr>
           <w:p>
             <w:r>
-              <w:t>&lt;sample&gt;_pgen_shm_points.tsv内のshm_median列</w:t>
+              <w:t>必要データ</w:t>
+            </w:r>
+          </w:p>
+        </w:tc>
+        <w:tc>
+          <w:tcPr>
+            <w:tcW w:type="dxa" w:w="2880"/>
+          </w:tcPr>
+          <w:p>
+            <w:r>
+              <w:t>その行のv_identityから計算したSHM値。</w:t>
             </w:r>
           </w:p>
         </w:tc>
@@ -208,35 +331,31 @@
       <w:tr>
         <w:tc>
           <w:tcPr>
-            <w:tcW w:type="dxa" w:w="2304"/>
-            <w:tcMar>
-              <w:top w:w="80" w:type="dxa"/>
-              <w:start w:w="120" w:type="dxa"/>
-              <w:bottom w:w="80" w:type="dxa"/>
-              <w:end w:w="120" w:type="dxa"/>
-            </w:tcMar>
-            <w:vAlign w:val="center"/>
+            <w:tcW w:type="dxa" w:w="2880"/>
           </w:tcPr>
           <w:p>
             <w:r>
-              <w:t>解析単位</w:t>
+              <w:t>pgen</w:t>
             </w:r>
           </w:p>
         </w:tc>
         <w:tc>
           <w:tcPr>
-            <w:tcW w:type="dxa" w:w="7056"/>
-            <w:tcMar>
-              <w:top w:w="80" w:type="dxa"/>
-              <w:start w:w="120" w:type="dxa"/>
-              <w:bottom w:w="80" w:type="dxa"/>
-              <w:end w:w="120" w:type="dxa"/>
-            </w:tcMar>
-            <w:vAlign w:val="center"/>
+            <w:tcW w:type="dxa" w:w="2880"/>
           </w:tcPr>
           <w:p>
             <w:r>
-              <w:t>unique junction(nt)。同じjunction配列を持つreadを1グループとする。</w:t>
+              <w:t>必要データ</w:t>
+            </w:r>
+          </w:p>
+        </w:tc>
+        <w:tc>
+          <w:tcPr>
+            <w:tcW w:type="dxa" w:w="2880"/>
+          </w:tcPr>
+          <w:p>
+            <w:r>
+              <w:t>その行のjunction_aaに対応するpGen値。SHM仕様書では参照列。</w:t>
             </w:r>
           </w:p>
         </w:tc>
@@ -244,35 +363,287 @@
       <w:tr>
         <w:tc>
           <w:tcPr>
-            <w:tcW w:type="dxa" w:w="2304"/>
-            <w:tcMar>
-              <w:top w:w="80" w:type="dxa"/>
-              <w:start w:w="120" w:type="dxa"/>
-              <w:bottom w:w="80" w:type="dxa"/>
-              <w:end w:w="120" w:type="dxa"/>
-            </w:tcMar>
-            <w:vAlign w:val="center"/>
+            <w:tcW w:type="dxa" w:w="2880"/>
           </w:tcPr>
           <w:p>
             <w:r>
-              <w:t>SHM定義</w:t>
+              <w:t>log10_pgen</w:t>
             </w:r>
           </w:p>
         </w:tc>
         <w:tc>
           <w:tcPr>
-            <w:tcW w:type="dxa" w:w="7056"/>
-            <w:tcMar>
-              <w:top w:w="80" w:type="dxa"/>
-              <w:start w:w="120" w:type="dxa"/>
-              <w:bottom w:w="80" w:type="dxa"/>
-              <w:end w:w="120" w:type="dxa"/>
-            </w:tcMar>
-            <w:vAlign w:val="center"/>
+            <w:tcW w:type="dxa" w:w="2880"/>
           </w:tcPr>
           <w:p>
             <w:r>
-              <w:t>v_identityから算出するV領域変異率。</w:t>
+              <w:t>必要データ</w:t>
+            </w:r>
+          </w:p>
+        </w:tc>
+        <w:tc>
+          <w:tcPr>
+            <w:tcW w:type="dxa" w:w="2880"/>
+          </w:tcPr>
+          <w:p>
+            <w:r>
+              <w:t>pGen&gt;0の場合のlog10(pGen)。SHM仕様書では参照列。</w:t>
+            </w:r>
+          </w:p>
+        </w:tc>
+      </w:tr>
+      <w:tr>
+        <w:tc>
+          <w:tcPr>
+            <w:tcW w:type="dxa" w:w="2880"/>
+          </w:tcPr>
+          <w:p>
+            <w:r>
+              <w:t>junction</w:t>
+            </w:r>
+          </w:p>
+        </w:tc>
+        <w:tc>
+          <w:tcPr>
+            <w:tcW w:type="dxa" w:w="2880"/>
+          </w:tcPr>
+          <w:p>
+            <w:r>
+              <w:t>参考データ</w:t>
+            </w:r>
+          </w:p>
+        </w:tc>
+        <w:tc>
+          <w:tcPr>
+            <w:tcW w:type="dxa" w:w="2880"/>
+          </w:tcPr>
+          <w:p>
+            <w:r>
+              <w:t>CDR3塩基配列。</w:t>
+            </w:r>
+          </w:p>
+        </w:tc>
+      </w:tr>
+      <w:tr>
+        <w:tc>
+          <w:tcPr>
+            <w:tcW w:type="dxa" w:w="2880"/>
+          </w:tcPr>
+          <w:p>
+            <w:r>
+              <w:t>v_identity</w:t>
+            </w:r>
+          </w:p>
+        </w:tc>
+        <w:tc>
+          <w:tcPr>
+            <w:tcW w:type="dxa" w:w="2880"/>
+          </w:tcPr>
+          <w:p>
+            <w:r>
+              <w:t>参考データ</w:t>
+            </w:r>
+          </w:p>
+        </w:tc>
+        <w:tc>
+          <w:tcPr>
+            <w:tcW w:type="dxa" w:w="2880"/>
+          </w:tcPr>
+          <w:p>
+            <w:r>
+              <w:t>SHM計算元のV identity値。</w:t>
+            </w:r>
+          </w:p>
+        </w:tc>
+      </w:tr>
+      <w:tr>
+        <w:tc>
+          <w:tcPr>
+            <w:tcW w:type="dxa" w:w="2880"/>
+          </w:tcPr>
+          <w:p>
+            <w:r>
+              <w:t>locus</w:t>
+            </w:r>
+          </w:p>
+        </w:tc>
+        <w:tc>
+          <w:tcPr>
+            <w:tcW w:type="dxa" w:w="2880"/>
+          </w:tcPr>
+          <w:p>
+            <w:r>
+              <w:t>参考データ</w:t>
+            </w:r>
+          </w:p>
+        </w:tc>
+        <w:tc>
+          <w:tcPr>
+            <w:tcW w:type="dxa" w:w="2880"/>
+          </w:tcPr>
+          <w:p>
+            <w:r>
+              <w:t>IGH判定およびQC確認用。</w:t>
+            </w:r>
+          </w:p>
+        </w:tc>
+      </w:tr>
+      <w:tr>
+        <w:tc>
+          <w:tcPr>
+            <w:tcW w:type="dxa" w:w="2880"/>
+          </w:tcPr>
+          <w:p>
+            <w:r>
+              <w:t>productive</w:t>
+            </w:r>
+          </w:p>
+        </w:tc>
+        <w:tc>
+          <w:tcPr>
+            <w:tcW w:type="dxa" w:w="2880"/>
+          </w:tcPr>
+          <w:p>
+            <w:r>
+              <w:t>参考データ</w:t>
+            </w:r>
+          </w:p>
+        </w:tc>
+        <w:tc>
+          <w:tcPr>
+            <w:tcW w:type="dxa" w:w="2880"/>
+          </w:tcPr>
+          <w:p>
+            <w:r>
+              <w:t>productiveフィルタ確認用。</w:t>
+            </w:r>
+          </w:p>
+        </w:tc>
+      </w:tr>
+      <w:tr>
+        <w:tc>
+          <w:tcPr>
+            <w:tcW w:type="dxa" w:w="2880"/>
+          </w:tcPr>
+          <w:p>
+            <w:r>
+              <w:t>v_call</w:t>
+            </w:r>
+          </w:p>
+        </w:tc>
+        <w:tc>
+          <w:tcPr>
+            <w:tcW w:type="dxa" w:w="2880"/>
+          </w:tcPr>
+          <w:p>
+            <w:r>
+              <w:t>参考データ</w:t>
+            </w:r>
+          </w:p>
+        </w:tc>
+        <w:tc>
+          <w:tcPr>
+            <w:tcW w:type="dxa" w:w="2880"/>
+          </w:tcPr>
+          <w:p>
+            <w:r>
+              <w:t>pGen計算には使わないが、解釈/QCに利用する。</w:t>
+            </w:r>
+          </w:p>
+        </w:tc>
+      </w:tr>
+      <w:tr>
+        <w:tc>
+          <w:tcPr>
+            <w:tcW w:type="dxa" w:w="2880"/>
+          </w:tcPr>
+          <w:p>
+            <w:r>
+              <w:t>j_call</w:t>
+            </w:r>
+          </w:p>
+        </w:tc>
+        <w:tc>
+          <w:tcPr>
+            <w:tcW w:type="dxa" w:w="2880"/>
+          </w:tcPr>
+          <w:p>
+            <w:r>
+              <w:t>参考データ</w:t>
+            </w:r>
+          </w:p>
+        </w:tc>
+        <w:tc>
+          <w:tcPr>
+            <w:tcW w:type="dxa" w:w="2880"/>
+          </w:tcPr>
+          <w:p>
+            <w:r>
+              <w:t>pGen計算には使わないが、解釈/QCに利用する。</w:t>
+            </w:r>
+          </w:p>
+        </w:tc>
+      </w:tr>
+      <w:tr>
+        <w:tc>
+          <w:tcPr>
+            <w:tcW w:type="dxa" w:w="2880"/>
+          </w:tcPr>
+          <w:p>
+            <w:r>
+              <w:t>same_xy_count</w:t>
+            </w:r>
+          </w:p>
+        </w:tc>
+        <w:tc>
+          <w:tcPr>
+            <w:tcW w:type="dxa" w:w="2880"/>
+          </w:tcPr>
+          <w:p>
+            <w:r>
+              <w:t>描画補助</w:t>
+            </w:r>
+          </w:p>
+        </w:tc>
+        <w:tc>
+          <w:tcPr>
+            <w:tcW w:type="dxa" w:w="2880"/>
+          </w:tcPr>
+          <w:p>
+            <w:r>
+              <w:t>同一log10_pgenかつ同一SHMを持つ採用行数。</w:t>
+            </w:r>
+          </w:p>
+        </w:tc>
+      </w:tr>
+      <w:tr>
+        <w:tc>
+          <w:tcPr>
+            <w:tcW w:type="dxa" w:w="2880"/>
+          </w:tcPr>
+          <w:p>
+            <w:r>
+              <w:t>plot_weight</w:t>
+            </w:r>
+          </w:p>
+        </w:tc>
+        <w:tc>
+          <w:tcPr>
+            <w:tcW w:type="dxa" w:w="2880"/>
+          </w:tcPr>
+          <w:p>
+            <w:r>
+              <w:t>描画補助</w:t>
+            </w:r>
+          </w:p>
+        </w:tc>
+        <w:tc>
+          <w:tcPr>
+            <w:tcW w:type="dxa" w:w="2880"/>
+          </w:tcPr>
+          <w:p>
+            <w:r>
+              <w:t>通常は1。duplicate_countを使う設定ではその値。</w:t>
             </w:r>
           </w:p>
         </w:tc>
@@ -284,758 +655,31 @@
         <w:pStyle w:val="Heading1"/>
       </w:pPr>
       <w:r>
-        <w:t>2. 必須入力カラム</w:t>
-      </w:r>
-    </w:p>
-    <w:tbl>
-      <w:tblPr>
-        <w:tblStyle w:val="TableGrid"/>
-        <w:tblW w:type="auto" w:w="0"/>
-        <w:jc w:val="left"/>
-        <w:tblLayout w:type="fixed"/>
-        <w:tblLook w:firstColumn="1" w:firstRow="1" w:lastColumn="0" w:lastRow="0" w:noHBand="0" w:noVBand="1" w:val="04A0"/>
-      </w:tblPr>
-      <w:tblGrid>
-        <w:gridCol w:w="2340"/>
-        <w:gridCol w:w="2340"/>
-        <w:gridCol w:w="2340"/>
-        <w:gridCol w:w="2340"/>
-      </w:tblGrid>
-      <w:tr>
-        <w:tc>
-          <w:tcPr>
-            <w:tcW w:type="dxa" w:w="1872"/>
-            <w:shd w:fill="E8EEF5"/>
-            <w:tcMar>
-              <w:top w:w="80" w:type="dxa"/>
-              <w:start w:w="120" w:type="dxa"/>
-              <w:bottom w:w="80" w:type="dxa"/>
-              <w:end w:w="120" w:type="dxa"/>
-            </w:tcMar>
-            <w:vAlign w:val="center"/>
-          </w:tcPr>
-          <w:p>
-            <w:r>
-              <w:rPr>
-                <w:b/>
-              </w:rPr>
-              <w:t>カラム</w:t>
-            </w:r>
-          </w:p>
-        </w:tc>
-        <w:tc>
-          <w:tcPr>
-            <w:tcW w:type="dxa" w:w="1007"/>
-            <w:shd w:fill="E8EEF5"/>
-            <w:tcMar>
-              <w:top w:w="80" w:type="dxa"/>
-              <w:start w:w="120" w:type="dxa"/>
-              <w:bottom w:w="80" w:type="dxa"/>
-              <w:end w:w="120" w:type="dxa"/>
-            </w:tcMar>
-            <w:vAlign w:val="center"/>
-          </w:tcPr>
-          <w:p>
-            <w:r>
-              <w:rPr>
-                <w:b/>
-              </w:rPr>
-              <w:t>必須</w:t>
-            </w:r>
-          </w:p>
-        </w:tc>
-        <w:tc>
-          <w:tcPr>
-            <w:tcW w:type="dxa" w:w="3168"/>
-            <w:shd w:fill="E8EEF5"/>
-            <w:tcMar>
-              <w:top w:w="80" w:type="dxa"/>
-              <w:start w:w="120" w:type="dxa"/>
-              <w:bottom w:w="80" w:type="dxa"/>
-              <w:end w:w="120" w:type="dxa"/>
-            </w:tcMar>
-            <w:vAlign w:val="center"/>
-          </w:tcPr>
-          <w:p>
-            <w:r>
-              <w:rPr>
-                <w:b/>
-              </w:rPr>
-              <w:t>用途</w:t>
-            </w:r>
-          </w:p>
-        </w:tc>
-        <w:tc>
-          <w:tcPr>
-            <w:tcW w:type="dxa" w:w="3311"/>
-            <w:shd w:fill="E8EEF5"/>
-            <w:tcMar>
-              <w:top w:w="80" w:type="dxa"/>
-              <w:start w:w="120" w:type="dxa"/>
-              <w:bottom w:w="80" w:type="dxa"/>
-              <w:end w:w="120" w:type="dxa"/>
-            </w:tcMar>
-            <w:vAlign w:val="center"/>
-          </w:tcPr>
-          <w:p>
-            <w:r>
-              <w:rPr>
-                <w:b/>
-              </w:rPr>
-              <w:t>エラー/欠損時の扱い</w:t>
-            </w:r>
-          </w:p>
-        </w:tc>
-      </w:tr>
-      <w:tr>
-        <w:tc>
-          <w:tcPr>
-            <w:tcW w:type="dxa" w:w="1872"/>
-            <w:tcMar>
-              <w:top w:w="80" w:type="dxa"/>
-              <w:start w:w="120" w:type="dxa"/>
-              <w:bottom w:w="80" w:type="dxa"/>
-              <w:end w:w="120" w:type="dxa"/>
-            </w:tcMar>
-            <w:vAlign w:val="center"/>
-          </w:tcPr>
-          <w:p>
-            <w:r>
-              <w:t>productive</w:t>
-            </w:r>
-          </w:p>
-        </w:tc>
-        <w:tc>
-          <w:tcPr>
-            <w:tcW w:type="dxa" w:w="1007"/>
-            <w:tcMar>
-              <w:top w:w="80" w:type="dxa"/>
-              <w:start w:w="120" w:type="dxa"/>
-              <w:bottom w:w="80" w:type="dxa"/>
-              <w:end w:w="120" w:type="dxa"/>
-            </w:tcMar>
-            <w:vAlign w:val="center"/>
-          </w:tcPr>
-          <w:p>
-            <w:r>
-              <w:t>必須</w:t>
-            </w:r>
-          </w:p>
-        </w:tc>
-        <w:tc>
-          <w:tcPr>
-            <w:tcW w:type="dxa" w:w="3168"/>
-            <w:tcMar>
-              <w:top w:w="80" w:type="dxa"/>
-              <w:start w:w="120" w:type="dxa"/>
-              <w:bottom w:w="80" w:type="dxa"/>
-              <w:end w:w="120" w:type="dxa"/>
-            </w:tcMar>
-            <w:vAlign w:val="center"/>
-          </w:tcPr>
-          <w:p>
-            <w:r>
-              <w:t>機能性フィルタ。Tのみ採用。</w:t>
-            </w:r>
-          </w:p>
-        </w:tc>
-        <w:tc>
-          <w:tcPr>
-            <w:tcW w:type="dxa" w:w="3311"/>
-            <w:tcMar>
-              <w:top w:w="80" w:type="dxa"/>
-              <w:start w:w="120" w:type="dxa"/>
-              <w:bottom w:w="80" w:type="dxa"/>
-              <w:end w:w="120" w:type="dxa"/>
-            </w:tcMar>
-            <w:vAlign w:val="center"/>
-          </w:tcPr>
-          <w:p>
-            <w:r>
-              <w:t>列が無い場合は処理停止。Tでない行は除外。</w:t>
-            </w:r>
-          </w:p>
-        </w:tc>
-      </w:tr>
-      <w:tr>
-        <w:tc>
-          <w:tcPr>
-            <w:tcW w:type="dxa" w:w="1872"/>
-            <w:tcMar>
-              <w:top w:w="80" w:type="dxa"/>
-              <w:start w:w="120" w:type="dxa"/>
-              <w:bottom w:w="80" w:type="dxa"/>
-              <w:end w:w="120" w:type="dxa"/>
-            </w:tcMar>
-            <w:vAlign w:val="center"/>
-          </w:tcPr>
-          <w:p>
-            <w:r>
-              <w:t>junction</w:t>
-            </w:r>
-          </w:p>
-        </w:tc>
-        <w:tc>
-          <w:tcPr>
-            <w:tcW w:type="dxa" w:w="1007"/>
-            <w:tcMar>
-              <w:top w:w="80" w:type="dxa"/>
-              <w:start w:w="120" w:type="dxa"/>
-              <w:bottom w:w="80" w:type="dxa"/>
-              <w:end w:w="120" w:type="dxa"/>
-            </w:tcMar>
-            <w:vAlign w:val="center"/>
-          </w:tcPr>
-          <w:p>
-            <w:r>
-              <w:t>必須</w:t>
-            </w:r>
-          </w:p>
-        </w:tc>
-        <w:tc>
-          <w:tcPr>
-            <w:tcW w:type="dxa" w:w="3168"/>
-            <w:tcMar>
-              <w:top w:w="80" w:type="dxa"/>
-              <w:start w:w="120" w:type="dxa"/>
-              <w:bottom w:w="80" w:type="dxa"/>
-              <w:end w:w="120" w:type="dxa"/>
-            </w:tcMar>
-            <w:vAlign w:val="center"/>
-          </w:tcPr>
-          <w:p>
-            <w:r>
-              <w:t>unique junction(nt)のグループキー。</w:t>
-            </w:r>
-          </w:p>
-        </w:tc>
-        <w:tc>
-          <w:tcPr>
-            <w:tcW w:type="dxa" w:w="3311"/>
-            <w:tcMar>
-              <w:top w:w="80" w:type="dxa"/>
-              <w:start w:w="120" w:type="dxa"/>
-              <w:bottom w:w="80" w:type="dxa"/>
-              <w:end w:w="120" w:type="dxa"/>
-            </w:tcMar>
-            <w:vAlign w:val="center"/>
-          </w:tcPr>
-          <w:p>
-            <w:r>
-              <w:t>列が無い場合は処理停止。空欄や非ACGT混入は除外。</w:t>
-            </w:r>
-          </w:p>
-        </w:tc>
-      </w:tr>
-      <w:tr>
-        <w:tc>
-          <w:tcPr>
-            <w:tcW w:type="dxa" w:w="1872"/>
-            <w:tcMar>
-              <w:top w:w="80" w:type="dxa"/>
-              <w:start w:w="120" w:type="dxa"/>
-              <w:bottom w:w="80" w:type="dxa"/>
-              <w:end w:w="120" w:type="dxa"/>
-            </w:tcMar>
-            <w:vAlign w:val="center"/>
-          </w:tcPr>
-          <w:p>
-            <w:r>
-              <w:t>junction_aa</w:t>
-            </w:r>
-          </w:p>
-        </w:tc>
-        <w:tc>
-          <w:tcPr>
-            <w:tcW w:type="dxa" w:w="1007"/>
-            <w:tcMar>
-              <w:top w:w="80" w:type="dxa"/>
-              <w:start w:w="120" w:type="dxa"/>
-              <w:bottom w:w="80" w:type="dxa"/>
-              <w:end w:w="120" w:type="dxa"/>
-            </w:tcMar>
-            <w:vAlign w:val="center"/>
-          </w:tcPr>
-          <w:p>
-            <w:r>
-              <w:t>必須</w:t>
-            </w:r>
-          </w:p>
-        </w:tc>
-        <w:tc>
-          <w:tcPr>
-            <w:tcW w:type="dxa" w:w="3168"/>
-            <w:tcMar>
-              <w:top w:w="80" w:type="dxa"/>
-              <w:start w:w="120" w:type="dxa"/>
-              <w:bottom w:w="80" w:type="dxa"/>
-              <w:end w:w="120" w:type="dxa"/>
-            </w:tcMar>
-            <w:vAlign w:val="center"/>
-          </w:tcPr>
-          <w:p>
-            <w:r>
-              <w:t>pGen側との統合に必要。</w:t>
-            </w:r>
-          </w:p>
-        </w:tc>
-        <w:tc>
-          <w:tcPr>
-            <w:tcW w:type="dxa" w:w="3311"/>
-            <w:tcMar>
-              <w:top w:w="80" w:type="dxa"/>
-              <w:start w:w="120" w:type="dxa"/>
-              <w:bottom w:w="80" w:type="dxa"/>
-              <w:end w:w="120" w:type="dxa"/>
-            </w:tcMar>
-            <w:vAlign w:val="center"/>
-          </w:tcPr>
-          <w:p>
-            <w:r>
-              <w:t>空欄、*、X、非英字は除外。SHM単独でも統合仕様に合わせる。</w:t>
-            </w:r>
-          </w:p>
-        </w:tc>
-      </w:tr>
-      <w:tr>
-        <w:tc>
-          <w:tcPr>
-            <w:tcW w:type="dxa" w:w="1872"/>
-            <w:tcMar>
-              <w:top w:w="80" w:type="dxa"/>
-              <w:start w:w="120" w:type="dxa"/>
-              <w:bottom w:w="80" w:type="dxa"/>
-              <w:end w:w="120" w:type="dxa"/>
-            </w:tcMar>
-            <w:vAlign w:val="center"/>
-          </w:tcPr>
-          <w:p>
-            <w:r>
-              <w:t>v_identity</w:t>
-            </w:r>
-          </w:p>
-        </w:tc>
-        <w:tc>
-          <w:tcPr>
-            <w:tcW w:type="dxa" w:w="1007"/>
-            <w:tcMar>
-              <w:top w:w="80" w:type="dxa"/>
-              <w:start w:w="120" w:type="dxa"/>
-              <w:bottom w:w="80" w:type="dxa"/>
-              <w:end w:w="120" w:type="dxa"/>
-            </w:tcMar>
-            <w:vAlign w:val="center"/>
-          </w:tcPr>
-          <w:p>
-            <w:r>
-              <w:t>必須</w:t>
-            </w:r>
-          </w:p>
-        </w:tc>
-        <w:tc>
-          <w:tcPr>
-            <w:tcW w:type="dxa" w:w="3168"/>
-            <w:tcMar>
-              <w:top w:w="80" w:type="dxa"/>
-              <w:start w:w="120" w:type="dxa"/>
-              <w:bottom w:w="80" w:type="dxa"/>
-              <w:end w:w="120" w:type="dxa"/>
-            </w:tcMar>
-            <w:vAlign w:val="center"/>
-          </w:tcPr>
-          <w:p>
-            <w:r>
-              <w:t>SHM算出の核。</w:t>
-            </w:r>
-          </w:p>
-        </w:tc>
-        <w:tc>
-          <w:tcPr>
-            <w:tcW w:type="dxa" w:w="3311"/>
-            <w:tcMar>
-              <w:top w:w="80" w:type="dxa"/>
-              <w:start w:w="120" w:type="dxa"/>
-              <w:bottom w:w="80" w:type="dxa"/>
-              <w:end w:w="120" w:type="dxa"/>
-            </w:tcMar>
-            <w:vAlign w:val="center"/>
-          </w:tcPr>
-          <w:p>
-            <w:r>
-              <w:t>列が無い場合は処理停止。数値化不可は除外。</w:t>
-            </w:r>
-          </w:p>
-        </w:tc>
-      </w:tr>
-      <w:tr>
-        <w:tc>
-          <w:tcPr>
-            <w:tcW w:type="dxa" w:w="1872"/>
-            <w:tcMar>
-              <w:top w:w="80" w:type="dxa"/>
-              <w:start w:w="120" w:type="dxa"/>
-              <w:bottom w:w="80" w:type="dxa"/>
-              <w:end w:w="120" w:type="dxa"/>
-            </w:tcMar>
-            <w:vAlign w:val="center"/>
-          </w:tcPr>
-          <w:p>
-            <w:r>
-              <w:t>vj_in_frame</w:t>
-            </w:r>
-          </w:p>
-        </w:tc>
-        <w:tc>
-          <w:tcPr>
-            <w:tcW w:type="dxa" w:w="1007"/>
-            <w:tcMar>
-              <w:top w:w="80" w:type="dxa"/>
-              <w:start w:w="120" w:type="dxa"/>
-              <w:bottom w:w="80" w:type="dxa"/>
-              <w:end w:w="120" w:type="dxa"/>
-            </w:tcMar>
-            <w:vAlign w:val="center"/>
-          </w:tcPr>
-          <w:p>
-            <w:r>
-              <w:t>任意</w:t>
-            </w:r>
-          </w:p>
-        </w:tc>
-        <w:tc>
-          <w:tcPr>
-            <w:tcW w:type="dxa" w:w="3168"/>
-            <w:tcMar>
-              <w:top w:w="80" w:type="dxa"/>
-              <w:start w:w="120" w:type="dxa"/>
-              <w:bottom w:w="80" w:type="dxa"/>
-              <w:end w:w="120" w:type="dxa"/>
-            </w:tcMar>
-            <w:vAlign w:val="center"/>
-          </w:tcPr>
-          <w:p>
-            <w:r>
-              <w:t>存在する場合はTのみ採用。</w:t>
-            </w:r>
-          </w:p>
-        </w:tc>
-        <w:tc>
-          <w:tcPr>
-            <w:tcW w:type="dxa" w:w="3311"/>
-            <w:tcMar>
-              <w:top w:w="80" w:type="dxa"/>
-              <w:start w:w="120" w:type="dxa"/>
-              <w:bottom w:w="80" w:type="dxa"/>
-              <w:end w:w="120" w:type="dxa"/>
-            </w:tcMar>
-            <w:vAlign w:val="center"/>
-          </w:tcPr>
-          <w:p>
-            <w:r>
-              <w:t>列が無い場合はフィルタを省略。</w:t>
-            </w:r>
-          </w:p>
-        </w:tc>
-      </w:tr>
-      <w:tr>
-        <w:tc>
-          <w:tcPr>
-            <w:tcW w:type="dxa" w:w="1872"/>
-            <w:tcMar>
-              <w:top w:w="80" w:type="dxa"/>
-              <w:start w:w="120" w:type="dxa"/>
-              <w:bottom w:w="80" w:type="dxa"/>
-              <w:end w:w="120" w:type="dxa"/>
-            </w:tcMar>
-            <w:vAlign w:val="center"/>
-          </w:tcPr>
-          <w:p>
-            <w:r>
-              <w:t>stop_codon</w:t>
-            </w:r>
-          </w:p>
-        </w:tc>
-        <w:tc>
-          <w:tcPr>
-            <w:tcW w:type="dxa" w:w="1007"/>
-            <w:tcMar>
-              <w:top w:w="80" w:type="dxa"/>
-              <w:start w:w="120" w:type="dxa"/>
-              <w:bottom w:w="80" w:type="dxa"/>
-              <w:end w:w="120" w:type="dxa"/>
-            </w:tcMar>
-            <w:vAlign w:val="center"/>
-          </w:tcPr>
-          <w:p>
-            <w:r>
-              <w:t>任意</w:t>
-            </w:r>
-          </w:p>
-        </w:tc>
-        <w:tc>
-          <w:tcPr>
-            <w:tcW w:type="dxa" w:w="3168"/>
-            <w:tcMar>
-              <w:top w:w="80" w:type="dxa"/>
-              <w:start w:w="120" w:type="dxa"/>
-              <w:bottom w:w="80" w:type="dxa"/>
-              <w:end w:w="120" w:type="dxa"/>
-            </w:tcMar>
-            <w:vAlign w:val="center"/>
-          </w:tcPr>
-          <w:p>
-            <w:r>
-              <w:t>存在する場合はFのみ採用。</w:t>
-            </w:r>
-          </w:p>
-        </w:tc>
-        <w:tc>
-          <w:tcPr>
-            <w:tcW w:type="dxa" w:w="3311"/>
-            <w:tcMar>
-              <w:top w:w="80" w:type="dxa"/>
-              <w:start w:w="120" w:type="dxa"/>
-              <w:bottom w:w="80" w:type="dxa"/>
-              <w:end w:w="120" w:type="dxa"/>
-            </w:tcMar>
-            <w:vAlign w:val="center"/>
-          </w:tcPr>
-          <w:p>
-            <w:r>
-              <w:t>列が無い場合はフィルタを省略。</w:t>
-            </w:r>
-          </w:p>
-        </w:tc>
-      </w:tr>
-      <w:tr>
-        <w:tc>
-          <w:tcPr>
-            <w:tcW w:type="dxa" w:w="1872"/>
-            <w:tcMar>
-              <w:top w:w="80" w:type="dxa"/>
-              <w:start w:w="120" w:type="dxa"/>
-              <w:bottom w:w="80" w:type="dxa"/>
-              <w:end w:w="120" w:type="dxa"/>
-            </w:tcMar>
-            <w:vAlign w:val="center"/>
-          </w:tcPr>
-          <w:p>
-            <w:r>
-              <w:t>locus</w:t>
-            </w:r>
-          </w:p>
-        </w:tc>
-        <w:tc>
-          <w:tcPr>
-            <w:tcW w:type="dxa" w:w="1007"/>
-            <w:tcMar>
-              <w:top w:w="80" w:type="dxa"/>
-              <w:start w:w="120" w:type="dxa"/>
-              <w:bottom w:w="80" w:type="dxa"/>
-              <w:end w:w="120" w:type="dxa"/>
-            </w:tcMar>
-            <w:vAlign w:val="center"/>
-          </w:tcPr>
-          <w:p>
-            <w:r>
-              <w:t>任意</w:t>
-            </w:r>
-          </w:p>
-        </w:tc>
-        <w:tc>
-          <w:tcPr>
-            <w:tcW w:type="dxa" w:w="3168"/>
-            <w:tcMar>
-              <w:top w:w="80" w:type="dxa"/>
-              <w:start w:w="120" w:type="dxa"/>
-              <w:bottom w:w="80" w:type="dxa"/>
-              <w:end w:w="120" w:type="dxa"/>
-            </w:tcMar>
-            <w:vAlign w:val="center"/>
-          </w:tcPr>
-          <w:p>
-            <w:r>
-              <w:t>IGH判定。</w:t>
-            </w:r>
-          </w:p>
-        </w:tc>
-        <w:tc>
-          <w:tcPr>
-            <w:tcW w:type="dxa" w:w="3311"/>
-            <w:tcMar>
-              <w:top w:w="80" w:type="dxa"/>
-              <w:start w:w="120" w:type="dxa"/>
-              <w:bottom w:w="80" w:type="dxa"/>
-              <w:end w:w="120" w:type="dxa"/>
-            </w:tcMar>
-            <w:vAlign w:val="center"/>
-          </w:tcPr>
-          <w:p>
-            <w:r>
-              <w:t>IGH以外は除外。空欄は保持しQCに記録。</w:t>
-            </w:r>
-          </w:p>
-        </w:tc>
-      </w:tr>
-      <w:tr>
-        <w:tc>
-          <w:tcPr>
-            <w:tcW w:type="dxa" w:w="1872"/>
-            <w:tcMar>
-              <w:top w:w="80" w:type="dxa"/>
-              <w:start w:w="120" w:type="dxa"/>
-              <w:bottom w:w="80" w:type="dxa"/>
-              <w:end w:w="120" w:type="dxa"/>
-            </w:tcMar>
-            <w:vAlign w:val="center"/>
-          </w:tcPr>
-          <w:p>
-            <w:r>
-              <w:t>v_sequence_alignment</w:t>
-            </w:r>
-          </w:p>
-        </w:tc>
-        <w:tc>
-          <w:tcPr>
-            <w:tcW w:type="dxa" w:w="1007"/>
-            <w:tcMar>
-              <w:top w:w="80" w:type="dxa"/>
-              <w:start w:w="120" w:type="dxa"/>
-              <w:bottom w:w="80" w:type="dxa"/>
-              <w:end w:w="120" w:type="dxa"/>
-            </w:tcMar>
-            <w:vAlign w:val="center"/>
-          </w:tcPr>
-          <w:p>
-            <w:r>
-              <w:t>任意</w:t>
-            </w:r>
-          </w:p>
-        </w:tc>
-        <w:tc>
-          <w:tcPr>
-            <w:tcW w:type="dxa" w:w="3168"/>
-            <w:tcMar>
-              <w:top w:w="80" w:type="dxa"/>
-              <w:start w:w="120" w:type="dxa"/>
-              <w:bottom w:w="80" w:type="dxa"/>
-              <w:end w:w="120" w:type="dxa"/>
-            </w:tcMar>
-            <w:vAlign w:val="center"/>
-          </w:tcPr>
-          <w:p>
-            <w:r>
-              <w:t>V alignment長の診断と任意フィルタ。</w:t>
-            </w:r>
-          </w:p>
-        </w:tc>
-        <w:tc>
-          <w:tcPr>
-            <w:tcW w:type="dxa" w:w="3311"/>
-            <w:tcMar>
-              <w:top w:w="80" w:type="dxa"/>
-              <w:start w:w="120" w:type="dxa"/>
-              <w:bottom w:w="80" w:type="dxa"/>
-              <w:end w:w="120" w:type="dxa"/>
-            </w:tcMar>
-            <w:vAlign w:val="center"/>
-          </w:tcPr>
-          <w:p>
-            <w:r>
-              <w:t>無ければv_seq_len_medianは0。</w:t>
-            </w:r>
-          </w:p>
-        </w:tc>
-      </w:tr>
-    </w:tbl>
-    <w:p/>
-    <w:p>
-      <w:pPr>
-        <w:pStyle w:val="Heading1"/>
-      </w:pPr>
-      <w:r>
-        <w:t>3. フィルタリング仕様</w:t>
+        <w:t>5. SHM histogram仕様</w:t>
       </w:r>
     </w:p>
     <w:p>
       <w:pPr>
-        <w:pStyle w:val="ListNumber"/>
-        <w:spacing w:after="80"/>
+        <w:pStyle w:val="ListBullet"/>
       </w:pPr>
       <w:r>
-        <w:t>TSVヘッダを読み、必須カラム productive, junction, junction_aa, v_identity の存在を確認する。</w:t>
+        <w:t>非重み付きSHM histogramは、採用AIRR行を1行1カウントとして作成する。</w:t>
       </w:r>
     </w:p>
     <w:p>
       <w:pPr>
-        <w:pStyle w:val="ListNumber"/>
-        <w:spacing w:after="80"/>
+        <w:pStyle w:val="ListBullet"/>
       </w:pPr>
       <w:r>
-        <w:t>locus列があり値がIGH以外の行は除外する。locus空欄は保持し、kept_empty_locusとしてQC summaryへ記録する。</w:t>
+        <w:t>重み付きSHM histogramは、plot_weightを重みとして作成する。duplicate_count列を使わない通常設定では非重み付きと同じになる。</w:t>
       </w:r>
     </w:p>
     <w:p>
       <w:pPr>
-        <w:pStyle w:val="ListNumber"/>
-        <w:spacing w:after="80"/>
+        <w:pStyle w:val="ListBullet"/>
       </w:pPr>
       <w:r>
-        <w:t>productiveがT相当でない行を除外する。T, TRUE, 1, Y, YESを真として扱う。</w:t>
-      </w:r>
-    </w:p>
-    <w:p>
-      <w:pPr>
-        <w:pStyle w:val="ListNumber"/>
-        <w:spacing w:after="80"/>
-      </w:pPr>
-      <w:r>
-        <w:t>vj_in_frame列が存在する場合、T相当でない行を除外する。</w:t>
-      </w:r>
-    </w:p>
-    <w:p>
-      <w:pPr>
-        <w:pStyle w:val="ListNumber"/>
-        <w:spacing w:after="80"/>
-      </w:pPr>
-      <w:r>
-        <w:t>stop_codon列が存在する場合、T相当の行を除外する。</w:t>
-      </w:r>
-    </w:p>
-    <w:p>
-      <w:pPr>
-        <w:pStyle w:val="ListNumber"/>
-        <w:spacing w:after="80"/>
-      </w:pPr>
-      <w:r>
-        <w:t>junctionが空欄、またはA/C/G/T以外を含む行を除外する。</w:t>
-      </w:r>
-    </w:p>
-    <w:p>
-      <w:pPr>
-        <w:pStyle w:val="ListNumber"/>
-        <w:spacing w:after="80"/>
-      </w:pPr>
-      <w:r>
-        <w:t>junction_aaが空欄、*、X、非英字を含む行を除外する。</w:t>
-      </w:r>
-    </w:p>
-    <w:p>
-      <w:pPr>
-        <w:pStyle w:val="ListNumber"/>
-        <w:spacing w:after="80"/>
-      </w:pPr>
-      <w:r>
-        <w:t>v_identityが空欄または数値化不能の行を除外する。</w:t>
-      </w:r>
-    </w:p>
-    <w:p>
-      <w:pPr>
-        <w:pStyle w:val="ListNumber"/>
-        <w:spacing w:after="80"/>
-      </w:pPr>
-      <w:r>
-        <w:t>Min V alignment lengthが0より大きい場合、V alignment長が閾値未満の行を除外する。</w:t>
+        <w:t>binは0-2%, 2-4%, ..., 18-20%, 20%以上とする。</w:t>
       </w:r>
     </w:p>
     <w:p>
@@ -1043,741 +687,41 @@
         <w:pStyle w:val="Heading1"/>
       </w:pPr>
       <w:r>
-        <w:t>4. SHM計算仕様</w:t>
-      </w:r>
-    </w:p>
-    <w:p>
-      <w:r>
-        <w:t>v_identityはIgBLAST/AIRR実装や出力条件により0-100の百分率または0-1の小数で出る可能性があるため、値域で自動判定する。現行実装では、v_identity &lt;= 1.2を小数スケール、それ以外を百分率スケールとして扱う。算出後のSHMが負になる場合は0に丸める。</w:t>
-      </w:r>
-    </w:p>
-    <w:tbl>
-      <w:tblPr>
-        <w:tblStyle w:val="TableGrid"/>
-        <w:tblW w:type="auto" w:w="0"/>
-        <w:jc w:val="left"/>
-        <w:tblLayout w:type="fixed"/>
-        <w:tblLook w:firstColumn="1" w:firstRow="1" w:lastColumn="0" w:lastRow="0" w:noHBand="0" w:noVBand="1" w:val="04A0"/>
-      </w:tblPr>
-      <w:tblGrid>
-        <w:gridCol w:w="3120"/>
-        <w:gridCol w:w="3120"/>
-        <w:gridCol w:w="3120"/>
-      </w:tblGrid>
-      <w:tr>
-        <w:tc>
-          <w:tcPr>
-            <w:tcW w:type="dxa" w:w="2592"/>
-            <w:shd w:fill="E8EEF5"/>
-            <w:tcMar>
-              <w:top w:w="80" w:type="dxa"/>
-              <w:start w:w="120" w:type="dxa"/>
-              <w:bottom w:w="80" w:type="dxa"/>
-              <w:end w:w="120" w:type="dxa"/>
-            </w:tcMar>
-            <w:vAlign w:val="center"/>
-          </w:tcPr>
-          <w:p>
-            <w:r>
-              <w:rPr>
-                <w:b/>
-              </w:rPr>
-              <w:t>v_identityの値域</w:t>
-            </w:r>
-          </w:p>
-        </w:tc>
-        <w:tc>
-          <w:tcPr>
-            <w:tcW w:type="dxa" w:w="3744"/>
-            <w:shd w:fill="E8EEF5"/>
-            <w:tcMar>
-              <w:top w:w="80" w:type="dxa"/>
-              <w:start w:w="120" w:type="dxa"/>
-              <w:bottom w:w="80" w:type="dxa"/>
-              <w:end w:w="120" w:type="dxa"/>
-            </w:tcMar>
-            <w:vAlign w:val="center"/>
-          </w:tcPr>
-          <w:p>
-            <w:r>
-              <w:rPr>
-                <w:b/>
-              </w:rPr>
-              <w:t>計算式</w:t>
-            </w:r>
-          </w:p>
-        </w:tc>
-        <w:tc>
-          <w:tcPr>
-            <w:tcW w:type="dxa" w:w="3024"/>
-            <w:shd w:fill="E8EEF5"/>
-            <w:tcMar>
-              <w:top w:w="80" w:type="dxa"/>
-              <w:start w:w="120" w:type="dxa"/>
-              <w:bottom w:w="80" w:type="dxa"/>
-              <w:end w:w="120" w:type="dxa"/>
-            </w:tcMar>
-            <w:vAlign w:val="center"/>
-          </w:tcPr>
-          <w:p>
-            <w:r>
-              <w:rPr>
-                <w:b/>
-              </w:rPr>
-              <w:t>例</w:t>
-            </w:r>
-          </w:p>
-        </w:tc>
-      </w:tr>
-      <w:tr>
-        <w:tc>
-          <w:tcPr>
-            <w:tcW w:type="dxa" w:w="2592"/>
-            <w:tcMar>
-              <w:top w:w="80" w:type="dxa"/>
-              <w:start w:w="120" w:type="dxa"/>
-              <w:bottom w:w="80" w:type="dxa"/>
-              <w:end w:w="120" w:type="dxa"/>
-            </w:tcMar>
-            <w:vAlign w:val="center"/>
-          </w:tcPr>
-          <w:p>
-            <w:r>
-              <w:t>0-100スケール</w:t>
-            </w:r>
-          </w:p>
-        </w:tc>
-        <w:tc>
-          <w:tcPr>
-            <w:tcW w:type="dxa" w:w="3744"/>
-            <w:tcMar>
-              <w:top w:w="80" w:type="dxa"/>
-              <w:start w:w="120" w:type="dxa"/>
-              <w:bottom w:w="80" w:type="dxa"/>
-              <w:end w:w="120" w:type="dxa"/>
-            </w:tcMar>
-            <w:vAlign w:val="center"/>
-          </w:tcPr>
-          <w:p>
-            <w:r>
-              <w:t>SHM(%) = 100 - v_identity</w:t>
-            </w:r>
-          </w:p>
-        </w:tc>
-        <w:tc>
-          <w:tcPr>
-            <w:tcW w:type="dxa" w:w="3024"/>
-            <w:tcMar>
-              <w:top w:w="80" w:type="dxa"/>
-              <w:start w:w="120" w:type="dxa"/>
-              <w:bottom w:w="80" w:type="dxa"/>
-              <w:end w:w="120" w:type="dxa"/>
-            </w:tcMar>
-            <w:vAlign w:val="center"/>
-          </w:tcPr>
-          <w:p>
-            <w:r>
-              <w:t>v_identity=92.5 -&gt; SHM=7.5%</w:t>
-            </w:r>
-          </w:p>
-        </w:tc>
-      </w:tr>
-      <w:tr>
-        <w:tc>
-          <w:tcPr>
-            <w:tcW w:type="dxa" w:w="2592"/>
-            <w:tcMar>
-              <w:top w:w="80" w:type="dxa"/>
-              <w:start w:w="120" w:type="dxa"/>
-              <w:bottom w:w="80" w:type="dxa"/>
-              <w:end w:w="120" w:type="dxa"/>
-            </w:tcMar>
-            <w:vAlign w:val="center"/>
-          </w:tcPr>
-          <w:p>
-            <w:r>
-              <w:t>0-1スケール</w:t>
-            </w:r>
-          </w:p>
-        </w:tc>
-        <w:tc>
-          <w:tcPr>
-            <w:tcW w:type="dxa" w:w="3744"/>
-            <w:tcMar>
-              <w:top w:w="80" w:type="dxa"/>
-              <w:start w:w="120" w:type="dxa"/>
-              <w:bottom w:w="80" w:type="dxa"/>
-              <w:end w:w="120" w:type="dxa"/>
-            </w:tcMar>
-            <w:vAlign w:val="center"/>
-          </w:tcPr>
-          <w:p>
-            <w:r>
-              <w:t>SHM(%) = (1 - v_identity) * 100</w:t>
-            </w:r>
-          </w:p>
-        </w:tc>
-        <w:tc>
-          <w:tcPr>
-            <w:tcW w:type="dxa" w:w="3024"/>
-            <w:tcMar>
-              <w:top w:w="80" w:type="dxa"/>
-              <w:start w:w="120" w:type="dxa"/>
-              <w:bottom w:w="80" w:type="dxa"/>
-              <w:end w:w="120" w:type="dxa"/>
-            </w:tcMar>
-            <w:vAlign w:val="center"/>
-          </w:tcPr>
-          <w:p>
-            <w:r>
-              <w:t>v_identity=0.925 -&gt; SHM=7.5%</w:t>
-            </w:r>
-          </w:p>
-        </w:tc>
-      </w:tr>
-    </w:tbl>
-    <w:p/>
-    <w:p>
-      <w:pPr>
-        <w:pStyle w:val="Heading1"/>
-      </w:pPr>
-      <w:r>
-        <w:t>5. 集約仕様</w:t>
-      </w:r>
-    </w:p>
-    <w:p>
-      <w:r>
-        <w:t>フィルタ後のreadをjunction(nt)完全一致でグループ化する。各junctionグループ内のreadごとのSHM値から中央値を計算し、その値をunique junction(nt)点のshm_medianとする。平均ではなく中央値を採用する理由は、同一junction内に少数の外れ値やアラインメント由来のばらつきがある場合でも、代表値を安定させるためである。</w:t>
-      </w:r>
-    </w:p>
-    <w:tbl>
-      <w:tblPr>
-        <w:tblStyle w:val="TableGrid"/>
-        <w:tblW w:type="auto" w:w="0"/>
-        <w:jc w:val="left"/>
-        <w:tblLayout w:type="fixed"/>
-        <w:tblLook w:firstColumn="1" w:firstRow="1" w:lastColumn="0" w:lastRow="0" w:noHBand="0" w:noVBand="1" w:val="04A0"/>
-      </w:tblPr>
-      <w:tblGrid>
-        <w:gridCol w:w="4680"/>
-        <w:gridCol w:w="4680"/>
-      </w:tblGrid>
-      <w:tr>
-        <w:tc>
-          <w:tcPr>
-            <w:tcW w:type="dxa" w:w="2592"/>
-            <w:shd w:fill="E8EEF5"/>
-            <w:tcMar>
-              <w:top w:w="80" w:type="dxa"/>
-              <w:start w:w="120" w:type="dxa"/>
-              <w:bottom w:w="80" w:type="dxa"/>
-              <w:end w:w="120" w:type="dxa"/>
-            </w:tcMar>
-            <w:vAlign w:val="center"/>
-          </w:tcPr>
-          <w:p>
-            <w:r>
-              <w:rPr>
-                <w:b/>
-              </w:rPr>
-              <w:t>出力列/値</w:t>
-            </w:r>
-          </w:p>
-        </w:tc>
-        <w:tc>
-          <w:tcPr>
-            <w:tcW w:type="dxa" w:w="6768"/>
-            <w:shd w:fill="E8EEF5"/>
-            <w:tcMar>
-              <w:top w:w="80" w:type="dxa"/>
-              <w:start w:w="120" w:type="dxa"/>
-              <w:bottom w:w="80" w:type="dxa"/>
-              <w:end w:w="120" w:type="dxa"/>
-            </w:tcMar>
-            <w:vAlign w:val="center"/>
-          </w:tcPr>
-          <w:p>
-            <w:r>
-              <w:rPr>
-                <w:b/>
-              </w:rPr>
-              <w:t>意味</w:t>
-            </w:r>
-          </w:p>
-        </w:tc>
-      </w:tr>
-      <w:tr>
-        <w:tc>
-          <w:tcPr>
-            <w:tcW w:type="dxa" w:w="2592"/>
-            <w:tcMar>
-              <w:top w:w="80" w:type="dxa"/>
-              <w:start w:w="120" w:type="dxa"/>
-              <w:bottom w:w="80" w:type="dxa"/>
-              <w:end w:w="120" w:type="dxa"/>
-            </w:tcMar>
-            <w:vAlign w:val="center"/>
-          </w:tcPr>
-          <w:p>
-            <w:r>
-              <w:t>junction_nt</w:t>
-            </w:r>
-          </w:p>
-        </w:tc>
-        <w:tc>
-          <w:tcPr>
-            <w:tcW w:type="dxa" w:w="6768"/>
-            <w:tcMar>
-              <w:top w:w="80" w:type="dxa"/>
-              <w:start w:w="120" w:type="dxa"/>
-              <w:bottom w:w="80" w:type="dxa"/>
-              <w:end w:w="120" w:type="dxa"/>
-            </w:tcMar>
-            <w:vAlign w:val="center"/>
-          </w:tcPr>
-          <w:p>
-            <w:r>
-              <w:t>グループキー。AIRR TSVのjunction列。</w:t>
-            </w:r>
-          </w:p>
-        </w:tc>
-      </w:tr>
-      <w:tr>
-        <w:tc>
-          <w:tcPr>
-            <w:tcW w:type="dxa" w:w="2592"/>
-            <w:tcMar>
-              <w:top w:w="80" w:type="dxa"/>
-              <w:start w:w="120" w:type="dxa"/>
-              <w:bottom w:w="80" w:type="dxa"/>
-              <w:end w:w="120" w:type="dxa"/>
-            </w:tcMar>
-            <w:vAlign w:val="center"/>
-          </w:tcPr>
-          <w:p>
-            <w:r>
-              <w:t>shm_median</w:t>
-            </w:r>
-          </w:p>
-        </w:tc>
-        <w:tc>
-          <w:tcPr>
-            <w:tcW w:type="dxa" w:w="6768"/>
-            <w:tcMar>
-              <w:top w:w="80" w:type="dxa"/>
-              <w:start w:w="120" w:type="dxa"/>
-              <w:bottom w:w="80" w:type="dxa"/>
-              <w:end w:w="120" w:type="dxa"/>
-            </w:tcMar>
-            <w:vAlign w:val="center"/>
-          </w:tcPr>
-          <w:p>
-            <w:r>
-              <w:t>同じjunction_ntに属するreadのSHM中央値。</w:t>
-            </w:r>
-          </w:p>
-        </w:tc>
-      </w:tr>
-      <w:tr>
-        <w:tc>
-          <w:tcPr>
-            <w:tcW w:type="dxa" w:w="2592"/>
-            <w:tcMar>
-              <w:top w:w="80" w:type="dxa"/>
-              <w:start w:w="120" w:type="dxa"/>
-              <w:bottom w:w="80" w:type="dxa"/>
-              <w:end w:w="120" w:type="dxa"/>
-            </w:tcMar>
-            <w:vAlign w:val="center"/>
-          </w:tcPr>
-          <w:p>
-            <w:r>
-              <w:t>read_count</w:t>
-            </w:r>
-          </w:p>
-        </w:tc>
-        <w:tc>
-          <w:tcPr>
-            <w:tcW w:type="dxa" w:w="6768"/>
-            <w:tcMar>
-              <w:top w:w="80" w:type="dxa"/>
-              <w:start w:w="120" w:type="dxa"/>
-              <w:bottom w:w="80" w:type="dxa"/>
-              <w:end w:w="120" w:type="dxa"/>
-            </w:tcMar>
-            <w:vAlign w:val="center"/>
-          </w:tcPr>
-          <w:p>
-            <w:r>
-              <w:t>同じjunction_ntに属するread数。</w:t>
-            </w:r>
-          </w:p>
-        </w:tc>
-      </w:tr>
-      <w:tr>
-        <w:tc>
-          <w:tcPr>
-            <w:tcW w:type="dxa" w:w="2592"/>
-            <w:tcMar>
-              <w:top w:w="80" w:type="dxa"/>
-              <w:start w:w="120" w:type="dxa"/>
-              <w:bottom w:w="80" w:type="dxa"/>
-              <w:end w:w="120" w:type="dxa"/>
-            </w:tcMar>
-            <w:vAlign w:val="center"/>
-          </w:tcPr>
-          <w:p>
-            <w:r>
-              <w:t>v_seq_len_median</w:t>
-            </w:r>
-          </w:p>
-        </w:tc>
-        <w:tc>
-          <w:tcPr>
-            <w:tcW w:type="dxa" w:w="6768"/>
-            <w:tcMar>
-              <w:top w:w="80" w:type="dxa"/>
-              <w:start w:w="120" w:type="dxa"/>
-              <w:bottom w:w="80" w:type="dxa"/>
-              <w:end w:w="120" w:type="dxa"/>
-            </w:tcMar>
-            <w:vAlign w:val="center"/>
-          </w:tcPr>
-          <w:p>
-            <w:r>
-              <w:t>V alignment長の中央値。V配列が短い点の診断に使う。</w:t>
-            </w:r>
-          </w:p>
-        </w:tc>
-      </w:tr>
-    </w:tbl>
-    <w:p/>
-    <w:p>
-      <w:pPr>
-        <w:pStyle w:val="Heading1"/>
-      </w:pPr>
-      <w:r>
-        <w:t>6. SHM histogram仕様</w:t>
-      </w:r>
-    </w:p>
-    <w:tbl>
-      <w:tblPr>
-        <w:tblStyle w:val="TableGrid"/>
-        <w:tblW w:type="auto" w:w="0"/>
-        <w:jc w:val="left"/>
-        <w:tblLayout w:type="fixed"/>
-        <w:tblLook w:firstColumn="1" w:firstRow="1" w:lastColumn="0" w:lastRow="0" w:noHBand="0" w:noVBand="1" w:val="04A0"/>
-      </w:tblPr>
-      <w:tblGrid>
-        <w:gridCol w:w="4680"/>
-        <w:gridCol w:w="4680"/>
-      </w:tblGrid>
-      <w:tr>
-        <w:tc>
-          <w:tcPr>
-            <w:tcW w:type="dxa" w:w="2448"/>
-            <w:shd w:fill="E8EEF5"/>
-            <w:tcMar>
-              <w:top w:w="80" w:type="dxa"/>
-              <w:start w:w="120" w:type="dxa"/>
-              <w:bottom w:w="80" w:type="dxa"/>
-              <w:end w:w="120" w:type="dxa"/>
-            </w:tcMar>
-            <w:vAlign w:val="center"/>
-          </w:tcPr>
-          <w:p>
-            <w:r>
-              <w:rPr>
-                <w:b/>
-              </w:rPr>
-              <w:t>項目</w:t>
-            </w:r>
-          </w:p>
-        </w:tc>
-        <w:tc>
-          <w:tcPr>
-            <w:tcW w:type="dxa" w:w="6912"/>
-            <w:shd w:fill="E8EEF5"/>
-            <w:tcMar>
-              <w:top w:w="80" w:type="dxa"/>
-              <w:start w:w="120" w:type="dxa"/>
-              <w:bottom w:w="80" w:type="dxa"/>
-              <w:end w:w="120" w:type="dxa"/>
-            </w:tcMar>
-            <w:vAlign w:val="center"/>
-          </w:tcPr>
-          <w:p>
-            <w:r>
-              <w:rPr>
-                <w:b/>
-              </w:rPr>
-              <w:t>仕様</w:t>
-            </w:r>
-          </w:p>
-        </w:tc>
-      </w:tr>
-      <w:tr>
-        <w:tc>
-          <w:tcPr>
-            <w:tcW w:type="dxa" w:w="2448"/>
-            <w:tcMar>
-              <w:top w:w="80" w:type="dxa"/>
-              <w:start w:w="120" w:type="dxa"/>
-              <w:bottom w:w="80" w:type="dxa"/>
-              <w:end w:w="120" w:type="dxa"/>
-            </w:tcMar>
-            <w:vAlign w:val="center"/>
-          </w:tcPr>
-          <w:p>
-            <w:r>
-              <w:t>入力点</w:t>
-            </w:r>
-          </w:p>
-        </w:tc>
-        <w:tc>
-          <w:tcPr>
-            <w:tcW w:type="dxa" w:w="6912"/>
-            <w:tcMar>
-              <w:top w:w="80" w:type="dxa"/>
-              <w:start w:w="120" w:type="dxa"/>
-              <w:bottom w:w="80" w:type="dxa"/>
-              <w:end w:w="120" w:type="dxa"/>
-            </w:tcMar>
-            <w:vAlign w:val="center"/>
-          </w:tcPr>
-          <w:p>
-            <w:r>
-              <w:t>&lt;sample&gt;_pgen_shm_points.tsv相当のunique junction(nt)点。</w:t>
-            </w:r>
-          </w:p>
-        </w:tc>
-      </w:tr>
-      <w:tr>
-        <w:tc>
-          <w:tcPr>
-            <w:tcW w:type="dxa" w:w="2448"/>
-            <w:tcMar>
-              <w:top w:w="80" w:type="dxa"/>
-              <w:start w:w="120" w:type="dxa"/>
-              <w:bottom w:w="80" w:type="dxa"/>
-              <w:end w:w="120" w:type="dxa"/>
-            </w:tcMar>
-            <w:vAlign w:val="center"/>
-          </w:tcPr>
-          <w:p>
-            <w:r>
-              <w:t>bin幅</w:t>
-            </w:r>
-          </w:p>
-        </w:tc>
-        <w:tc>
-          <w:tcPr>
-            <w:tcW w:type="dxa" w:w="6912"/>
-            <w:tcMar>
-              <w:top w:w="80" w:type="dxa"/>
-              <w:start w:w="120" w:type="dxa"/>
-              <w:bottom w:w="80" w:type="dxa"/>
-              <w:end w:w="120" w:type="dxa"/>
-            </w:tcMar>
-            <w:vAlign w:val="center"/>
-          </w:tcPr>
-          <w:p>
-            <w:r>
-              <w:t>2%刻み。0~2%, 2~4%, ..., 18~20%, 20~%。</w:t>
-            </w:r>
-          </w:p>
-        </w:tc>
-      </w:tr>
-      <w:tr>
-        <w:tc>
-          <w:tcPr>
-            <w:tcW w:type="dxa" w:w="2448"/>
-            <w:tcMar>
-              <w:top w:w="80" w:type="dxa"/>
-              <w:start w:w="120" w:type="dxa"/>
-              <w:bottom w:w="80" w:type="dxa"/>
-              <w:end w:w="120" w:type="dxa"/>
-            </w:tcMar>
-            <w:vAlign w:val="center"/>
-          </w:tcPr>
-          <w:p>
-            <w:r>
-              <w:t>count</w:t>
-            </w:r>
-          </w:p>
-        </w:tc>
-        <w:tc>
-          <w:tcPr>
-            <w:tcW w:type="dxa" w:w="6912"/>
-            <w:tcMar>
-              <w:top w:w="80" w:type="dxa"/>
-              <w:start w:w="120" w:type="dxa"/>
-              <w:bottom w:w="80" w:type="dxa"/>
-              <w:end w:w="120" w:type="dxa"/>
-            </w:tcMar>
-            <w:vAlign w:val="center"/>
-          </w:tcPr>
-          <w:p>
-            <w:r>
-              <w:t>各binに入るunique junction(nt)点数。read数ではない。</w:t>
-            </w:r>
-          </w:p>
-        </w:tc>
-      </w:tr>
-      <w:tr>
-        <w:tc>
-          <w:tcPr>
-            <w:tcW w:type="dxa" w:w="2448"/>
-            <w:tcMar>
-              <w:top w:w="80" w:type="dxa"/>
-              <w:start w:w="120" w:type="dxa"/>
-              <w:bottom w:w="80" w:type="dxa"/>
-              <w:end w:w="120" w:type="dxa"/>
-            </w:tcMar>
-            <w:vAlign w:val="center"/>
-          </w:tcPr>
-          <w:p>
-            <w:r>
-              <w:t>fraction</w:t>
-            </w:r>
-          </w:p>
-        </w:tc>
-        <w:tc>
-          <w:tcPr>
-            <w:tcW w:type="dxa" w:w="6912"/>
-            <w:tcMar>
-              <w:top w:w="80" w:type="dxa"/>
-              <w:start w:w="120" w:type="dxa"/>
-              <w:bottom w:w="80" w:type="dxa"/>
-              <w:end w:w="120" w:type="dxa"/>
-            </w:tcMar>
-            <w:vAlign w:val="center"/>
-          </w:tcPr>
-          <w:p>
-            <w:r>
-              <w:t>count / 全unique junction(nt)点数。</w:t>
-            </w:r>
-          </w:p>
-        </w:tc>
-      </w:tr>
-      <w:tr>
-        <w:tc>
-          <w:tcPr>
-            <w:tcW w:type="dxa" w:w="2448"/>
-            <w:tcMar>
-              <w:top w:w="80" w:type="dxa"/>
-              <w:start w:w="120" w:type="dxa"/>
-              <w:bottom w:w="80" w:type="dxa"/>
-              <w:end w:w="120" w:type="dxa"/>
-            </w:tcMar>
-            <w:vAlign w:val="center"/>
-          </w:tcPr>
-          <w:p>
-            <w:r>
-              <w:t>図</w:t>
-            </w:r>
-          </w:p>
-        </w:tc>
-        <w:tc>
-          <w:tcPr>
-            <w:tcW w:type="dxa" w:w="6912"/>
-            <w:tcMar>
-              <w:top w:w="80" w:type="dxa"/>
-              <w:start w:w="120" w:type="dxa"/>
-              <w:bottom w:w="80" w:type="dxa"/>
-              <w:end w:w="120" w:type="dxa"/>
-            </w:tcMar>
-            <w:vAlign w:val="center"/>
-          </w:tcPr>
-          <w:p>
-            <w:r>
-              <w:t>横棒グラフ。x軸Frequency、y軸%Mutation。</w:t>
-            </w:r>
-          </w:p>
-        </w:tc>
-      </w:tr>
-    </w:tbl>
-    <w:p/>
-    <w:p>
-      <w:pPr>
-        <w:pStyle w:val="Heading1"/>
-      </w:pPr>
-      <w:r>
-        <w:t>7. QCと解釈上の注意</w:t>
+        <w:t>6. QCと注意点</w:t>
       </w:r>
     </w:p>
     <w:p>
       <w:pPr>
         <w:pStyle w:val="ListBullet"/>
-        <w:spacing w:after="80"/>
       </w:pPr>
       <w:r>
-        <w:t>SHMはv_identity由来であり、V alignmentが短いreadでは不安定になる可能性がある。</w:t>
+        <w:t>SHMはv_identity由来であり、V alignmentが短いreadでは不安定になり得る。</w:t>
       </w:r>
     </w:p>
     <w:p>
       <w:pPr>
         <w:pStyle w:val="ListBullet"/>
-        <w:spacing w:after="80"/>
       </w:pPr>
       <w:r>
-        <w:t>初期設定ではV alignment長による除外は行わない。v_seq_len_medianを確認して必要時のみ閾値を設定する。</w:t>
+        <w:t>初期設定ではV alignment長による除外は行わず、必要時のみMin V alignment lengthを設定する。</w:t>
       </w:r>
     </w:p>
     <w:p>
       <w:pPr>
         <w:pStyle w:val="ListBullet"/>
-        <w:spacing w:after="80"/>
       </w:pPr>
       <w:r>
-        <w:t>SHM histogramはread-weightedではなくunique junction(nt)単位の分布である。</w:t>
-      </w:r>
-    </w:p>
-    <w:p>
-      <w:pPr>
-        <w:pStyle w:val="ListBullet"/>
-        <w:spacing w:after="80"/>
-      </w:pPr>
-      <w:r>
-        <w:t>SHM=0付近の点が多い場合は、v_seq_len_median、read_count、V/J遺伝子使用、入力TSVのlocusを確認する。</w:t>
-      </w:r>
-    </w:p>
-    <w:p>
-      <w:pPr>
-        <w:pStyle w:val="ListBullet"/>
-        <w:spacing w:after="80"/>
-      </w:pPr>
-      <w:r>
-        <w:t>counts TSVやExcel集計は入力対象ではない。必ずIgBLAST AIRR outfmt19 TSVを用いる。</w:t>
+        <w:t>counts TSVやExcel集計表は入力対象ではない。必ずIgBLAST AIRR outfmt 19 TSVを用いる。</w:t>
       </w:r>
     </w:p>
     <w:sectPr>
-      <w:footerReference w:type="default" r:id="rId9"/>
       <w:pgSz w:w="12240" w:h="15840"/>
-      <w:pgMar w:top="1440" w:right="1440" w:bottom="1440" w:left="1440" w:header="708" w:footer="708" w:gutter="0"/>
+      <w:pgMar w:top="1440" w:right="1800" w:bottom="1440" w:left="1800" w:header="720" w:footer="720" w:gutter="0"/>
       <w:cols w:space="720"/>
       <w:docGrid w:linePitch="360"/>
     </w:sectPr>
   </w:body>
 </w:document>
-</file>
-
-<file path=word/footer1.xml><?xml version="1.0" encoding="utf-8"?>
-<w:ftr xmlns:m="http://schemas.openxmlformats.org/officeDocument/2006/math" xmlns:mc="http://schemas.openxmlformats.org/markup-compatibility/2006" xmlns:mo="http://schemas.microsoft.com/office/mac/office/2008/main" xmlns:mv="urn:schemas-microsoft-com:mac:vml" xmlns:o="urn:schemas-microsoft-com:office:office" xmlns:r="http://schemas.openxmlformats.org/officeDocument/2006/relationships" xmlns:v="urn:schemas-microsoft-com:vml" xmlns:w10="urn:schemas-microsoft-com:office:word" xmlns:w14="http://schemas.microsoft.com/office/word/2010/wordml" xmlns:w="http://schemas.openxmlformats.org/wordprocessingml/2006/main" xmlns:wne="http://schemas.microsoft.com/office/word/2006/wordml" xmlns:wp14="http://schemas.microsoft.com/office/word/2010/wordprocessingDrawing" xmlns:wp="http://schemas.openxmlformats.org/drawingml/2006/wordprocessingDrawing" xmlns:wpc="http://schemas.microsoft.com/office/word/2010/wordprocessingCanvas" xmlns:wpg="http://schemas.microsoft.com/office/word/2010/wordprocessingGroup" xmlns:wpi="http://schemas.microsoft.com/office/word/2010/wordprocessingInk" xmlns:wps="http://schemas.microsoft.com/office/word/2010/wordprocessingShape" mc:Ignorable="w14 wp14">
-  <w:p>
-    <w:pPr>
-      <w:pStyle w:val="Footer"/>
-      <w:jc w:val="right"/>
-    </w:pPr>
-    <w:r>
-      <w:rPr>
-        <w:color w:val="666666"/>
-        <w:sz w:val="16"/>
-      </w:rPr>
-      <w:t>RG AIRR TSV pGen-SHM plot specifications | 2026-06-07</w:t>
-    </w:r>
-  </w:p>
-</w:ftr>
 </file>
 
 <file path=word/numbering.xml><?xml version="1.0" encoding="utf-8"?>
@@ -2143,12 +1087,9 @@
     <w:name w:val="Normal"/>
     <w:qFormat/>
     <w:rsid w:val="00FC693F"/>
-    <w:pPr>
-      <w:spacing w:after="120" w:line="300" w:lineRule="auto"/>
-    </w:pPr>
     <w:rPr>
-      <w:rFonts w:ascii="Calibri" w:hAnsi="Calibri" w:eastAsia="Yu Gothic"/>
-      <w:sz w:val="22"/>
+      <w:rFonts w:ascii="Yu Gothic" w:hAnsi="Yu Gothic"/>
+      <w:sz w:val="21"/>
     </w:rPr>
   </w:style>
   <w:style w:type="paragraph" w:styleId="Header">
@@ -2206,15 +1147,15 @@
     <w:pPr>
       <w:keepNext/>
       <w:keepLines/>
-      <w:spacing w:before="360" w:after="200"/>
+      <w:spacing w:before="480" w:after="0"/>
       <w:outlineLvl w:val="0"/>
     </w:pPr>
     <w:rPr>
-      <w:rFonts w:asciiTheme="majorHAnsi" w:eastAsiaTheme="majorEastAsia" w:hAnsiTheme="majorHAnsi" w:cstheme="majorBidi" w:ascii="Calibri" w:hAnsi="Calibri" w:eastAsia="Yu Gothic"/>
+      <w:rFonts w:asciiTheme="majorHAnsi" w:eastAsiaTheme="majorEastAsia" w:hAnsiTheme="majorHAnsi" w:cstheme="majorBidi" w:ascii="Yu Gothic" w:hAnsi="Yu Gothic"/>
       <w:b/>
       <w:bCs/>
-      <w:color w:val="2E74B5"/>
-      <w:sz w:val="32"/>
+      <w:color w:val="365F91" w:themeColor="accent1" w:themeShade="BF"/>
+      <w:sz w:val="28"/>
       <w:szCs w:val="28"/>
     </w:rPr>
   </w:style>
@@ -2230,14 +1171,14 @@
     <w:pPr>
       <w:keepNext/>
       <w:keepLines/>
-      <w:spacing w:before="280" w:after="140"/>
+      <w:spacing w:before="200" w:after="0"/>
       <w:outlineLvl w:val="1"/>
     </w:pPr>
     <w:rPr>
-      <w:rFonts w:asciiTheme="majorHAnsi" w:eastAsiaTheme="majorEastAsia" w:hAnsiTheme="majorHAnsi" w:cstheme="majorBidi" w:ascii="Calibri" w:hAnsi="Calibri" w:eastAsia="Yu Gothic"/>
+      <w:rFonts w:asciiTheme="majorHAnsi" w:eastAsiaTheme="majorEastAsia" w:hAnsiTheme="majorHAnsi" w:cstheme="majorBidi" w:ascii="Yu Gothic" w:hAnsi="Yu Gothic"/>
       <w:b/>
       <w:bCs/>
-      <w:color w:val="2E74B5"/>
+      <w:color w:val="4F81BD" w:themeColor="accent1"/>
       <w:sz w:val="26"/>
       <w:szCs w:val="26"/>
     </w:rPr>
@@ -2254,15 +1195,14 @@
     <w:pPr>
       <w:keepNext/>
       <w:keepLines/>
-      <w:spacing w:before="200" w:after="100"/>
+      <w:spacing w:before="200" w:after="0"/>
       <w:outlineLvl w:val="2"/>
     </w:pPr>
     <w:rPr>
-      <w:rFonts w:asciiTheme="majorHAnsi" w:eastAsiaTheme="majorEastAsia" w:hAnsiTheme="majorHAnsi" w:cstheme="majorBidi" w:ascii="Calibri" w:hAnsi="Calibri" w:eastAsia="Yu Gothic"/>
+      <w:rFonts w:asciiTheme="majorHAnsi" w:eastAsiaTheme="majorEastAsia" w:hAnsiTheme="majorHAnsi" w:cstheme="majorBidi" w:ascii="Yu Gothic" w:hAnsi="Yu Gothic"/>
       <w:b/>
       <w:bCs/>
-      <w:color w:val="1F4D78"/>
-      <w:sz w:val="24"/>
+      <w:color w:val="4F81BD" w:themeColor="accent1"/>
     </w:rPr>
   </w:style>
   <w:style w:type="paragraph" w:styleId="Heading4">

</xml_diff>

<commit_message>
Update handoff specifications for pGen-SHM workflow
</commit_message>
<xml_diff>
--- a/TSVからSHMデータ作成仕様書_20260607.docx
+++ b/TSVからSHMデータ作成仕様書_20260607.docx
@@ -4,646 +4,68 @@
   <w:body>
     <w:p>
       <w:pPr>
-        <w:jc w:val="center"/>
+        <w:spacing w:after="80"/>
       </w:pPr>
       <w:r>
         <w:rPr>
-          <w:rFonts w:ascii="Yu Gothic" w:hAnsi="Yu Gothic"/>
+          <w:rFonts w:ascii="Calibri" w:hAnsi="Calibri"/>
           <w:b/>
-          <w:sz w:val="36"/>
+          <w:color w:val="0B2545"/>
+          <w:sz w:val="40"/>
         </w:rPr>
         <w:t>TSVからSHMデータ作成仕様書</w:t>
       </w:r>
     </w:p>
     <w:p>
       <w:pPr>
-        <w:jc w:val="center"/>
+        <w:spacing w:after="240"/>
       </w:pPr>
       <w:r>
         <w:rPr>
-          <w:rFonts w:ascii="Yu Gothic" w:hAnsi="Yu Gothic"/>
+          <w:rFonts w:ascii="Calibri" w:hAnsi="Calibri"/>
+          <w:color w:val="555555"/>
           <w:sz w:val="20"/>
         </w:rPr>
-        <w:t>対象: IgBLAST AIRR outfmt 19 TSV -&gt; row-level SHM data / SHM histogram</w:t>
-      </w:r>
-    </w:p>
-    <w:p>
-      <w:pPr>
-        <w:pStyle w:val="Heading1"/>
-      </w:pPr>
-      <w:r>
-        <w:t>1. 目的</w:t>
-      </w:r>
-    </w:p>
-    <w:p>
-      <w:r>
-        <w:t>本仕様書は、IgBLAST outfmt 19のAIRR TSVからSHMデータを作成する処理を定義する。現行仕様では、フィルタ後のAIRR各行、すなわちsequence_idごとに1つのSHM値を計算し、pGen-SHM plotの縦軸およびSHM分布図の入力として用いる。</w:t>
-      </w:r>
-    </w:p>
-    <w:p>
-      <w:pPr>
-        <w:pStyle w:val="Heading1"/>
-      </w:pPr>
-      <w:r>
-        <w:t>2. フィルタリング仕様</w:t>
-      </w:r>
-    </w:p>
-    <w:p>
-      <w:pPr>
-        <w:pStyle w:val="ListBullet"/>
-      </w:pPr>
-      <w:r>
-        <w:t>入力は IgBLAST AIRR outfmt 19 TSV とする。FASTAは本ソフトでは直接読まず、前段でAIRR TSVへ変換済みであることを前提とする。</w:t>
-      </w:r>
-    </w:p>
-    <w:p>
-      <w:pPr>
-        <w:pStyle w:val="ListBullet"/>
-      </w:pPr>
-      <w:r>
-        <w:t>必須列 productive, junction, junction_aa, v_identity の存在を確認する。sequence_id は出力列として使用し、欠損時は row_&lt;入力行番号&gt; で補完してQCに記録する。</w:t>
-      </w:r>
-    </w:p>
-    <w:p>
-      <w:pPr>
-        <w:pStyle w:val="ListBullet"/>
-      </w:pPr>
-      <w:r>
-        <w:t>locus列があり値がIGH以外の行は除外する。locus空欄は保持し、kept_empty_locusとしてQC summaryへ記録する。</w:t>
-      </w:r>
-    </w:p>
-    <w:p>
-      <w:pPr>
-        <w:pStyle w:val="ListBullet"/>
-      </w:pPr>
-      <w:r>
-        <w:t>productive が T, TRUE, 1, Y, YES のいずれにも該当しない行は除外する。</w:t>
-      </w:r>
-    </w:p>
-    <w:p>
-      <w:pPr>
-        <w:pStyle w:val="ListBullet"/>
-      </w:pPr>
-      <w:r>
-        <w:t>vj_in_frame列が存在する場合、T相当でない行を除外する。</w:t>
-      </w:r>
-    </w:p>
-    <w:p>
-      <w:pPr>
-        <w:pStyle w:val="ListBullet"/>
-      </w:pPr>
-      <w:r>
-        <w:t>stop_codon列が存在する場合、T相当の行を除外する。</w:t>
-      </w:r>
-    </w:p>
-    <w:p>
-      <w:pPr>
-        <w:pStyle w:val="ListBullet"/>
-      </w:pPr>
-      <w:r>
-        <w:t>junction が空欄、または A/C/G/T 以外を含む行を除外する。</w:t>
-      </w:r>
-    </w:p>
-    <w:p>
-      <w:pPr>
-        <w:pStyle w:val="ListBullet"/>
-      </w:pPr>
-      <w:r>
-        <w:t>junction_aa が空欄、*、X、非英字を含む行を除外する。</w:t>
-      </w:r>
-    </w:p>
-    <w:p>
-      <w:pPr>
-        <w:pStyle w:val="ListBullet"/>
-      </w:pPr>
-      <w:r>
-        <w:t>v_identity が空欄または数値化不能の行を除外する。</w:t>
-      </w:r>
-    </w:p>
-    <w:p>
-      <w:pPr>
-        <w:pStyle w:val="ListBullet"/>
-      </w:pPr>
-      <w:r>
-        <w:t>Min V alignment length が0より大きい場合、V alignment長が閾値未満の行を除外する。</w:t>
-      </w:r>
-    </w:p>
-    <w:p>
-      <w:pPr>
-        <w:pStyle w:val="Heading1"/>
-      </w:pPr>
-      <w:r>
-        <w:t>3. SHM計算仕様</w:t>
-      </w:r>
-    </w:p>
-    <w:p>
-      <w:pPr>
-        <w:pStyle w:val="ListBullet"/>
-      </w:pPr>
-      <w:r>
-        <w:t>SHMは各採用行の v_identity から計算する。</w:t>
-      </w:r>
-    </w:p>
-    <w:p>
-      <w:pPr>
-        <w:pStyle w:val="ListBullet"/>
-      </w:pPr>
-      <w:r>
-        <w:t>v_identity &lt;= 1.2 の場合は0-1スケールとみなし、SHM = (1 - v_identity) * 100 とする。</w:t>
-      </w:r>
-    </w:p>
-    <w:p>
-      <w:pPr>
-        <w:pStyle w:val="ListBullet"/>
-      </w:pPr>
-      <w:r>
-        <w:t>v_identity &gt; 1.2 の場合は0-100スケールとみなし、SHM = 100 - v_identity とする。</w:t>
-      </w:r>
-    </w:p>
-    <w:p>
-      <w:pPr>
-        <w:pStyle w:val="ListBullet"/>
-      </w:pPr>
-      <w:r>
-        <w:t>計算結果が負になる場合は0に丸める。</w:t>
-      </w:r>
-    </w:p>
-    <w:p>
-      <w:pPr>
-        <w:pStyle w:val="ListBullet"/>
-      </w:pPr>
-      <w:r>
-        <w:t>IgBLAST出力例では v_identity は小数3桁であり、SHMも実質的に小数3桁相当の分解能を持つ。</w:t>
-      </w:r>
-    </w:p>
-    <w:p>
-      <w:pPr>
-        <w:pStyle w:val="Heading1"/>
-      </w:pPr>
-      <w:r>
-        <w:t>4. 中間Excel出力</w:t>
-      </w:r>
-    </w:p>
-    <w:p>
-      <w:r>
-        <w:t>採用されたAIRR各行のみを、row-level中間Excelとして出力する。フィルタで除外された行はExcelに含めない。</w:t>
+        <w:t>対象: IgBLAST AIRR outfmt 19 TSV / 更新日: 2026-06-08 / 目的: SHM計算と分布確認の引継ぎ</w:t>
       </w:r>
     </w:p>
     <w:tbl>
       <w:tblPr>
         <w:tblStyle w:val="TableGrid"/>
-        <w:tblW w:type="auto" w:w="0"/>
+        <w:tblW w:type="dxa" w:w="9360"/>
+        <w:tblLayout w:type="fixed"/>
         <w:tblLook w:firstColumn="1" w:firstRow="1" w:lastColumn="0" w:lastRow="0" w:noHBand="0" w:noVBand="1" w:val="04A0"/>
+        <w:tblInd w:w="120" w:type="dxa"/>
+        <w:tblCellMar>
+          <w:top w:w="80" w:type="dxa"/>
+          <w:start w:w="120" w:type="dxa"/>
+          <w:bottom w:w="80" w:type="dxa"/>
+          <w:end w:w="120" w:type="dxa"/>
+        </w:tblCellMar>
       </w:tblPr>
       <w:tblGrid>
-        <w:gridCol w:w="2880"/>
-        <w:gridCol w:w="2880"/>
-        <w:gridCol w:w="2880"/>
+        <w:gridCol w:w="9360"/>
       </w:tblGrid>
       <w:tr>
         <w:tc>
           <w:tcPr>
-            <w:tcW w:type="dxa" w:w="2880"/>
+            <w:tcW w:type="dxa" w:w="9360"/>
+            <w:vAlign w:val="center"/>
+            <w:shd w:fill="F4F6F9"/>
           </w:tcPr>
           <w:p>
+            <w:pPr>
+              <w:spacing w:after="60"/>
+            </w:pPr>
             <w:r>
-              <w:t>列名</w:t>
+              <w:rPr>
+                <w:b/>
+                <w:color w:val="1F4D78"/>
+              </w:rPr>
+              <w:t>引継ぎ上の要点</w:t>
             </w:r>
-          </w:p>
-        </w:tc>
-        <w:tc>
-          <w:tcPr>
-            <w:tcW w:type="dxa" w:w="2880"/>
-          </w:tcPr>
-          <w:p>
             <w:r>
-              <w:t>区分</w:t>
-            </w:r>
-          </w:p>
-        </w:tc>
-        <w:tc>
-          <w:tcPr>
-            <w:tcW w:type="dxa" w:w="2880"/>
-          </w:tcPr>
-          <w:p>
-            <w:r>
-              <w:t>説明</w:t>
-            </w:r>
-          </w:p>
-        </w:tc>
-      </w:tr>
-      <w:tr>
-        <w:tc>
-          <w:tcPr>
-            <w:tcW w:type="dxa" w:w="2880"/>
-          </w:tcPr>
-          <w:p>
-            <w:r>
-              <w:t>sequence_id</w:t>
-            </w:r>
-          </w:p>
-        </w:tc>
-        <w:tc>
-          <w:tcPr>
-            <w:tcW w:type="dxa" w:w="2880"/>
-          </w:tcPr>
-          <w:p>
-            <w:r>
-              <w:t>必要データ</w:t>
-            </w:r>
-          </w:p>
-        </w:tc>
-        <w:tc>
-          <w:tcPr>
-            <w:tcW w:type="dxa" w:w="2880"/>
-          </w:tcPr>
-          <w:p>
-            <w:r>
-              <w:t>AIRR TSVのsequence_id。欠損時は row_&lt;入力行番号&gt; で補完する。</w:t>
-            </w:r>
-          </w:p>
-        </w:tc>
-      </w:tr>
-      <w:tr>
-        <w:tc>
-          <w:tcPr>
-            <w:tcW w:type="dxa" w:w="2880"/>
-          </w:tcPr>
-          <w:p>
-            <w:r>
-              <w:t>junction_aa</w:t>
-            </w:r>
-          </w:p>
-        </w:tc>
-        <w:tc>
-          <w:tcPr>
-            <w:tcW w:type="dxa" w:w="2880"/>
-          </w:tcPr>
-          <w:p>
-            <w:r>
-              <w:t>必要データ</w:t>
-            </w:r>
-          </w:p>
-        </w:tc>
-        <w:tc>
-          <w:tcPr>
-            <w:tcW w:type="dxa" w:w="2880"/>
-          </w:tcPr>
-          <w:p>
-            <w:r>
-              <w:t>pGen計算に使用するCDR3アミノ酸配列。</w:t>
-            </w:r>
-          </w:p>
-        </w:tc>
-      </w:tr>
-      <w:tr>
-        <w:tc>
-          <w:tcPr>
-            <w:tcW w:type="dxa" w:w="2880"/>
-          </w:tcPr>
-          <w:p>
-            <w:r>
-              <w:t>shm</w:t>
-            </w:r>
-          </w:p>
-        </w:tc>
-        <w:tc>
-          <w:tcPr>
-            <w:tcW w:type="dxa" w:w="2880"/>
-          </w:tcPr>
-          <w:p>
-            <w:r>
-              <w:t>必要データ</w:t>
-            </w:r>
-          </w:p>
-        </w:tc>
-        <w:tc>
-          <w:tcPr>
-            <w:tcW w:type="dxa" w:w="2880"/>
-          </w:tcPr>
-          <w:p>
-            <w:r>
-              <w:t>その行のv_identityから計算したSHM値。</w:t>
-            </w:r>
-          </w:p>
-        </w:tc>
-      </w:tr>
-      <w:tr>
-        <w:tc>
-          <w:tcPr>
-            <w:tcW w:type="dxa" w:w="2880"/>
-          </w:tcPr>
-          <w:p>
-            <w:r>
-              <w:t>pgen</w:t>
-            </w:r>
-          </w:p>
-        </w:tc>
-        <w:tc>
-          <w:tcPr>
-            <w:tcW w:type="dxa" w:w="2880"/>
-          </w:tcPr>
-          <w:p>
-            <w:r>
-              <w:t>必要データ</w:t>
-            </w:r>
-          </w:p>
-        </w:tc>
-        <w:tc>
-          <w:tcPr>
-            <w:tcW w:type="dxa" w:w="2880"/>
-          </w:tcPr>
-          <w:p>
-            <w:r>
-              <w:t>その行のjunction_aaに対応するpGen値。SHM仕様書では参照列。</w:t>
-            </w:r>
-          </w:p>
-        </w:tc>
-      </w:tr>
-      <w:tr>
-        <w:tc>
-          <w:tcPr>
-            <w:tcW w:type="dxa" w:w="2880"/>
-          </w:tcPr>
-          <w:p>
-            <w:r>
-              <w:t>log10_pgen</w:t>
-            </w:r>
-          </w:p>
-        </w:tc>
-        <w:tc>
-          <w:tcPr>
-            <w:tcW w:type="dxa" w:w="2880"/>
-          </w:tcPr>
-          <w:p>
-            <w:r>
-              <w:t>必要データ</w:t>
-            </w:r>
-          </w:p>
-        </w:tc>
-        <w:tc>
-          <w:tcPr>
-            <w:tcW w:type="dxa" w:w="2880"/>
-          </w:tcPr>
-          <w:p>
-            <w:r>
-              <w:t>pGen&gt;0の場合のlog10(pGen)。SHM仕様書では参照列。</w:t>
-            </w:r>
-          </w:p>
-        </w:tc>
-      </w:tr>
-      <w:tr>
-        <w:tc>
-          <w:tcPr>
-            <w:tcW w:type="dxa" w:w="2880"/>
-          </w:tcPr>
-          <w:p>
-            <w:r>
-              <w:t>junction</w:t>
-            </w:r>
-          </w:p>
-        </w:tc>
-        <w:tc>
-          <w:tcPr>
-            <w:tcW w:type="dxa" w:w="2880"/>
-          </w:tcPr>
-          <w:p>
-            <w:r>
-              <w:t>参考データ</w:t>
-            </w:r>
-          </w:p>
-        </w:tc>
-        <w:tc>
-          <w:tcPr>
-            <w:tcW w:type="dxa" w:w="2880"/>
-          </w:tcPr>
-          <w:p>
-            <w:r>
-              <w:t>CDR3塩基配列。</w:t>
-            </w:r>
-          </w:p>
-        </w:tc>
-      </w:tr>
-      <w:tr>
-        <w:tc>
-          <w:tcPr>
-            <w:tcW w:type="dxa" w:w="2880"/>
-          </w:tcPr>
-          <w:p>
-            <w:r>
-              <w:t>v_identity</w:t>
-            </w:r>
-          </w:p>
-        </w:tc>
-        <w:tc>
-          <w:tcPr>
-            <w:tcW w:type="dxa" w:w="2880"/>
-          </w:tcPr>
-          <w:p>
-            <w:r>
-              <w:t>参考データ</w:t>
-            </w:r>
-          </w:p>
-        </w:tc>
-        <w:tc>
-          <w:tcPr>
-            <w:tcW w:type="dxa" w:w="2880"/>
-          </w:tcPr>
-          <w:p>
-            <w:r>
-              <w:t>SHM計算元のV identity値。</w:t>
-            </w:r>
-          </w:p>
-        </w:tc>
-      </w:tr>
-      <w:tr>
-        <w:tc>
-          <w:tcPr>
-            <w:tcW w:type="dxa" w:w="2880"/>
-          </w:tcPr>
-          <w:p>
-            <w:r>
-              <w:t>locus</w:t>
-            </w:r>
-          </w:p>
-        </w:tc>
-        <w:tc>
-          <w:tcPr>
-            <w:tcW w:type="dxa" w:w="2880"/>
-          </w:tcPr>
-          <w:p>
-            <w:r>
-              <w:t>参考データ</w:t>
-            </w:r>
-          </w:p>
-        </w:tc>
-        <w:tc>
-          <w:tcPr>
-            <w:tcW w:type="dxa" w:w="2880"/>
-          </w:tcPr>
-          <w:p>
-            <w:r>
-              <w:t>IGH判定およびQC確認用。</w:t>
-            </w:r>
-          </w:p>
-        </w:tc>
-      </w:tr>
-      <w:tr>
-        <w:tc>
-          <w:tcPr>
-            <w:tcW w:type="dxa" w:w="2880"/>
-          </w:tcPr>
-          <w:p>
-            <w:r>
-              <w:t>productive</w:t>
-            </w:r>
-          </w:p>
-        </w:tc>
-        <w:tc>
-          <w:tcPr>
-            <w:tcW w:type="dxa" w:w="2880"/>
-          </w:tcPr>
-          <w:p>
-            <w:r>
-              <w:t>参考データ</w:t>
-            </w:r>
-          </w:p>
-        </w:tc>
-        <w:tc>
-          <w:tcPr>
-            <w:tcW w:type="dxa" w:w="2880"/>
-          </w:tcPr>
-          <w:p>
-            <w:r>
-              <w:t>productiveフィルタ確認用。</w:t>
-            </w:r>
-          </w:p>
-        </w:tc>
-      </w:tr>
-      <w:tr>
-        <w:tc>
-          <w:tcPr>
-            <w:tcW w:type="dxa" w:w="2880"/>
-          </w:tcPr>
-          <w:p>
-            <w:r>
-              <w:t>v_call</w:t>
-            </w:r>
-          </w:p>
-        </w:tc>
-        <w:tc>
-          <w:tcPr>
-            <w:tcW w:type="dxa" w:w="2880"/>
-          </w:tcPr>
-          <w:p>
-            <w:r>
-              <w:t>参考データ</w:t>
-            </w:r>
-          </w:p>
-        </w:tc>
-        <w:tc>
-          <w:tcPr>
-            <w:tcW w:type="dxa" w:w="2880"/>
-          </w:tcPr>
-          <w:p>
-            <w:r>
-              <w:t>pGen計算には使わないが、解釈/QCに利用する。</w:t>
-            </w:r>
-          </w:p>
-        </w:tc>
-      </w:tr>
-      <w:tr>
-        <w:tc>
-          <w:tcPr>
-            <w:tcW w:type="dxa" w:w="2880"/>
-          </w:tcPr>
-          <w:p>
-            <w:r>
-              <w:t>j_call</w:t>
-            </w:r>
-          </w:p>
-        </w:tc>
-        <w:tc>
-          <w:tcPr>
-            <w:tcW w:type="dxa" w:w="2880"/>
-          </w:tcPr>
-          <w:p>
-            <w:r>
-              <w:t>参考データ</w:t>
-            </w:r>
-          </w:p>
-        </w:tc>
-        <w:tc>
-          <w:tcPr>
-            <w:tcW w:type="dxa" w:w="2880"/>
-          </w:tcPr>
-          <w:p>
-            <w:r>
-              <w:t>pGen計算には使わないが、解釈/QCに利用する。</w:t>
-            </w:r>
-          </w:p>
-        </w:tc>
-      </w:tr>
-      <w:tr>
-        <w:tc>
-          <w:tcPr>
-            <w:tcW w:type="dxa" w:w="2880"/>
-          </w:tcPr>
-          <w:p>
-            <w:r>
-              <w:t>same_xy_count</w:t>
-            </w:r>
-          </w:p>
-        </w:tc>
-        <w:tc>
-          <w:tcPr>
-            <w:tcW w:type="dxa" w:w="2880"/>
-          </w:tcPr>
-          <w:p>
-            <w:r>
-              <w:t>描画補助</w:t>
-            </w:r>
-          </w:p>
-        </w:tc>
-        <w:tc>
-          <w:tcPr>
-            <w:tcW w:type="dxa" w:w="2880"/>
-          </w:tcPr>
-          <w:p>
-            <w:r>
-              <w:t>同一log10_pgenかつ同一SHMを持つ採用行数。</w:t>
-            </w:r>
-          </w:p>
-        </w:tc>
-      </w:tr>
-      <w:tr>
-        <w:tc>
-          <w:tcPr>
-            <w:tcW w:type="dxa" w:w="2880"/>
-          </w:tcPr>
-          <w:p>
-            <w:r>
-              <w:t>plot_weight</w:t>
-            </w:r>
-          </w:p>
-        </w:tc>
-        <w:tc>
-          <w:tcPr>
-            <w:tcW w:type="dxa" w:w="2880"/>
-          </w:tcPr>
-          <w:p>
-            <w:r>
-              <w:t>描画補助</w:t>
-            </w:r>
-          </w:p>
-        </w:tc>
-        <w:tc>
-          <w:tcPr>
-            <w:tcW w:type="dxa" w:w="2880"/>
-          </w:tcPr>
-          <w:p>
-            <w:r>
-              <w:t>通常は1。duplicate_countを使う設定ではその値。</w:t>
+              <w:t xml:space="preserve">  元データを潰さない row-level Excel/TSV を中心データとして保存し、目的に応じて複数の図表を出力する方針とする。</w:t>
             </w:r>
           </w:p>
         </w:tc>
@@ -655,31 +77,1104 @@
         <w:pStyle w:val="Heading1"/>
       </w:pPr>
       <w:r>
-        <w:t>5. SHM histogram仕様</w:t>
+        <w:t>1. 目的と位置づけ</w:t>
+      </w:r>
+    </w:p>
+    <w:p>
+      <w:r>
+        <w:t>本書は、AIRR TSVからV領域のSHM(%Mutation)を計算し、row-levelの中間データおよびSHM分布図を作成する仕様をまとめる。SHMはpGen-SHM plotのy軸に使うため、ここでの計算単位とフィルタを明確にしておく。</w:t>
+      </w:r>
+    </w:p>
+    <w:tbl>
+      <w:tblPr>
+        <w:tblStyle w:val="TableGrid"/>
+        <w:tblW w:type="dxa" w:w="9360"/>
+        <w:tblLayout w:type="fixed"/>
+        <w:tblLook w:firstColumn="1" w:firstRow="1" w:lastColumn="0" w:lastRow="0" w:noHBand="0" w:noVBand="1" w:val="04A0"/>
+        <w:tblInd w:w="120" w:type="dxa"/>
+        <w:tblCellMar>
+          <w:top w:w="80" w:type="dxa"/>
+          <w:start w:w="120" w:type="dxa"/>
+          <w:bottom w:w="80" w:type="dxa"/>
+          <w:end w:w="120" w:type="dxa"/>
+        </w:tblCellMar>
+      </w:tblPr>
+      <w:tblGrid>
+        <w:gridCol w:w="1900"/>
+        <w:gridCol w:w="7460"/>
+      </w:tblGrid>
+      <w:tr>
+        <w:trPr>
+          <w:tblHeader w:val="true"/>
+        </w:trPr>
+        <w:tc>
+          <w:tcPr>
+            <w:tcW w:type="dxa" w:w="1900"/>
+            <w:vAlign w:val="center"/>
+            <w:shd w:fill="E8EEF5"/>
+          </w:tcPr>
+          <w:p>
+            <w:pPr>
+              <w:jc w:val="center"/>
+            </w:pPr>
+            <w:r>
+              <w:rPr>
+                <w:b/>
+                <w:color w:val="0B2545"/>
+              </w:rPr>
+              <w:t>項目</w:t>
+            </w:r>
+          </w:p>
+        </w:tc>
+        <w:tc>
+          <w:tcPr>
+            <w:tcW w:type="dxa" w:w="7460"/>
+            <w:vAlign w:val="center"/>
+            <w:shd w:fill="E8EEF5"/>
+          </w:tcPr>
+          <w:p>
+            <w:pPr>
+              <w:jc w:val="center"/>
+            </w:pPr>
+            <w:r>
+              <w:rPr>
+                <w:b/>
+                <w:color w:val="0B2545"/>
+              </w:rPr>
+              <w:t>仕様</w:t>
+            </w:r>
+          </w:p>
+        </w:tc>
+      </w:tr>
+      <w:tr>
+        <w:tc>
+          <w:tcPr>
+            <w:tcW w:type="dxa" w:w="1900"/>
+          </w:tcPr>
+          <w:p>
+            <w:pPr>
+              <w:spacing w:after="40"/>
+            </w:pPr>
+            <w:r>
+              <w:t>入力</w:t>
+            </w:r>
+          </w:p>
+        </w:tc>
+        <w:tc>
+          <w:tcPr>
+            <w:tcW w:type="dxa" w:w="7460"/>
+          </w:tcPr>
+          <w:p>
+            <w:pPr>
+              <w:spacing w:after="40"/>
+            </w:pPr>
+            <w:r>
+              <w:t>IgBLAST -outfmt 19 のAIRR TSV。FASTAは前段GUIでAIRR TSVへ変換済みであること。</w:t>
+            </w:r>
+          </w:p>
+        </w:tc>
+      </w:tr>
+      <w:tr>
+        <w:tc>
+          <w:tcPr>
+            <w:tcW w:type="dxa" w:w="1900"/>
+          </w:tcPr>
+          <w:p>
+            <w:pPr>
+              <w:spacing w:after="40"/>
+            </w:pPr>
+            <w:r>
+              <w:t>主な列</w:t>
+            </w:r>
+          </w:p>
+        </w:tc>
+        <w:tc>
+          <w:tcPr>
+            <w:tcW w:type="dxa" w:w="7460"/>
+          </w:tcPr>
+          <w:p>
+            <w:pPr>
+              <w:spacing w:after="40"/>
+            </w:pPr>
+            <w:r>
+              <w:t>sequence_id, productive, locus, junction, junction_aa, v_identity, v_call, j_call, v_sequence_alignment等。</w:t>
+            </w:r>
+          </w:p>
+        </w:tc>
+      </w:tr>
+      <w:tr>
+        <w:tc>
+          <w:tcPr>
+            <w:tcW w:type="dxa" w:w="1900"/>
+          </w:tcPr>
+          <w:p>
+            <w:pPr>
+              <w:spacing w:after="40"/>
+            </w:pPr>
+            <w:r>
+              <w:t>主解析単位</w:t>
+            </w:r>
+          </w:p>
+        </w:tc>
+        <w:tc>
+          <w:tcPr>
+            <w:tcW w:type="dxa" w:w="7460"/>
+          </w:tcPr>
+          <w:p>
+            <w:pPr>
+              <w:spacing w:after="40"/>
+            </w:pPr>
+            <w:r>
+              <w:t>フィルタ後のAIRR 1行、すなわち原則として1つのsequence_id。</w:t>
+            </w:r>
+          </w:p>
+        </w:tc>
+      </w:tr>
+      <w:tr>
+        <w:tc>
+          <w:tcPr>
+            <w:tcW w:type="dxa" w:w="1900"/>
+          </w:tcPr>
+          <w:p>
+            <w:pPr>
+              <w:spacing w:after="40"/>
+            </w:pPr>
+            <w:r>
+              <w:t>SHM計算</w:t>
+            </w:r>
+          </w:p>
+        </w:tc>
+        <w:tc>
+          <w:tcPr>
+            <w:tcW w:type="dxa" w:w="7460"/>
+          </w:tcPr>
+          <w:p>
+            <w:pPr>
+              <w:spacing w:after="40"/>
+            </w:pPr>
+            <w:r>
+              <w:t>v_identityが0-100スケールなら 100 - v_identity、0-1スケールなら (1 - v_identity) * 100。</w:t>
+            </w:r>
+          </w:p>
+        </w:tc>
+      </w:tr>
+      <w:tr>
+        <w:tc>
+          <w:tcPr>
+            <w:tcW w:type="dxa" w:w="1900"/>
+          </w:tcPr>
+          <w:p>
+            <w:pPr>
+              <w:spacing w:after="40"/>
+            </w:pPr>
+            <w:r>
+              <w:t>出力先</w:t>
+            </w:r>
+          </w:p>
+        </w:tc>
+        <w:tc>
+          <w:tcPr>
+            <w:tcW w:type="dxa" w:w="7460"/>
+          </w:tcPr>
+          <w:p>
+            <w:pPr>
+              <w:spacing w:after="40"/>
+            </w:pPr>
+            <w:r>
+              <w:t>row-level Excel/TSV、SHM histogram、weighted SHM histogram、QC summary。</w:t>
+            </w:r>
+          </w:p>
+        </w:tc>
+      </w:tr>
+    </w:tbl>
+    <w:p/>
+    <w:p>
+      <w:pPr>
+        <w:pStyle w:val="Heading1"/>
+      </w:pPr>
+      <w:r>
+        <w:t>2. 採用フィルタ</w:t>
+      </w:r>
+    </w:p>
+    <w:tbl>
+      <w:tblPr>
+        <w:tblStyle w:val="TableGrid"/>
+        <w:tblW w:type="dxa" w:w="9360"/>
+        <w:tblLayout w:type="fixed"/>
+        <w:tblLook w:firstColumn="1" w:firstRow="1" w:lastColumn="0" w:lastRow="0" w:noHBand="0" w:noVBand="1" w:val="04A0"/>
+        <w:tblInd w:w="120" w:type="dxa"/>
+        <w:tblCellMar>
+          <w:top w:w="80" w:type="dxa"/>
+          <w:start w:w="120" w:type="dxa"/>
+          <w:bottom w:w="80" w:type="dxa"/>
+          <w:end w:w="120" w:type="dxa"/>
+        </w:tblCellMar>
+      </w:tblPr>
+      <w:tblGrid>
+        <w:gridCol w:w="1600"/>
+        <w:gridCol w:w="3600"/>
+        <w:gridCol w:w="4160"/>
+      </w:tblGrid>
+      <w:tr>
+        <w:trPr>
+          <w:tblHeader w:val="true"/>
+        </w:trPr>
+        <w:tc>
+          <w:tcPr>
+            <w:tcW w:type="dxa" w:w="1600"/>
+            <w:vAlign w:val="center"/>
+            <w:shd w:fill="E8EEF5"/>
+          </w:tcPr>
+          <w:p>
+            <w:pPr>
+              <w:jc w:val="center"/>
+            </w:pPr>
+            <w:r>
+              <w:rPr>
+                <w:b/>
+                <w:color w:val="0B2545"/>
+              </w:rPr>
+              <w:t>フィルタ</w:t>
+            </w:r>
+          </w:p>
+        </w:tc>
+        <w:tc>
+          <w:tcPr>
+            <w:tcW w:type="dxa" w:w="3600"/>
+            <w:vAlign w:val="center"/>
+            <w:shd w:fill="E8EEF5"/>
+          </w:tcPr>
+          <w:p>
+            <w:pPr>
+              <w:jc w:val="center"/>
+            </w:pPr>
+            <w:r>
+              <w:rPr>
+                <w:b/>
+                <w:color w:val="0B2545"/>
+              </w:rPr>
+              <w:t>採用条件</w:t>
+            </w:r>
+          </w:p>
+        </w:tc>
+        <w:tc>
+          <w:tcPr>
+            <w:tcW w:type="dxa" w:w="4160"/>
+            <w:vAlign w:val="center"/>
+            <w:shd w:fill="E8EEF5"/>
+          </w:tcPr>
+          <w:p>
+            <w:pPr>
+              <w:jc w:val="center"/>
+            </w:pPr>
+            <w:r>
+              <w:rPr>
+                <w:b/>
+                <w:color w:val="0B2545"/>
+              </w:rPr>
+              <w:t>意図</w:t>
+            </w:r>
+          </w:p>
+        </w:tc>
+      </w:tr>
+      <w:tr>
+        <w:tc>
+          <w:tcPr>
+            <w:tcW w:type="dxa" w:w="1600"/>
+          </w:tcPr>
+          <w:p>
+            <w:pPr>
+              <w:spacing w:after="40"/>
+            </w:pPr>
+            <w:r>
+              <w:t>locus</w:t>
+            </w:r>
+          </w:p>
+        </w:tc>
+        <w:tc>
+          <w:tcPr>
+            <w:tcW w:type="dxa" w:w="3600"/>
+          </w:tcPr>
+          <w:p>
+            <w:pPr>
+              <w:spacing w:after="40"/>
+            </w:pPr>
+            <w:r>
+              <w:t>基本はIGH。空欄locusは保持しQCに件数を記録。IGK/IGLは除外。</w:t>
+            </w:r>
+          </w:p>
+        </w:tc>
+        <w:tc>
+          <w:tcPr>
+            <w:tcW w:type="dxa" w:w="4160"/>
+          </w:tcPr>
+          <w:p>
+            <w:pPr>
+              <w:spacing w:after="40"/>
+            </w:pPr>
+            <w:r>
+              <w:t>OLGA human_B_heavyを使うため、IGHを前提にする。</w:t>
+            </w:r>
+          </w:p>
+        </w:tc>
+      </w:tr>
+      <w:tr>
+        <w:tc>
+          <w:tcPr>
+            <w:tcW w:type="dxa" w:w="1600"/>
+          </w:tcPr>
+          <w:p>
+            <w:pPr>
+              <w:spacing w:after="40"/>
+            </w:pPr>
+            <w:r>
+              <w:t>productive</w:t>
+            </w:r>
+          </w:p>
+        </w:tc>
+        <w:tc>
+          <w:tcPr>
+            <w:tcW w:type="dxa" w:w="3600"/>
+          </w:tcPr>
+          <w:p>
+            <w:pPr>
+              <w:spacing w:after="40"/>
+            </w:pPr>
+            <w:r>
+              <w:t>productive == Tを採用。</w:t>
+            </w:r>
+          </w:p>
+        </w:tc>
+        <w:tc>
+          <w:tcPr>
+            <w:tcW w:type="dxa" w:w="4160"/>
+          </w:tcPr>
+          <w:p>
+            <w:pPr>
+              <w:spacing w:after="40"/>
+            </w:pPr>
+            <w:r>
+              <w:t>機能的なVDJ再構成を主対象にする。</w:t>
+            </w:r>
+          </w:p>
+        </w:tc>
+      </w:tr>
+      <w:tr>
+        <w:tc>
+          <w:tcPr>
+            <w:tcW w:type="dxa" w:w="1600"/>
+          </w:tcPr>
+          <w:p>
+            <w:pPr>
+              <w:spacing w:after="40"/>
+            </w:pPr>
+            <w:r>
+              <w:t>vj_in_frame</w:t>
+            </w:r>
+          </w:p>
+        </w:tc>
+        <w:tc>
+          <w:tcPr>
+            <w:tcW w:type="dxa" w:w="3600"/>
+          </w:tcPr>
+          <w:p>
+            <w:pPr>
+              <w:spacing w:after="40"/>
+            </w:pPr>
+            <w:r>
+              <w:t>列がある場合はTを採用。</w:t>
+            </w:r>
+          </w:p>
+        </w:tc>
+        <w:tc>
+          <w:tcPr>
+            <w:tcW w:type="dxa" w:w="4160"/>
+          </w:tcPr>
+          <w:p>
+            <w:pPr>
+              <w:spacing w:after="40"/>
+            </w:pPr>
+            <w:r>
+              <w:t>フレーム外配列を除く。</w:t>
+            </w:r>
+          </w:p>
+        </w:tc>
+      </w:tr>
+      <w:tr>
+        <w:tc>
+          <w:tcPr>
+            <w:tcW w:type="dxa" w:w="1600"/>
+          </w:tcPr>
+          <w:p>
+            <w:pPr>
+              <w:spacing w:after="40"/>
+            </w:pPr>
+            <w:r>
+              <w:t>stop_codon</w:t>
+            </w:r>
+          </w:p>
+        </w:tc>
+        <w:tc>
+          <w:tcPr>
+            <w:tcW w:type="dxa" w:w="3600"/>
+          </w:tcPr>
+          <w:p>
+            <w:pPr>
+              <w:spacing w:after="40"/>
+            </w:pPr>
+            <w:r>
+              <w:t>列がある場合はFを採用。</w:t>
+            </w:r>
+          </w:p>
+        </w:tc>
+        <w:tc>
+          <w:tcPr>
+            <w:tcW w:type="dxa" w:w="4160"/>
+          </w:tcPr>
+          <w:p>
+            <w:pPr>
+              <w:spacing w:after="40"/>
+            </w:pPr>
+            <w:r>
+              <w:t>停止コドンを含む配列を除く。</w:t>
+            </w:r>
+          </w:p>
+        </w:tc>
+      </w:tr>
+      <w:tr>
+        <w:tc>
+          <w:tcPr>
+            <w:tcW w:type="dxa" w:w="1600"/>
+          </w:tcPr>
+          <w:p>
+            <w:pPr>
+              <w:spacing w:after="40"/>
+            </w:pPr>
+            <w:r>
+              <w:t>junction</w:t>
+            </w:r>
+          </w:p>
+        </w:tc>
+        <w:tc>
+          <w:tcPr>
+            <w:tcW w:type="dxa" w:w="3600"/>
+          </w:tcPr>
+          <w:p>
+            <w:pPr>
+              <w:spacing w:after="40"/>
+            </w:pPr>
+            <w:r>
+              <w:t>空でなく、A/C/G/Tのみ。Nや記号を含むものは除外。</w:t>
+            </w:r>
+          </w:p>
+        </w:tc>
+        <w:tc>
+          <w:tcPr>
+            <w:tcW w:type="dxa" w:w="4160"/>
+          </w:tcPr>
+          <w:p>
+            <w:pPr>
+              <w:spacing w:after="40"/>
+            </w:pPr>
+            <w:r>
+              <w:t>junction単位の集計とpGen連携を安定させる。</w:t>
+            </w:r>
+          </w:p>
+        </w:tc>
+      </w:tr>
+      <w:tr>
+        <w:tc>
+          <w:tcPr>
+            <w:tcW w:type="dxa" w:w="1600"/>
+          </w:tcPr>
+          <w:p>
+            <w:pPr>
+              <w:spacing w:after="40"/>
+            </w:pPr>
+            <w:r>
+              <w:t>junction_aa</w:t>
+            </w:r>
+          </w:p>
+        </w:tc>
+        <w:tc>
+          <w:tcPr>
+            <w:tcW w:type="dxa" w:w="3600"/>
+          </w:tcPr>
+          <w:p>
+            <w:pPr>
+              <w:spacing w:after="40"/>
+            </w:pPr>
+            <w:r>
+              <w:t>空でなく、*やXを含まない英字。</w:t>
+            </w:r>
+          </w:p>
+        </w:tc>
+        <w:tc>
+          <w:tcPr>
+            <w:tcW w:type="dxa" w:w="4160"/>
+          </w:tcPr>
+          <w:p>
+            <w:pPr>
+              <w:spacing w:after="40"/>
+            </w:pPr>
+            <w:r>
+              <w:t>pGen計算に不適なCDR3 AAを除く。</w:t>
+            </w:r>
+          </w:p>
+        </w:tc>
+      </w:tr>
+      <w:tr>
+        <w:tc>
+          <w:tcPr>
+            <w:tcW w:type="dxa" w:w="1600"/>
+          </w:tcPr>
+          <w:p>
+            <w:pPr>
+              <w:spacing w:after="40"/>
+            </w:pPr>
+            <w:r>
+              <w:t>Min V alignment length</w:t>
+            </w:r>
+          </w:p>
+        </w:tc>
+        <w:tc>
+          <w:tcPr>
+            <w:tcW w:type="dxa" w:w="3600"/>
+          </w:tcPr>
+          <w:p>
+            <w:pPr>
+              <w:spacing w:after="40"/>
+            </w:pPr>
+            <w:r>
+              <w:t>既定0。必要時のみ下限を設定。</w:t>
+            </w:r>
+          </w:p>
+        </w:tc>
+        <w:tc>
+          <w:tcPr>
+            <w:tcW w:type="dxa" w:w="4160"/>
+          </w:tcPr>
+          <w:p>
+            <w:pPr>
+              <w:spacing w:after="40"/>
+            </w:pPr>
+            <w:r>
+              <w:t>短いV alignment由来の不安定なSHMを除くための任意設定。</w:t>
+            </w:r>
+          </w:p>
+        </w:tc>
+      </w:tr>
+    </w:tbl>
+    <w:p/>
+    <w:p>
+      <w:pPr>
+        <w:pStyle w:val="Heading1"/>
+      </w:pPr>
+      <w:r>
+        <w:t>3. SHM計算と保持する情報</w:t>
+      </w:r>
+    </w:p>
+    <w:p>
+      <w:r>
+        <w:t>現在の主方針は、同じjunction_aaであっても各sequence_idのSHMを潰さず残すことである。同じCDR3 AAでもV領域のmutation状態は別情報であり、medianに集約すると探索段階の情報を失う可能性がある。</w:t>
+      </w:r>
+    </w:p>
+    <w:tbl>
+      <w:tblPr>
+        <w:tblStyle w:val="TableGrid"/>
+        <w:tblW w:type="dxa" w:w="9360"/>
+        <w:tblLayout w:type="fixed"/>
+        <w:tblLook w:firstColumn="1" w:firstRow="1" w:lastColumn="0" w:lastRow="0" w:noHBand="0" w:noVBand="1" w:val="04A0"/>
+        <w:tblInd w:w="120" w:type="dxa"/>
+        <w:tblCellMar>
+          <w:top w:w="80" w:type="dxa"/>
+          <w:start w:w="120" w:type="dxa"/>
+          <w:bottom w:w="80" w:type="dxa"/>
+          <w:end w:w="120" w:type="dxa"/>
+        </w:tblCellMar>
+      </w:tblPr>
+      <w:tblGrid>
+        <w:gridCol w:w="2200"/>
+        <w:gridCol w:w="7160"/>
+      </w:tblGrid>
+      <w:tr>
+        <w:trPr>
+          <w:tblHeader w:val="true"/>
+        </w:trPr>
+        <w:tc>
+          <w:tcPr>
+            <w:tcW w:type="dxa" w:w="2200"/>
+            <w:vAlign w:val="center"/>
+            <w:shd w:fill="E8EEF5"/>
+          </w:tcPr>
+          <w:p>
+            <w:pPr>
+              <w:jc w:val="center"/>
+            </w:pPr>
+            <w:r>
+              <w:rPr>
+                <w:b/>
+                <w:color w:val="0B2545"/>
+              </w:rPr>
+              <w:t>出力列</w:t>
+            </w:r>
+          </w:p>
+        </w:tc>
+        <w:tc>
+          <w:tcPr>
+            <w:tcW w:type="dxa" w:w="7160"/>
+            <w:vAlign w:val="center"/>
+            <w:shd w:fill="E8EEF5"/>
+          </w:tcPr>
+          <w:p>
+            <w:pPr>
+              <w:jc w:val="center"/>
+            </w:pPr>
+            <w:r>
+              <w:rPr>
+                <w:b/>
+                <w:color w:val="0B2545"/>
+              </w:rPr>
+              <w:t>意味</w:t>
+            </w:r>
+          </w:p>
+        </w:tc>
+      </w:tr>
+      <w:tr>
+        <w:tc>
+          <w:tcPr>
+            <w:tcW w:type="dxa" w:w="2200"/>
+          </w:tcPr>
+          <w:p>
+            <w:pPr>
+              <w:spacing w:after="40"/>
+            </w:pPr>
+            <w:r>
+              <w:t>sequence_id</w:t>
+            </w:r>
+          </w:p>
+        </w:tc>
+        <w:tc>
+          <w:tcPr>
+            <w:tcW w:type="dxa" w:w="7160"/>
+          </w:tcPr>
+          <w:p>
+            <w:pPr>
+              <w:spacing w:after="40"/>
+            </w:pPr>
+            <w:r>
+              <w:t>AIRR行の識別子。row-level解析の基本単位。</w:t>
+            </w:r>
+          </w:p>
+        </w:tc>
+      </w:tr>
+      <w:tr>
+        <w:tc>
+          <w:tcPr>
+            <w:tcW w:type="dxa" w:w="2200"/>
+          </w:tcPr>
+          <w:p>
+            <w:pPr>
+              <w:spacing w:after="40"/>
+            </w:pPr>
+            <w:r>
+              <w:t>shm</w:t>
+            </w:r>
+          </w:p>
+        </w:tc>
+        <w:tc>
+          <w:tcPr>
+            <w:tcW w:type="dxa" w:w="7160"/>
+          </w:tcPr>
+          <w:p>
+            <w:pPr>
+              <w:spacing w:after="40"/>
+            </w:pPr>
+            <w:r>
+              <w:t>v_identityから計算した%Mutation。</w:t>
+            </w:r>
+          </w:p>
+        </w:tc>
+      </w:tr>
+      <w:tr>
+        <w:tc>
+          <w:tcPr>
+            <w:tcW w:type="dxa" w:w="2200"/>
+          </w:tcPr>
+          <w:p>
+            <w:pPr>
+              <w:spacing w:after="40"/>
+            </w:pPr>
+            <w:r>
+              <w:t>v_identity</w:t>
+            </w:r>
+          </w:p>
+        </w:tc>
+        <w:tc>
+          <w:tcPr>
+            <w:tcW w:type="dxa" w:w="7160"/>
+          </w:tcPr>
+          <w:p>
+            <w:pPr>
+              <w:spacing w:after="40"/>
+            </w:pPr>
+            <w:r>
+              <w:t>SHM計算の元値。小数3桁程度まで出ることがあり、完全一致は限定的。</w:t>
+            </w:r>
+          </w:p>
+        </w:tc>
+      </w:tr>
+      <w:tr>
+        <w:tc>
+          <w:tcPr>
+            <w:tcW w:type="dxa" w:w="2200"/>
+          </w:tcPr>
+          <w:p>
+            <w:pPr>
+              <w:spacing w:after="40"/>
+            </w:pPr>
+            <w:r>
+              <w:t>junction / junction_aa</w:t>
+            </w:r>
+          </w:p>
+        </w:tc>
+        <w:tc>
+          <w:tcPr>
+            <w:tcW w:type="dxa" w:w="7160"/>
+          </w:tcPr>
+          <w:p>
+            <w:pPr>
+              <w:spacing w:after="40"/>
+            </w:pPr>
+            <w:r>
+              <w:t>CDR3 nt / AA。pGenとBeta1互換集計の連携に使う。</w:t>
+            </w:r>
+          </w:p>
+        </w:tc>
+      </w:tr>
+      <w:tr>
+        <w:tc>
+          <w:tcPr>
+            <w:tcW w:type="dxa" w:w="2200"/>
+          </w:tcPr>
+          <w:p>
+            <w:pPr>
+              <w:spacing w:after="40"/>
+            </w:pPr>
+            <w:r>
+              <w:t>v_call / j_call</w:t>
+            </w:r>
+          </w:p>
+        </w:tc>
+        <w:tc>
+          <w:tcPr>
+            <w:tcW w:type="dxa" w:w="7160"/>
+          </w:tcPr>
+          <w:p>
+            <w:pPr>
+              <w:spacing w:after="40"/>
+            </w:pPr>
+            <w:r>
+              <w:t>参考情報。pGen計算には直接使わないが解釈には重要。</w:t>
+            </w:r>
+          </w:p>
+        </w:tc>
+      </w:tr>
+      <w:tr>
+        <w:tc>
+          <w:tcPr>
+            <w:tcW w:type="dxa" w:w="2200"/>
+          </w:tcPr>
+          <w:p>
+            <w:pPr>
+              <w:spacing w:after="40"/>
+            </w:pPr>
+            <w:r>
+              <w:t>same_xy_count / plot_weight</w:t>
+            </w:r>
+          </w:p>
+        </w:tc>
+        <w:tc>
+          <w:tcPr>
+            <w:tcW w:type="dxa" w:w="7160"/>
+          </w:tcPr>
+          <w:p>
+            <w:pPr>
+              <w:spacing w:after="40"/>
+            </w:pPr>
+            <w:r>
+              <w:t>同一log10_pgen・SHM座標に重なるrow数と描画重み。</w:t>
+            </w:r>
+          </w:p>
+        </w:tc>
+      </w:tr>
+    </w:tbl>
+    <w:p/>
+    <w:p>
+      <w:pPr>
+        <w:pStyle w:val="Heading1"/>
+      </w:pPr>
+      <w:r>
+        <w:t>4. Beta1方式との関係</w:t>
+      </w:r>
+    </w:p>
+    <w:tbl>
+      <w:tblPr>
+        <w:tblStyle w:val="TableGrid"/>
+        <w:tblW w:type="dxa" w:w="9360"/>
+        <w:tblLayout w:type="fixed"/>
+        <w:tblLook w:firstColumn="1" w:firstRow="1" w:lastColumn="0" w:lastRow="0" w:noHBand="0" w:noVBand="1" w:val="04A0"/>
+        <w:tblInd w:w="120" w:type="dxa"/>
+        <w:tblCellMar>
+          <w:top w:w="80" w:type="dxa"/>
+          <w:start w:w="120" w:type="dxa"/>
+          <w:bottom w:w="80" w:type="dxa"/>
+          <w:end w:w="120" w:type="dxa"/>
+        </w:tblCellMar>
+      </w:tblPr>
+      <w:tblGrid>
+        <w:gridCol w:w="1600"/>
+        <w:gridCol w:w="2700"/>
+        <w:gridCol w:w="2600"/>
+        <w:gridCol w:w="2460"/>
+      </w:tblGrid>
+      <w:tr>
+        <w:trPr>
+          <w:tblHeader w:val="true"/>
+        </w:trPr>
+        <w:tc>
+          <w:tcPr>
+            <w:tcW w:type="dxa" w:w="1600"/>
+            <w:vAlign w:val="center"/>
+            <w:shd w:fill="E8EEF5"/>
+          </w:tcPr>
+          <w:p>
+            <w:pPr>
+              <w:jc w:val="center"/>
+            </w:pPr>
+            <w:r>
+              <w:rPr>
+                <w:b/>
+                <w:color w:val="0B2545"/>
+              </w:rPr>
+              <w:t>方式</w:t>
+            </w:r>
+          </w:p>
+        </w:tc>
+        <w:tc>
+          <w:tcPr>
+            <w:tcW w:type="dxa" w:w="2700"/>
+            <w:vAlign w:val="center"/>
+            <w:shd w:fill="E8EEF5"/>
+          </w:tcPr>
+          <w:p>
+            <w:pPr>
+              <w:jc w:val="center"/>
+            </w:pPr>
+            <w:r>
+              <w:rPr>
+                <w:b/>
+                <w:color w:val="0B2545"/>
+              </w:rPr>
+              <w:t>SHMの扱い</w:t>
+            </w:r>
+          </w:p>
+        </w:tc>
+        <w:tc>
+          <w:tcPr>
+            <w:tcW w:type="dxa" w:w="2600"/>
+            <w:vAlign w:val="center"/>
+            <w:shd w:fill="E8EEF5"/>
+          </w:tcPr>
+          <w:p>
+            <w:pPr>
+              <w:jc w:val="center"/>
+            </w:pPr>
+            <w:r>
+              <w:rPr>
+                <w:b/>
+                <w:color w:val="0B2545"/>
+              </w:rPr>
+              <w:t>利点</w:t>
+            </w:r>
+          </w:p>
+        </w:tc>
+        <w:tc>
+          <w:tcPr>
+            <w:tcW w:type="dxa" w:w="2460"/>
+            <w:vAlign w:val="center"/>
+            <w:shd w:fill="E8EEF5"/>
+          </w:tcPr>
+          <w:p>
+            <w:pPr>
+              <w:jc w:val="center"/>
+            </w:pPr>
+            <w:r>
+              <w:rPr>
+                <w:b/>
+                <w:color w:val="0B2545"/>
+              </w:rPr>
+              <w:t>注意点</w:t>
+            </w:r>
+          </w:p>
+        </w:tc>
+      </w:tr>
+      <w:tr>
+        <w:tc>
+          <w:tcPr>
+            <w:tcW w:type="dxa" w:w="1600"/>
+          </w:tcPr>
+          <w:p>
+            <w:pPr>
+              <w:spacing w:after="40"/>
+            </w:pPr>
+            <w:r>
+              <w:t>現在方式</w:t>
+            </w:r>
+          </w:p>
+        </w:tc>
+        <w:tc>
+          <w:tcPr>
+            <w:tcW w:type="dxa" w:w="2700"/>
+          </w:tcPr>
+          <w:p>
+            <w:pPr>
+              <w:spacing w:after="40"/>
+            </w:pPr>
+            <w:r>
+              <w:t>各AIRR行のSHMをそのまま保持。</w:t>
+            </w:r>
+          </w:p>
+        </w:tc>
+        <w:tc>
+          <w:tcPr>
+            <w:tcW w:type="dxa" w:w="2600"/>
+          </w:tcPr>
+          <w:p>
+            <w:pPr>
+              <w:spacing w:after="40"/>
+            </w:pPr>
+            <w:r>
+              <w:t>情報を潰さず、scatterで存在確認しやすい。</w:t>
+            </w:r>
+          </w:p>
+        </w:tc>
+        <w:tc>
+          <w:tcPr>
+            <w:tcW w:type="dxa" w:w="2460"/>
+          </w:tcPr>
+          <w:p>
+            <w:pPr>
+              <w:spacing w:after="40"/>
+            </w:pPr>
+            <w:r>
+              <w:t>read abundanceやPCR増幅の影響を受ける。</w:t>
+            </w:r>
+          </w:p>
+        </w:tc>
+      </w:tr>
+      <w:tr>
+        <w:tc>
+          <w:tcPr>
+            <w:tcW w:type="dxa" w:w="1600"/>
+          </w:tcPr>
+          <w:p>
+            <w:pPr>
+              <w:spacing w:after="40"/>
+            </w:pPr>
+            <w:r>
+              <w:t>Beta1互換</w:t>
+            </w:r>
+          </w:p>
+        </w:tc>
+        <w:tc>
+          <w:tcPr>
+            <w:tcW w:type="dxa" w:w="2700"/>
+          </w:tcPr>
+          <w:p>
+            <w:pPr>
+              <w:spacing w:after="40"/>
+            </w:pPr>
+            <w:r>
+              <w:t>unique junction(nt)ごとにSHM medianを1点にする。</w:t>
+            </w:r>
+          </w:p>
+        </w:tc>
+        <w:tc>
+          <w:tcPr>
+            <w:tcW w:type="dxa" w:w="2600"/>
+          </w:tcPr>
+          <w:p>
+            <w:pPr>
+              <w:spacing w:after="40"/>
+            </w:pPr>
+            <w:r>
+              <w:t>旧解析との比較、多様性寄りの視点に適する。</w:t>
+            </w:r>
+          </w:p>
+        </w:tc>
+        <w:tc>
+          <w:tcPr>
+            <w:tcW w:type="dxa" w:w="2460"/>
+          </w:tcPr>
+          <w:p>
+            <w:pPr>
+              <w:spacing w:after="40"/>
+            </w:pPr>
+            <w:r>
+              <w:t>同一junction内のSHMばらつきを失う。</w:t>
+            </w:r>
+          </w:p>
+        </w:tc>
+      </w:tr>
+    </w:tbl>
+    <w:p/>
+    <w:p>
+      <w:pPr>
+        <w:pStyle w:val="Heading1"/>
+      </w:pPr>
+      <w:r>
+        <w:t>5. SHMヒストグラム</w:t>
       </w:r>
     </w:p>
     <w:p>
       <w:pPr>
         <w:pStyle w:val="ListBullet"/>
+        <w:spacing w:after="80" w:line="300" w:lineRule="auto"/>
+        <w:ind w:left="540" w:hanging="271"/>
       </w:pPr>
       <w:r>
-        <w:t>非重み付きSHM histogramは、採用AIRR行を1行1カウントとして作成する。</w:t>
+        <w:t>非重み付きSHM histogramは、採用rowを1行1カウントとしてSHM binに入れる。</w:t>
       </w:r>
     </w:p>
     <w:p>
       <w:pPr>
         <w:pStyle w:val="ListBullet"/>
+        <w:spacing w:after="80" w:line="300" w:lineRule="auto"/>
+        <w:ind w:left="540" w:hanging="271"/>
       </w:pPr>
       <w:r>
-        <w:t>重み付きSHM histogramは、plot_weightを重みとして作成する。duplicate_count列を使わない通常設定では非重み付きと同じになる。</w:t>
+        <w:t>weighted SHM histogramは、plot_weightを使う。通常はrow数と同じだが、duplicate_countを使う設定ではその重みに従う。</w:t>
       </w:r>
     </w:p>
     <w:p>
       <w:pPr>
         <w:pStyle w:val="ListBullet"/>
+        <w:spacing w:after="80" w:line="300" w:lineRule="auto"/>
+        <w:ind w:left="540" w:hanging="271"/>
       </w:pPr>
       <w:r>
-        <w:t>binは0-2%, 2-4%, ..., 18-20%, 20%以上とする。</w:t>
+        <w:t>binは0-2%, 2-4%, ... , 18-20%, 20%以上を使う。</w:t>
+      </w:r>
+    </w:p>
+    <w:p>
+      <w:pPr>
+        <w:pStyle w:val="ListBullet"/>
+        <w:spacing w:after="80" w:line="300" w:lineRule="auto"/>
+        <w:ind w:left="540" w:hanging="271"/>
+      </w:pPr>
+      <w:r>
+        <w:t>V alignment lengthが短い群でSHMが低く見える可能性があるため、QC summaryと必要に応じたMin V alignment length設定を確認する。</w:t>
       </w:r>
     </w:p>
     <w:p>
@@ -687,41 +1182,66 @@
         <w:pStyle w:val="Heading1"/>
       </w:pPr>
       <w:r>
-        <w:t>6. QCと注意点</w:t>
+        <w:t>6. 議論点と今後の確認事項</w:t>
       </w:r>
     </w:p>
     <w:p>
       <w:pPr>
         <w:pStyle w:val="ListBullet"/>
+        <w:spacing w:after="80" w:line="300" w:lineRule="auto"/>
+        <w:ind w:left="540" w:hanging="271"/>
       </w:pPr>
       <w:r>
-        <w:t>SHMはv_identity由来であり、V alignmentが短いreadでは不安定になり得る。</w:t>
+        <w:t>SHMはV領域由来であり、CDR3のpGenとは別情報である。低SHM・高pGen領域の生物学的解釈では、V alignment品質も確認する。</w:t>
       </w:r>
     </w:p>
     <w:p>
       <w:pPr>
         <w:pStyle w:val="ListBullet"/>
+        <w:spacing w:after="80" w:line="300" w:lineRule="auto"/>
+        <w:ind w:left="540" w:hanging="271"/>
       </w:pPr>
       <w:r>
-        <w:t>初期設定ではV alignment長による除外は行わず、必要時のみMin V alignment lengthを設定する。</w:t>
+        <w:t>各点方式は探索に向くが、クローン増幅やread数の影響を受ける。多様性を見る場合はBeta1互換のunique junction集計を併用する。</w:t>
       </w:r>
     </w:p>
     <w:p>
       <w:pPr>
         <w:pStyle w:val="ListBullet"/>
+        <w:spacing w:after="80" w:line="300" w:lineRule="auto"/>
+        <w:ind w:left="540" w:hanging="271"/>
       </w:pPr>
       <w:r>
-        <w:t>counts TSVやExcel集計表は入力対象ではない。必ずIgBLAST AIRR outfmt 19 TSVを用いる。</w:t>
+        <w:t>Min V alignment lengthを既定で入れるかは未確定。現時点では除外せず、必要に応じて再解析で評価する。</w:t>
       </w:r>
     </w:p>
     <w:sectPr>
+      <w:footerReference w:type="default" r:id="rId9"/>
       <w:pgSz w:w="12240" w:h="15840"/>
-      <w:pgMar w:top="1440" w:right="1800" w:bottom="1440" w:left="1800" w:header="720" w:footer="720" w:gutter="0"/>
+      <w:pgMar w:top="1440" w:right="1440" w:bottom="1440" w:left="1440" w:header="708" w:footer="708" w:gutter="0"/>
       <w:cols w:space="720"/>
       <w:docGrid w:linePitch="360"/>
     </w:sectPr>
   </w:body>
 </w:document>
+</file>
+
+<file path=word/footer1.xml><?xml version="1.0" encoding="utf-8"?>
+<w:ftr xmlns:m="http://schemas.openxmlformats.org/officeDocument/2006/math" xmlns:mc="http://schemas.openxmlformats.org/markup-compatibility/2006" xmlns:mo="http://schemas.microsoft.com/office/mac/office/2008/main" xmlns:mv="urn:schemas-microsoft-com:mac:vml" xmlns:o="urn:schemas-microsoft-com:office:office" xmlns:r="http://schemas.openxmlformats.org/officeDocument/2006/relationships" xmlns:v="urn:schemas-microsoft-com:vml" xmlns:w10="urn:schemas-microsoft-com:office:word" xmlns:w14="http://schemas.microsoft.com/office/word/2010/wordml" xmlns:w="http://schemas.openxmlformats.org/wordprocessingml/2006/main" xmlns:wne="http://schemas.microsoft.com/office/word/2006/wordml" xmlns:wp14="http://schemas.microsoft.com/office/word/2010/wordprocessingDrawing" xmlns:wp="http://schemas.openxmlformats.org/drawingml/2006/wordprocessingDrawing" xmlns:wpc="http://schemas.microsoft.com/office/word/2010/wordprocessingCanvas" xmlns:wpg="http://schemas.microsoft.com/office/word/2010/wordprocessingGroup" xmlns:wpi="http://schemas.microsoft.com/office/word/2010/wordprocessingInk" xmlns:wps="http://schemas.microsoft.com/office/word/2010/wordprocessingShape" mc:Ignorable="w14 wp14">
+  <w:p>
+    <w:pPr>
+      <w:pStyle w:val="Footer"/>
+      <w:jc w:val="right"/>
+    </w:pPr>
+    <w:r>
+      <w:rPr>
+        <w:color w:val="555555"/>
+        <w:sz w:val="16"/>
+      </w:rPr>
+      <w:t>SHM specification / row-level and beta1-compatible handoff</w:t>
+    </w:r>
+  </w:p>
+</w:ftr>
 </file>
 
 <file path=word/numbering.xml><?xml version="1.0" encoding="utf-8"?>
@@ -1087,9 +1607,12 @@
     <w:name w:val="Normal"/>
     <w:qFormat/>
     <w:rsid w:val="00FC693F"/>
+    <w:pPr>
+      <w:spacing w:after="120" w:line="300" w:lineRule="auto"/>
+    </w:pPr>
     <w:rPr>
-      <w:rFonts w:ascii="Yu Gothic" w:hAnsi="Yu Gothic"/>
-      <w:sz w:val="21"/>
+      <w:rFonts w:ascii="Calibri" w:hAnsi="Calibri"/>
+      <w:sz w:val="22"/>
     </w:rPr>
   </w:style>
   <w:style w:type="paragraph" w:styleId="Header">
@@ -1147,15 +1670,15 @@
     <w:pPr>
       <w:keepNext/>
       <w:keepLines/>
-      <w:spacing w:before="480" w:after="0"/>
+      <w:spacing w:before="360" w:after="200"/>
       <w:outlineLvl w:val="0"/>
     </w:pPr>
     <w:rPr>
-      <w:rFonts w:asciiTheme="majorHAnsi" w:eastAsiaTheme="majorEastAsia" w:hAnsiTheme="majorHAnsi" w:cstheme="majorBidi" w:ascii="Yu Gothic" w:hAnsi="Yu Gothic"/>
+      <w:rFonts w:asciiTheme="majorHAnsi" w:eastAsiaTheme="majorEastAsia" w:hAnsiTheme="majorHAnsi" w:cstheme="majorBidi" w:ascii="Calibri" w:hAnsi="Calibri"/>
       <w:b/>
       <w:bCs/>
-      <w:color w:val="365F91" w:themeColor="accent1" w:themeShade="BF"/>
-      <w:sz w:val="28"/>
+      <w:color w:val="2E74B5"/>
+      <w:sz w:val="32"/>
       <w:szCs w:val="28"/>
     </w:rPr>
   </w:style>
@@ -1171,14 +1694,14 @@
     <w:pPr>
       <w:keepNext/>
       <w:keepLines/>
-      <w:spacing w:before="200" w:after="0"/>
+      <w:spacing w:before="280" w:after="140"/>
       <w:outlineLvl w:val="1"/>
     </w:pPr>
     <w:rPr>
-      <w:rFonts w:asciiTheme="majorHAnsi" w:eastAsiaTheme="majorEastAsia" w:hAnsiTheme="majorHAnsi" w:cstheme="majorBidi" w:ascii="Yu Gothic" w:hAnsi="Yu Gothic"/>
+      <w:rFonts w:asciiTheme="majorHAnsi" w:eastAsiaTheme="majorEastAsia" w:hAnsiTheme="majorHAnsi" w:cstheme="majorBidi" w:ascii="Calibri" w:hAnsi="Calibri"/>
       <w:b/>
       <w:bCs/>
-      <w:color w:val="4F81BD" w:themeColor="accent1"/>
+      <w:color w:val="2E74B5"/>
       <w:sz w:val="26"/>
       <w:szCs w:val="26"/>
     </w:rPr>
@@ -1195,14 +1718,15 @@
     <w:pPr>
       <w:keepNext/>
       <w:keepLines/>
-      <w:spacing w:before="200" w:after="0"/>
+      <w:spacing w:before="200" w:after="100"/>
       <w:outlineLvl w:val="2"/>
     </w:pPr>
     <w:rPr>
-      <w:rFonts w:asciiTheme="majorHAnsi" w:eastAsiaTheme="majorEastAsia" w:hAnsiTheme="majorHAnsi" w:cstheme="majorBidi" w:ascii="Yu Gothic" w:hAnsi="Yu Gothic"/>
+      <w:rFonts w:asciiTheme="majorHAnsi" w:eastAsiaTheme="majorEastAsia" w:hAnsiTheme="majorHAnsi" w:cstheme="majorBidi" w:ascii="Calibri" w:hAnsi="Calibri"/>
       <w:b/>
       <w:bCs/>
-      <w:color w:val="4F81BD" w:themeColor="accent1"/>
+      <w:color w:val="1F4D78"/>
+      <w:sz w:val="24"/>
     </w:rPr>
   </w:style>
   <w:style w:type="paragraph" w:styleId="Heading4">

</xml_diff>

<commit_message>
Rewrite reproducible pGen SHM specifications
</commit_message>
<xml_diff>
--- a/TSVからSHMデータ作成仕様書_20260607.docx
+++ b/TSVからSHMデータ作成仕様書_20260607.docx
@@ -4,13 +4,13 @@
   <w:body>
     <w:p>
       <w:pPr>
-        <w:spacing w:after="80"/>
+        <w:spacing w:after="60"/>
       </w:pPr>
       <w:r>
         <w:rPr>
-          <w:rFonts w:ascii="Calibri" w:hAnsi="Calibri"/>
+          <w:rFonts w:ascii="Yu Gothic" w:hAnsi="Yu Gothic" w:eastAsia="Yu Gothic"/>
           <w:b/>
-          <w:color w:val="0B2545"/>
+          <w:color w:val="000000"/>
           <w:sz w:val="40"/>
         </w:rPr>
         <w:t>TSVからSHMデータ作成仕様書</w:t>
@@ -18,28 +18,29 @@
     </w:p>
     <w:p>
       <w:pPr>
-        <w:spacing w:after="240"/>
+        <w:spacing w:after="200"/>
       </w:pPr>
       <w:r>
         <w:rPr>
-          <w:rFonts w:ascii="Calibri" w:hAnsi="Calibri"/>
+          <w:rFonts w:ascii="Yu Gothic" w:hAnsi="Yu Gothic" w:eastAsia="Yu Gothic"/>
           <w:color w:val="555555"/>
           <w:sz w:val="20"/>
         </w:rPr>
-        <w:t>対象: IgBLAST AIRR outfmt 19 TSV / 更新日: 2026-06-08 / 目的: SHM計算と分布確認の引継ぎ</w:t>
+        <w:t>対象: IgBLAST AIRR outfmt 19 TSV / 更新日: 2026-06-09 / 目的: SHM計算の再現</w:t>
       </w:r>
     </w:p>
     <w:tbl>
       <w:tblPr>
         <w:tblStyle w:val="TableGrid"/>
         <w:tblW w:type="dxa" w:w="9360"/>
+        <w:jc w:val="left"/>
         <w:tblLayout w:type="fixed"/>
         <w:tblLook w:firstColumn="1" w:firstRow="1" w:lastColumn="0" w:lastRow="0" w:noHBand="0" w:noVBand="1" w:val="04A0"/>
         <w:tblInd w:w="120" w:type="dxa"/>
         <w:tblCellMar>
           <w:top w:w="80" w:type="dxa"/>
+          <w:bottom w:w="80" w:type="dxa"/>
           <w:start w:w="120" w:type="dxa"/>
-          <w:bottom w:w="80" w:type="dxa"/>
           <w:end w:w="120" w:type="dxa"/>
         </w:tblCellMar>
       </w:tblPr>
@@ -55,17 +56,283 @@
           </w:tcPr>
           <w:p>
             <w:pPr>
-              <w:spacing w:after="60"/>
+              <w:spacing w:after="0"/>
             </w:pPr>
+            <w:r/>
             <w:r>
               <w:rPr>
+                <w:rFonts w:ascii="Yu Gothic" w:hAnsi="Yu Gothic" w:eastAsia="Yu Gothic"/>
                 <w:b/>
-                <w:color w:val="1F4D78"/>
               </w:rPr>
-              <w:t>引継ぎ上の要点</w:t>
+              <w:t>本書はSHM計算の詳細仕様である。全体フロー、採用フィルタ、pGen-SHM図表の統合仕様はpGen-SHM仕様書に記載する。</w:t>
             </w:r>
+          </w:p>
+        </w:tc>
+      </w:tr>
+    </w:tbl>
+    <w:p>
+      <w:pPr>
+        <w:pStyle w:val="Heading1"/>
+      </w:pPr>
+      <w:r>
+        <w:t>1. 目的と位置づけ</w:t>
+      </w:r>
+    </w:p>
+    <w:p>
+      <w:pPr>
+        <w:spacing w:after="120"/>
+      </w:pPr>
+      <w:r>
+        <w:t>SHMはV領域の%Mutationであり、pGen-SHM plotのy軸に使う。AIRR TSVのv_identityから計算し、row-level Excel/TSVのshm列として保持する。</w:t>
+      </w:r>
+    </w:p>
+    <w:p>
+      <w:pPr>
+        <w:spacing w:after="120"/>
+      </w:pPr>
+      <w:r>
+        <w:t>同じjunction_aaでも、V領域のmutation状態は異なり得る。したがって主解析では、同じjunction_aaをmedianに潰さず、各sequence_id行のSHMを保持する。</w:t>
+      </w:r>
+    </w:p>
+    <w:p>
+      <w:pPr>
+        <w:pStyle w:val="Heading1"/>
+      </w:pPr>
+      <w:r>
+        <w:t>2. 入力と前提</w:t>
+      </w:r>
+    </w:p>
+    <w:tbl>
+      <w:tblPr>
+        <w:tblStyle w:val="TableGrid"/>
+        <w:tblW w:type="dxa" w:w="9360"/>
+        <w:jc w:val="left"/>
+        <w:tblLayout w:type="fixed"/>
+        <w:tblLook w:firstColumn="1" w:firstRow="1" w:lastColumn="0" w:lastRow="0" w:noHBand="0" w:noVBand="1" w:val="04A0"/>
+        <w:tblInd w:w="120" w:type="dxa"/>
+        <w:tblCellMar>
+          <w:top w:w="80" w:type="dxa"/>
+          <w:bottom w:w="80" w:type="dxa"/>
+          <w:start w:w="120" w:type="dxa"/>
+          <w:end w:w="120" w:type="dxa"/>
+        </w:tblCellMar>
+      </w:tblPr>
+      <w:tblGrid>
+        <w:gridCol w:w="2300"/>
+        <w:gridCol w:w="7060"/>
+      </w:tblGrid>
+      <w:tr>
+        <w:tc>
+          <w:tcPr>
+            <w:tcW w:type="dxa" w:w="2300"/>
+            <w:vAlign w:val="center"/>
+            <w:shd w:fill="E8EEF5"/>
+          </w:tcPr>
+          <w:p>
+            <w:r/>
             <w:r>
-              <w:t xml:space="preserve">  元データを潰さない row-level Excel/TSV を中心データとして保存し、目的に応じて複数の図表を出力する方針とする。</w:t>
+              <w:rPr>
+                <w:rFonts w:ascii="Yu Gothic" w:hAnsi="Yu Gothic" w:eastAsia="Yu Gothic"/>
+                <w:b/>
+              </w:rPr>
+              <w:t>項目</w:t>
+            </w:r>
+          </w:p>
+        </w:tc>
+        <w:tc>
+          <w:tcPr>
+            <w:tcW w:type="dxa" w:w="7060"/>
+            <w:vAlign w:val="center"/>
+            <w:shd w:fill="E8EEF5"/>
+          </w:tcPr>
+          <w:p>
+            <w:r/>
+            <w:r>
+              <w:rPr>
+                <w:rFonts w:ascii="Yu Gothic" w:hAnsi="Yu Gothic" w:eastAsia="Yu Gothic"/>
+                <w:b/>
+              </w:rPr>
+              <w:t>仕様</w:t>
+            </w:r>
+          </w:p>
+        </w:tc>
+      </w:tr>
+      <w:tr>
+        <w:tc>
+          <w:tcPr>
+            <w:tcW w:type="dxa" w:w="2300"/>
+          </w:tcPr>
+          <w:p>
+            <w:pPr>
+              <w:spacing w:after="0"/>
+            </w:pPr>
+            <w:r/>
+            <w:r>
+              <w:rPr>
+                <w:rFonts w:ascii="Yu Gothic" w:hAnsi="Yu Gothic" w:eastAsia="Yu Gothic"/>
+              </w:rPr>
+              <w:t>入力</w:t>
+            </w:r>
+          </w:p>
+        </w:tc>
+        <w:tc>
+          <w:tcPr>
+            <w:tcW w:type="dxa" w:w="7060"/>
+          </w:tcPr>
+          <w:p>
+            <w:pPr>
+              <w:spacing w:after="0"/>
+            </w:pPr>
+            <w:r/>
+            <w:r>
+              <w:rPr>
+                <w:rFonts w:ascii="Yu Gothic" w:hAnsi="Yu Gothic" w:eastAsia="Yu Gothic"/>
+              </w:rPr>
+              <w:t>pGen-SHM仕様書の採用フィルタを通過したAIRR行。</w:t>
+            </w:r>
+          </w:p>
+        </w:tc>
+      </w:tr>
+      <w:tr>
+        <w:tc>
+          <w:tcPr>
+            <w:tcW w:type="dxa" w:w="2300"/>
+          </w:tcPr>
+          <w:p>
+            <w:pPr>
+              <w:spacing w:after="0"/>
+            </w:pPr>
+            <w:r/>
+            <w:r>
+              <w:rPr>
+                <w:rFonts w:ascii="Yu Gothic" w:hAnsi="Yu Gothic" w:eastAsia="Yu Gothic"/>
+              </w:rPr>
+              <w:t>必須列</w:t>
+            </w:r>
+          </w:p>
+        </w:tc>
+        <w:tc>
+          <w:tcPr>
+            <w:tcW w:type="dxa" w:w="7060"/>
+          </w:tcPr>
+          <w:p>
+            <w:pPr>
+              <w:spacing w:after="0"/>
+            </w:pPr>
+            <w:r/>
+            <w:r>
+              <w:rPr>
+                <w:rFonts w:ascii="Yu Gothic" w:hAnsi="Yu Gothic" w:eastAsia="Yu Gothic"/>
+              </w:rPr>
+              <w:t>v_identity。数値として読めない行は除外する。</w:t>
+            </w:r>
+          </w:p>
+        </w:tc>
+      </w:tr>
+      <w:tr>
+        <w:tc>
+          <w:tcPr>
+            <w:tcW w:type="dxa" w:w="2300"/>
+          </w:tcPr>
+          <w:p>
+            <w:pPr>
+              <w:spacing w:after="0"/>
+            </w:pPr>
+            <w:r/>
+            <w:r>
+              <w:rPr>
+                <w:rFonts w:ascii="Yu Gothic" w:hAnsi="Yu Gothic" w:eastAsia="Yu Gothic"/>
+              </w:rPr>
+              <w:t>参考列</w:t>
+            </w:r>
+          </w:p>
+        </w:tc>
+        <w:tc>
+          <w:tcPr>
+            <w:tcW w:type="dxa" w:w="7060"/>
+          </w:tcPr>
+          <w:p>
+            <w:pPr>
+              <w:spacing w:after="0"/>
+            </w:pPr>
+            <w:r/>
+            <w:r>
+              <w:rPr>
+                <w:rFonts w:ascii="Yu Gothic" w:hAnsi="Yu Gothic" w:eastAsia="Yu Gothic"/>
+              </w:rPr>
+              <w:t>sequence_id, junction, junction_aa, v_call, j_call, locus, productive。row-level表に残す。</w:t>
+            </w:r>
+          </w:p>
+        </w:tc>
+      </w:tr>
+      <w:tr>
+        <w:tc>
+          <w:tcPr>
+            <w:tcW w:type="dxa" w:w="2300"/>
+          </w:tcPr>
+          <w:p>
+            <w:pPr>
+              <w:spacing w:after="0"/>
+            </w:pPr>
+            <w:r/>
+            <w:r>
+              <w:rPr>
+                <w:rFonts w:ascii="Yu Gothic" w:hAnsi="Yu Gothic" w:eastAsia="Yu Gothic"/>
+              </w:rPr>
+              <w:t>V alignment length列</w:t>
+            </w:r>
+          </w:p>
+        </w:tc>
+        <w:tc>
+          <w:tcPr>
+            <w:tcW w:type="dxa" w:w="7060"/>
+          </w:tcPr>
+          <w:p>
+            <w:pPr>
+              <w:spacing w:after="0"/>
+            </w:pPr>
+            <w:r/>
+            <w:r>
+              <w:rPr>
+                <w:rFonts w:ascii="Yu Gothic" w:hAnsi="Yu Gothic" w:eastAsia="Yu Gothic"/>
+              </w:rPr>
+              <w:t>v_sequence_alignment、またはv_alignment_start/v_alignment_endがあれば長さを算出する。</w:t>
+            </w:r>
+          </w:p>
+        </w:tc>
+      </w:tr>
+      <w:tr>
+        <w:tc>
+          <w:tcPr>
+            <w:tcW w:type="dxa" w:w="2300"/>
+          </w:tcPr>
+          <w:p>
+            <w:pPr>
+              <w:spacing w:after="0"/>
+            </w:pPr>
+            <w:r/>
+            <w:r>
+              <w:rPr>
+                <w:rFonts w:ascii="Yu Gothic" w:hAnsi="Yu Gothic" w:eastAsia="Yu Gothic"/>
+              </w:rPr>
+              <w:t>Min V alignment length</w:t>
+            </w:r>
+          </w:p>
+        </w:tc>
+        <w:tc>
+          <w:tcPr>
+            <w:tcW w:type="dxa" w:w="7060"/>
+          </w:tcPr>
+          <w:p>
+            <w:pPr>
+              <w:spacing w:after="0"/>
+            </w:pPr>
+            <w:r/>
+            <w:r>
+              <w:rPr>
+                <w:rFonts w:ascii="Yu Gothic" w:hAnsi="Yu Gothic" w:eastAsia="Yu Gothic"/>
+              </w:rPr>
+              <w:t>デフォルト0では除外しない。0より大きい値を指定した場合だけ短いalignmentを除外する。</w:t>
             </w:r>
           </w:p>
         </w:tc>
@@ -77,71 +344,78 @@
         <w:pStyle w:val="Heading1"/>
       </w:pPr>
       <w:r>
-        <w:t>1. 目的と位置づけ</w:t>
-      </w:r>
-    </w:p>
-    <w:p>
-      <w:r>
-        <w:t>本書は、AIRR TSVからV領域のSHM(%Mutation)を計算し、row-levelの中間データおよびSHM分布図を作成する仕様をまとめる。SHMはpGen-SHM plotのy軸に使うため、ここでの計算単位とフィルタを明確にしておく。</w:t>
+        <w:t>3. SHM計算式</w:t>
       </w:r>
     </w:p>
     <w:tbl>
       <w:tblPr>
         <w:tblStyle w:val="TableGrid"/>
         <w:tblW w:type="dxa" w:w="9360"/>
+        <w:jc w:val="left"/>
         <w:tblLayout w:type="fixed"/>
         <w:tblLook w:firstColumn="1" w:firstRow="1" w:lastColumn="0" w:lastRow="0" w:noHBand="0" w:noVBand="1" w:val="04A0"/>
         <w:tblInd w:w="120" w:type="dxa"/>
         <w:tblCellMar>
           <w:top w:w="80" w:type="dxa"/>
+          <w:bottom w:w="80" w:type="dxa"/>
           <w:start w:w="120" w:type="dxa"/>
-          <w:bottom w:w="80" w:type="dxa"/>
           <w:end w:w="120" w:type="dxa"/>
         </w:tblCellMar>
       </w:tblPr>
       <w:tblGrid>
-        <w:gridCol w:w="1900"/>
-        <w:gridCol w:w="7460"/>
+        <w:gridCol w:w="2800"/>
+        <w:gridCol w:w="2500"/>
+        <w:gridCol w:w="4060"/>
       </w:tblGrid>
       <w:tr>
-        <w:trPr>
-          <w:tblHeader w:val="true"/>
-        </w:trPr>
         <w:tc>
           <w:tcPr>
-            <w:tcW w:type="dxa" w:w="1900"/>
+            <w:tcW w:type="dxa" w:w="2800"/>
             <w:vAlign w:val="center"/>
             <w:shd w:fill="E8EEF5"/>
           </w:tcPr>
           <w:p>
-            <w:pPr>
-              <w:jc w:val="center"/>
-            </w:pPr>
+            <w:r/>
             <w:r>
               <w:rPr>
+                <w:rFonts w:ascii="Yu Gothic" w:hAnsi="Yu Gothic" w:eastAsia="Yu Gothic"/>
                 <w:b/>
-                <w:color w:val="0B2545"/>
               </w:rPr>
-              <w:t>項目</w:t>
+              <w:t>v_identityの形式</w:t>
             </w:r>
           </w:p>
         </w:tc>
         <w:tc>
           <w:tcPr>
-            <w:tcW w:type="dxa" w:w="7460"/>
+            <w:tcW w:type="dxa" w:w="2500"/>
             <w:vAlign w:val="center"/>
             <w:shd w:fill="E8EEF5"/>
           </w:tcPr>
           <w:p>
-            <w:pPr>
-              <w:jc w:val="center"/>
-            </w:pPr>
+            <w:r/>
             <w:r>
               <w:rPr>
+                <w:rFonts w:ascii="Yu Gothic" w:hAnsi="Yu Gothic" w:eastAsia="Yu Gothic"/>
                 <w:b/>
-                <w:color w:val="0B2545"/>
               </w:rPr>
-              <w:t>仕様</w:t>
+              <w:t>判定</w:t>
+            </w:r>
+          </w:p>
+        </w:tc>
+        <w:tc>
+          <w:tcPr>
+            <w:tcW w:type="dxa" w:w="4060"/>
+            <w:vAlign w:val="center"/>
+            <w:shd w:fill="E8EEF5"/>
+          </w:tcPr>
+          <w:p>
+            <w:r/>
+            <w:r>
+              <w:rPr>
+                <w:rFonts w:ascii="Yu Gothic" w:hAnsi="Yu Gothic" w:eastAsia="Yu Gothic"/>
+                <w:b/>
+              </w:rPr>
+              <w:t>SHM計算式</w:t>
             </w:r>
           </w:p>
         </w:tc>
@@ -149,27 +423,52 @@
       <w:tr>
         <w:tc>
           <w:tcPr>
-            <w:tcW w:type="dxa" w:w="1900"/>
+            <w:tcW w:type="dxa" w:w="2800"/>
           </w:tcPr>
           <w:p>
             <w:pPr>
-              <w:spacing w:after="40"/>
+              <w:spacing w:after="0"/>
             </w:pPr>
+            <w:r/>
             <w:r>
-              <w:t>入力</w:t>
+              <w:rPr>
+                <w:rFonts w:ascii="Yu Gothic" w:hAnsi="Yu Gothic" w:eastAsia="Yu Gothic"/>
+              </w:rPr>
+              <w:t>0から1程度の小数</w:t>
             </w:r>
           </w:p>
         </w:tc>
         <w:tc>
           <w:tcPr>
-            <w:tcW w:type="dxa" w:w="7460"/>
+            <w:tcW w:type="dxa" w:w="2500"/>
           </w:tcPr>
           <w:p>
             <w:pPr>
-              <w:spacing w:after="40"/>
+              <w:spacing w:after="0"/>
             </w:pPr>
+            <w:r/>
             <w:r>
-              <w:t>IgBLAST -outfmt 19 のAIRR TSV。FASTAは前段GUIでAIRR TSVへ変換済みであること。</w:t>
+              <w:rPr>
+                <w:rFonts w:ascii="Yu Gothic" w:hAnsi="Yu Gothic" w:eastAsia="Yu Gothic"/>
+              </w:rPr>
+              <w:t>v_identity &lt;= 1.2</w:t>
+            </w:r>
+          </w:p>
+        </w:tc>
+        <w:tc>
+          <w:tcPr>
+            <w:tcW w:type="dxa" w:w="4060"/>
+          </w:tcPr>
+          <w:p>
+            <w:pPr>
+              <w:spacing w:after="0"/>
+            </w:pPr>
+            <w:r/>
+            <w:r>
+              <w:rPr>
+                <w:rFonts w:ascii="Yu Gothic" w:hAnsi="Yu Gothic" w:eastAsia="Yu Gothic"/>
+              </w:rPr>
+              <w:t>(1 - v_identity) x 100</w:t>
             </w:r>
           </w:p>
         </w:tc>
@@ -177,27 +476,52 @@
       <w:tr>
         <w:tc>
           <w:tcPr>
-            <w:tcW w:type="dxa" w:w="1900"/>
+            <w:tcW w:type="dxa" w:w="2800"/>
           </w:tcPr>
           <w:p>
             <w:pPr>
-              <w:spacing w:after="40"/>
+              <w:spacing w:after="0"/>
             </w:pPr>
+            <w:r/>
             <w:r>
-              <w:t>主な列</w:t>
+              <w:rPr>
+                <w:rFonts w:ascii="Yu Gothic" w:hAnsi="Yu Gothic" w:eastAsia="Yu Gothic"/>
+              </w:rPr>
+              <w:t>0から100程度の百分率</w:t>
             </w:r>
           </w:p>
         </w:tc>
         <w:tc>
           <w:tcPr>
-            <w:tcW w:type="dxa" w:w="7460"/>
+            <w:tcW w:type="dxa" w:w="2500"/>
           </w:tcPr>
           <w:p>
             <w:pPr>
-              <w:spacing w:after="40"/>
+              <w:spacing w:after="0"/>
             </w:pPr>
+            <w:r/>
             <w:r>
-              <w:t>sequence_id, productive, locus, junction, junction_aa, v_identity, v_call, j_call, v_sequence_alignment等。</w:t>
+              <w:rPr>
+                <w:rFonts w:ascii="Yu Gothic" w:hAnsi="Yu Gothic" w:eastAsia="Yu Gothic"/>
+              </w:rPr>
+              <w:t>v_identity &gt; 1.2</w:t>
+            </w:r>
+          </w:p>
+        </w:tc>
+        <w:tc>
+          <w:tcPr>
+            <w:tcW w:type="dxa" w:w="4060"/>
+          </w:tcPr>
+          <w:p>
+            <w:pPr>
+              <w:spacing w:after="0"/>
+            </w:pPr>
+            <w:r/>
+            <w:r>
+              <w:rPr>
+                <w:rFonts w:ascii="Yu Gothic" w:hAnsi="Yu Gothic" w:eastAsia="Yu Gothic"/>
+              </w:rPr>
+              <w:t>100 - v_identity</w:t>
             </w:r>
           </w:p>
         </w:tc>
@@ -205,27 +529,140 @@
       <w:tr>
         <w:tc>
           <w:tcPr>
-            <w:tcW w:type="dxa" w:w="1900"/>
+            <w:tcW w:type="dxa" w:w="2800"/>
           </w:tcPr>
           <w:p>
             <w:pPr>
-              <w:spacing w:after="40"/>
+              <w:spacing w:after="0"/>
             </w:pPr>
+            <w:r/>
             <w:r>
-              <w:t>主解析単位</w:t>
+              <w:rPr>
+                <w:rFonts w:ascii="Yu Gothic" w:hAnsi="Yu Gothic" w:eastAsia="Yu Gothic"/>
+              </w:rPr>
+              <w:t>計算後に負値</w:t>
             </w:r>
           </w:p>
         </w:tc>
         <w:tc>
           <w:tcPr>
-            <w:tcW w:type="dxa" w:w="7460"/>
+            <w:tcW w:type="dxa" w:w="2500"/>
           </w:tcPr>
           <w:p>
             <w:pPr>
-              <w:spacing w:after="40"/>
+              <w:spacing w:after="0"/>
             </w:pPr>
+            <w:r/>
             <w:r>
-              <w:t>フィルタ後のAIRR 1行、すなわち原則として1つのsequence_id。</w:t>
+              <w:rPr>
+                <w:rFonts w:ascii="Yu Gothic" w:hAnsi="Yu Gothic" w:eastAsia="Yu Gothic"/>
+              </w:rPr>
+              <w:t>負値は0に補正</w:t>
+            </w:r>
+          </w:p>
+        </w:tc>
+        <w:tc>
+          <w:tcPr>
+            <w:tcW w:type="dxa" w:w="4060"/>
+          </w:tcPr>
+          <w:p>
+            <w:pPr>
+              <w:spacing w:after="0"/>
+            </w:pPr>
+            <w:r/>
+            <w:r>
+              <w:rPr>
+                <w:rFonts w:ascii="Yu Gothic" w:hAnsi="Yu Gothic" w:eastAsia="Yu Gothic"/>
+              </w:rPr>
+              <w:t>max(0, SHM)</w:t>
+            </w:r>
+          </w:p>
+        </w:tc>
+      </w:tr>
+    </w:tbl>
+    <w:p/>
+    <w:p>
+      <w:r>
+        <w:t>例: v_identity=0.985ならSHM=1.5%。v_identity=98.5ならSHM=1.5%。IgBLAST AIRR TSVの出力形式差を吸収するため、この2形式に対応する。</w:t>
+      </w:r>
+    </w:p>
+    <w:p>
+      <w:pPr>
+        <w:pStyle w:val="Heading1"/>
+      </w:pPr>
+      <w:r>
+        <w:t>4. V alignment length</w:t>
+      </w:r>
+    </w:p>
+    <w:tbl>
+      <w:tblPr>
+        <w:tblStyle w:val="TableGrid"/>
+        <w:tblW w:type="dxa" w:w="9360"/>
+        <w:jc w:val="left"/>
+        <w:tblLayout w:type="fixed"/>
+        <w:tblLook w:firstColumn="1" w:firstRow="1" w:lastColumn="0" w:lastRow="0" w:noHBand="0" w:noVBand="1" w:val="04A0"/>
+        <w:tblInd w:w="120" w:type="dxa"/>
+        <w:tblCellMar>
+          <w:top w:w="80" w:type="dxa"/>
+          <w:bottom w:w="80" w:type="dxa"/>
+          <w:start w:w="120" w:type="dxa"/>
+          <w:end w:w="120" w:type="dxa"/>
+        </w:tblCellMar>
+      </w:tblPr>
+      <w:tblGrid>
+        <w:gridCol w:w="2800"/>
+        <w:gridCol w:w="3300"/>
+        <w:gridCol w:w="3260"/>
+      </w:tblGrid>
+      <w:tr>
+        <w:tc>
+          <w:tcPr>
+            <w:tcW w:type="dxa" w:w="2800"/>
+            <w:vAlign w:val="center"/>
+            <w:shd w:fill="E8EEF5"/>
+          </w:tcPr>
+          <w:p>
+            <w:r/>
+            <w:r>
+              <w:rPr>
+                <w:rFonts w:ascii="Yu Gothic" w:hAnsi="Yu Gothic" w:eastAsia="Yu Gothic"/>
+                <w:b/>
+              </w:rPr>
+              <w:t>入力列</w:t>
+            </w:r>
+          </w:p>
+        </w:tc>
+        <w:tc>
+          <w:tcPr>
+            <w:tcW w:type="dxa" w:w="3300"/>
+            <w:vAlign w:val="center"/>
+            <w:shd w:fill="E8EEF5"/>
+          </w:tcPr>
+          <w:p>
+            <w:r/>
+            <w:r>
+              <w:rPr>
+                <w:rFonts w:ascii="Yu Gothic" w:hAnsi="Yu Gothic" w:eastAsia="Yu Gothic"/>
+                <w:b/>
+              </w:rPr>
+              <w:t>長さの計算</w:t>
+            </w:r>
+          </w:p>
+        </w:tc>
+        <w:tc>
+          <w:tcPr>
+            <w:tcW w:type="dxa" w:w="3260"/>
+            <w:vAlign w:val="center"/>
+            <w:shd w:fill="E8EEF5"/>
+          </w:tcPr>
+          <w:p>
+            <w:r/>
+            <w:r>
+              <w:rPr>
+                <w:rFonts w:ascii="Yu Gothic" w:hAnsi="Yu Gothic" w:eastAsia="Yu Gothic"/>
+                <w:b/>
+              </w:rPr>
+              <w:t>用途</w:t>
             </w:r>
           </w:p>
         </w:tc>
@@ -233,27 +670,52 @@
       <w:tr>
         <w:tc>
           <w:tcPr>
-            <w:tcW w:type="dxa" w:w="1900"/>
+            <w:tcW w:type="dxa" w:w="2800"/>
           </w:tcPr>
           <w:p>
             <w:pPr>
-              <w:spacing w:after="40"/>
+              <w:spacing w:after="0"/>
             </w:pPr>
+            <w:r/>
             <w:r>
-              <w:t>SHM計算</w:t>
+              <w:rPr>
+                <w:rFonts w:ascii="Yu Gothic" w:hAnsi="Yu Gothic" w:eastAsia="Yu Gothic"/>
+              </w:rPr>
+              <w:t>v_sequence_alignment</w:t>
             </w:r>
           </w:p>
         </w:tc>
         <w:tc>
           <w:tcPr>
-            <w:tcW w:type="dxa" w:w="7460"/>
+            <w:tcW w:type="dxa" w:w="3300"/>
           </w:tcPr>
           <w:p>
             <w:pPr>
-              <w:spacing w:after="40"/>
+              <w:spacing w:after="0"/>
             </w:pPr>
+            <w:r/>
             <w:r>
-              <w:t>v_identityが0-100スケールなら 100 - v_identity、0-1スケールなら (1 - v_identity) * 100。</w:t>
+              <w:rPr>
+                <w:rFonts w:ascii="Yu Gothic" w:hAnsi="Yu Gothic" w:eastAsia="Yu Gothic"/>
+              </w:rPr>
+              <w:t>ギャップ、ドット、空白を除いた文字数。</w:t>
+            </w:r>
+          </w:p>
+        </w:tc>
+        <w:tc>
+          <w:tcPr>
+            <w:tcW w:type="dxa" w:w="3260"/>
+          </w:tcPr>
+          <w:p>
+            <w:pPr>
+              <w:spacing w:after="0"/>
+            </w:pPr>
+            <w:r/>
+            <w:r>
+              <w:rPr>
+                <w:rFonts w:ascii="Yu Gothic" w:hAnsi="Yu Gothic" w:eastAsia="Yu Gothic"/>
+              </w:rPr>
+              <w:t>優先して使用する。</w:t>
             </w:r>
           </w:p>
         </w:tc>
@@ -261,27 +723,391 @@
       <w:tr>
         <w:tc>
           <w:tcPr>
-            <w:tcW w:type="dxa" w:w="1900"/>
+            <w:tcW w:type="dxa" w:w="2800"/>
           </w:tcPr>
           <w:p>
             <w:pPr>
-              <w:spacing w:after="40"/>
+              <w:spacing w:after="0"/>
             </w:pPr>
+            <w:r/>
             <w:r>
-              <w:t>出力先</w:t>
+              <w:rPr>
+                <w:rFonts w:ascii="Yu Gothic" w:hAnsi="Yu Gothic" w:eastAsia="Yu Gothic"/>
+              </w:rPr>
+              <w:t>v_alignment_start + v_alignment_end</w:t>
             </w:r>
           </w:p>
         </w:tc>
         <w:tc>
           <w:tcPr>
-            <w:tcW w:type="dxa" w:w="7460"/>
+            <w:tcW w:type="dxa" w:w="3300"/>
           </w:tcPr>
           <w:p>
             <w:pPr>
-              <w:spacing w:after="40"/>
+              <w:spacing w:after="0"/>
             </w:pPr>
+            <w:r/>
             <w:r>
-              <w:t>row-level Excel/TSV、SHM histogram、weighted SHM histogram、QC summary。</w:t>
+              <w:rPr>
+                <w:rFonts w:ascii="Yu Gothic" w:hAnsi="Yu Gothic" w:eastAsia="Yu Gothic"/>
+              </w:rPr>
+              <w:t>end - start + 1。</w:t>
+            </w:r>
+          </w:p>
+        </w:tc>
+        <w:tc>
+          <w:tcPr>
+            <w:tcW w:type="dxa" w:w="3260"/>
+          </w:tcPr>
+          <w:p>
+            <w:pPr>
+              <w:spacing w:after="0"/>
+            </w:pPr>
+            <w:r/>
+            <w:r>
+              <w:rPr>
+                <w:rFonts w:ascii="Yu Gothic" w:hAnsi="Yu Gothic" w:eastAsia="Yu Gothic"/>
+              </w:rPr>
+              <w:t>v_sequence_alignmentがない場合の代替。</w:t>
+            </w:r>
+          </w:p>
+        </w:tc>
+      </w:tr>
+      <w:tr>
+        <w:tc>
+          <w:tcPr>
+            <w:tcW w:type="dxa" w:w="2800"/>
+          </w:tcPr>
+          <w:p>
+            <w:pPr>
+              <w:spacing w:after="0"/>
+            </w:pPr>
+            <w:r/>
+            <w:r>
+              <w:rPr>
+                <w:rFonts w:ascii="Yu Gothic" w:hAnsi="Yu Gothic" w:eastAsia="Yu Gothic"/>
+              </w:rPr>
+              <w:t>列なし</w:t>
+            </w:r>
+          </w:p>
+        </w:tc>
+        <w:tc>
+          <w:tcPr>
+            <w:tcW w:type="dxa" w:w="3300"/>
+          </w:tcPr>
+          <w:p>
+            <w:pPr>
+              <w:spacing w:after="0"/>
+            </w:pPr>
+            <w:r/>
+            <w:r>
+              <w:rPr>
+                <w:rFonts w:ascii="Yu Gothic" w:hAnsi="Yu Gothic" w:eastAsia="Yu Gothic"/>
+              </w:rPr>
+              <w:t>0として扱う。</w:t>
+            </w:r>
+          </w:p>
+        </w:tc>
+        <w:tc>
+          <w:tcPr>
+            <w:tcW w:type="dxa" w:w="3260"/>
+          </w:tcPr>
+          <w:p>
+            <w:pPr>
+              <w:spacing w:after="0"/>
+            </w:pPr>
+            <w:r/>
+            <w:r>
+              <w:rPr>
+                <w:rFonts w:ascii="Yu Gothic" w:hAnsi="Yu Gothic" w:eastAsia="Yu Gothic"/>
+              </w:rPr>
+              <w:t>Min V alignment lengthが0なら許容。0より大きい指定時はエラー。</w:t>
+            </w:r>
+          </w:p>
+        </w:tc>
+      </w:tr>
+    </w:tbl>
+    <w:p/>
+    <w:p>
+      <w:r>
+        <w:t>V alignmentが短いreadではSHM推定が不安定になる可能性がある。ただし現行既定では除外せず、QCやv_seq_len_medianで後から判断できるようにする。</w:t>
+      </w:r>
+    </w:p>
+    <w:p>
+      <w:pPr>
+        <w:pStyle w:val="Heading1"/>
+      </w:pPr>
+      <w:r>
+        <w:t>5. row-level SHM保持</w:t>
+      </w:r>
+    </w:p>
+    <w:tbl>
+      <w:tblPr>
+        <w:tblStyle w:val="TableGrid"/>
+        <w:tblW w:type="dxa" w:w="9360"/>
+        <w:jc w:val="left"/>
+        <w:tblLayout w:type="fixed"/>
+        <w:tblLook w:firstColumn="1" w:firstRow="1" w:lastColumn="0" w:lastRow="0" w:noHBand="0" w:noVBand="1" w:val="04A0"/>
+        <w:tblInd w:w="120" w:type="dxa"/>
+        <w:tblCellMar>
+          <w:top w:w="80" w:type="dxa"/>
+          <w:bottom w:w="80" w:type="dxa"/>
+          <w:start w:w="120" w:type="dxa"/>
+          <w:end w:w="120" w:type="dxa"/>
+        </w:tblCellMar>
+      </w:tblPr>
+      <w:tblGrid>
+        <w:gridCol w:w="2500"/>
+        <w:gridCol w:w="6860"/>
+      </w:tblGrid>
+      <w:tr>
+        <w:tc>
+          <w:tcPr>
+            <w:tcW w:type="dxa" w:w="2500"/>
+            <w:vAlign w:val="center"/>
+            <w:shd w:fill="E8EEF5"/>
+          </w:tcPr>
+          <w:p>
+            <w:r/>
+            <w:r>
+              <w:rPr>
+                <w:rFonts w:ascii="Yu Gothic" w:hAnsi="Yu Gothic" w:eastAsia="Yu Gothic"/>
+                <w:b/>
+              </w:rPr>
+              <w:t>列</w:t>
+            </w:r>
+          </w:p>
+        </w:tc>
+        <w:tc>
+          <w:tcPr>
+            <w:tcW w:type="dxa" w:w="6860"/>
+            <w:vAlign w:val="center"/>
+            <w:shd w:fill="E8EEF5"/>
+          </w:tcPr>
+          <w:p>
+            <w:r/>
+            <w:r>
+              <w:rPr>
+                <w:rFonts w:ascii="Yu Gothic" w:hAnsi="Yu Gothic" w:eastAsia="Yu Gothic"/>
+                <w:b/>
+              </w:rPr>
+              <w:t>意味</w:t>
+            </w:r>
+          </w:p>
+        </w:tc>
+      </w:tr>
+      <w:tr>
+        <w:tc>
+          <w:tcPr>
+            <w:tcW w:type="dxa" w:w="2500"/>
+          </w:tcPr>
+          <w:p>
+            <w:pPr>
+              <w:spacing w:after="0"/>
+            </w:pPr>
+            <w:r/>
+            <w:r>
+              <w:rPr>
+                <w:rFonts w:ascii="Yu Gothic" w:hAnsi="Yu Gothic" w:eastAsia="Yu Gothic"/>
+              </w:rPr>
+              <w:t>sequence_id</w:t>
+            </w:r>
+          </w:p>
+        </w:tc>
+        <w:tc>
+          <w:tcPr>
+            <w:tcW w:type="dxa" w:w="6860"/>
+          </w:tcPr>
+          <w:p>
+            <w:pPr>
+              <w:spacing w:after="0"/>
+            </w:pPr>
+            <w:r/>
+            <w:r>
+              <w:rPr>
+                <w:rFonts w:ascii="Yu Gothic" w:hAnsi="Yu Gothic" w:eastAsia="Yu Gothic"/>
+              </w:rPr>
+              <w:t>採用AIRR行のID。SHM保持単位。</w:t>
+            </w:r>
+          </w:p>
+        </w:tc>
+      </w:tr>
+      <w:tr>
+        <w:tc>
+          <w:tcPr>
+            <w:tcW w:type="dxa" w:w="2500"/>
+          </w:tcPr>
+          <w:p>
+            <w:pPr>
+              <w:spacing w:after="0"/>
+            </w:pPr>
+            <w:r/>
+            <w:r>
+              <w:rPr>
+                <w:rFonts w:ascii="Yu Gothic" w:hAnsi="Yu Gothic" w:eastAsia="Yu Gothic"/>
+              </w:rPr>
+              <w:t>junction_aa</w:t>
+            </w:r>
+          </w:p>
+        </w:tc>
+        <w:tc>
+          <w:tcPr>
+            <w:tcW w:type="dxa" w:w="6860"/>
+          </w:tcPr>
+          <w:p>
+            <w:pPr>
+              <w:spacing w:after="0"/>
+            </w:pPr>
+            <w:r/>
+            <w:r>
+              <w:rPr>
+                <w:rFonts w:ascii="Yu Gothic" w:hAnsi="Yu Gothic" w:eastAsia="Yu Gothic"/>
+              </w:rPr>
+              <w:t>pGen計算単位。同じjunction_aaでもSHMは別々に保持する。</w:t>
+            </w:r>
+          </w:p>
+        </w:tc>
+      </w:tr>
+      <w:tr>
+        <w:tc>
+          <w:tcPr>
+            <w:tcW w:type="dxa" w:w="2500"/>
+          </w:tcPr>
+          <w:p>
+            <w:pPr>
+              <w:spacing w:after="0"/>
+            </w:pPr>
+            <w:r/>
+            <w:r>
+              <w:rPr>
+                <w:rFonts w:ascii="Yu Gothic" w:hAnsi="Yu Gothic" w:eastAsia="Yu Gothic"/>
+              </w:rPr>
+              <w:t>junction</w:t>
+            </w:r>
+          </w:p>
+        </w:tc>
+        <w:tc>
+          <w:tcPr>
+            <w:tcW w:type="dxa" w:w="6860"/>
+          </w:tcPr>
+          <w:p>
+            <w:pPr>
+              <w:spacing w:after="0"/>
+            </w:pPr>
+            <w:r/>
+            <w:r>
+              <w:rPr>
+                <w:rFonts w:ascii="Yu Gothic" w:hAnsi="Yu Gothic" w:eastAsia="Yu Gothic"/>
+              </w:rPr>
+              <w:t>CDR3 nucleotide配列。Beta1互換出力のunique junction単位に使う。</w:t>
+            </w:r>
+          </w:p>
+        </w:tc>
+      </w:tr>
+      <w:tr>
+        <w:tc>
+          <w:tcPr>
+            <w:tcW w:type="dxa" w:w="2500"/>
+          </w:tcPr>
+          <w:p>
+            <w:pPr>
+              <w:spacing w:after="0"/>
+            </w:pPr>
+            <w:r/>
+            <w:r>
+              <w:rPr>
+                <w:rFonts w:ascii="Yu Gothic" w:hAnsi="Yu Gothic" w:eastAsia="Yu Gothic"/>
+              </w:rPr>
+              <w:t>v_identity</w:t>
+            </w:r>
+          </w:p>
+        </w:tc>
+        <w:tc>
+          <w:tcPr>
+            <w:tcW w:type="dxa" w:w="6860"/>
+          </w:tcPr>
+          <w:p>
+            <w:pPr>
+              <w:spacing w:after="0"/>
+            </w:pPr>
+            <w:r/>
+            <w:r>
+              <w:rPr>
+                <w:rFonts w:ascii="Yu Gothic" w:hAnsi="Yu Gothic" w:eastAsia="Yu Gothic"/>
+              </w:rPr>
+              <w:t>AIRR TSVの元値。再計算や検証のため残す。</w:t>
+            </w:r>
+          </w:p>
+        </w:tc>
+      </w:tr>
+      <w:tr>
+        <w:tc>
+          <w:tcPr>
+            <w:tcW w:type="dxa" w:w="2500"/>
+          </w:tcPr>
+          <w:p>
+            <w:pPr>
+              <w:spacing w:after="0"/>
+            </w:pPr>
+            <w:r/>
+            <w:r>
+              <w:rPr>
+                <w:rFonts w:ascii="Yu Gothic" w:hAnsi="Yu Gothic" w:eastAsia="Yu Gothic"/>
+              </w:rPr>
+              <w:t>shm</w:t>
+            </w:r>
+          </w:p>
+        </w:tc>
+        <w:tc>
+          <w:tcPr>
+            <w:tcW w:type="dxa" w:w="6860"/>
+          </w:tcPr>
+          <w:p>
+            <w:pPr>
+              <w:spacing w:after="0"/>
+            </w:pPr>
+            <w:r/>
+            <w:r>
+              <w:rPr>
+                <w:rFonts w:ascii="Yu Gothic" w:hAnsi="Yu Gothic" w:eastAsia="Yu Gothic"/>
+              </w:rPr>
+              <w:t>v_identityから計算した%Mutation。</w:t>
+            </w:r>
+          </w:p>
+        </w:tc>
+      </w:tr>
+      <w:tr>
+        <w:tc>
+          <w:tcPr>
+            <w:tcW w:type="dxa" w:w="2500"/>
+          </w:tcPr>
+          <w:p>
+            <w:pPr>
+              <w:spacing w:after="0"/>
+            </w:pPr>
+            <w:r/>
+            <w:r>
+              <w:rPr>
+                <w:rFonts w:ascii="Yu Gothic" w:hAnsi="Yu Gothic" w:eastAsia="Yu Gothic"/>
+              </w:rPr>
+              <w:t>same_xy_count</w:t>
+            </w:r>
+          </w:p>
+        </w:tc>
+        <w:tc>
+          <w:tcPr>
+            <w:tcW w:type="dxa" w:w="6860"/>
+          </w:tcPr>
+          <w:p>
+            <w:pPr>
+              <w:spacing w:after="0"/>
+            </w:pPr>
+            <w:r/>
+            <w:r>
+              <w:rPr>
+                <w:rFonts w:ascii="Yu Gothic" w:hAnsi="Yu Gothic" w:eastAsia="Yu Gothic"/>
+              </w:rPr>
+              <w:t>同じlog10_pgenとSHM座標を持つrow数。</w:t>
             </w:r>
           </w:p>
         </w:tc>
@@ -293,86 +1119,60 @@
         <w:pStyle w:val="Heading1"/>
       </w:pPr>
       <w:r>
-        <w:t>2. 採用フィルタ</w:t>
+        <w:t>6. SHM histogram</w:t>
       </w:r>
     </w:p>
     <w:tbl>
       <w:tblPr>
         <w:tblStyle w:val="TableGrid"/>
         <w:tblW w:type="dxa" w:w="9360"/>
+        <w:jc w:val="left"/>
         <w:tblLayout w:type="fixed"/>
         <w:tblLook w:firstColumn="1" w:firstRow="1" w:lastColumn="0" w:lastRow="0" w:noHBand="0" w:noVBand="1" w:val="04A0"/>
         <w:tblInd w:w="120" w:type="dxa"/>
         <w:tblCellMar>
           <w:top w:w="80" w:type="dxa"/>
+          <w:bottom w:w="80" w:type="dxa"/>
           <w:start w:w="120" w:type="dxa"/>
-          <w:bottom w:w="80" w:type="dxa"/>
           <w:end w:w="120" w:type="dxa"/>
         </w:tblCellMar>
       </w:tblPr>
       <w:tblGrid>
-        <w:gridCol w:w="1600"/>
-        <w:gridCol w:w="3600"/>
-        <w:gridCol w:w="4160"/>
+        <w:gridCol w:w="2500"/>
+        <w:gridCol w:w="6860"/>
       </w:tblGrid>
       <w:tr>
-        <w:trPr>
-          <w:tblHeader w:val="true"/>
-        </w:trPr>
         <w:tc>
           <w:tcPr>
-            <w:tcW w:type="dxa" w:w="1600"/>
+            <w:tcW w:type="dxa" w:w="2500"/>
             <w:vAlign w:val="center"/>
             <w:shd w:fill="E8EEF5"/>
           </w:tcPr>
           <w:p>
-            <w:pPr>
-              <w:jc w:val="center"/>
-            </w:pPr>
+            <w:r/>
             <w:r>
               <w:rPr>
+                <w:rFonts w:ascii="Yu Gothic" w:hAnsi="Yu Gothic" w:eastAsia="Yu Gothic"/>
                 <w:b/>
-                <w:color w:val="0B2545"/>
               </w:rPr>
-              <w:t>フィルタ</w:t>
+              <w:t>bin</w:t>
             </w:r>
           </w:p>
         </w:tc>
         <w:tc>
           <w:tcPr>
-            <w:tcW w:type="dxa" w:w="3600"/>
+            <w:tcW w:type="dxa" w:w="6860"/>
             <w:vAlign w:val="center"/>
             <w:shd w:fill="E8EEF5"/>
           </w:tcPr>
           <w:p>
-            <w:pPr>
-              <w:jc w:val="center"/>
-            </w:pPr>
+            <w:r/>
             <w:r>
               <w:rPr>
+                <w:rFonts w:ascii="Yu Gothic" w:hAnsi="Yu Gothic" w:eastAsia="Yu Gothic"/>
                 <w:b/>
-                <w:color w:val="0B2545"/>
               </w:rPr>
-              <w:t>採用条件</w:t>
-            </w:r>
-          </w:p>
-        </w:tc>
-        <w:tc>
-          <w:tcPr>
-            <w:tcW w:type="dxa" w:w="4160"/>
-            <w:vAlign w:val="center"/>
-            <w:shd w:fill="E8EEF5"/>
-          </w:tcPr>
-          <w:p>
-            <w:pPr>
-              <w:jc w:val="center"/>
-            </w:pPr>
-            <w:r>
-              <w:rPr>
-                <w:b/>
-                <w:color w:val="0B2545"/>
-              </w:rPr>
-              <w:t>意図</w:t>
+              <w:t>範囲</w:t>
             </w:r>
           </w:p>
         </w:tc>
@@ -380,40 +1180,35 @@
       <w:tr>
         <w:tc>
           <w:tcPr>
-            <w:tcW w:type="dxa" w:w="1600"/>
+            <w:tcW w:type="dxa" w:w="2500"/>
           </w:tcPr>
           <w:p>
             <w:pPr>
-              <w:spacing w:after="40"/>
+              <w:spacing w:after="0"/>
             </w:pPr>
+            <w:r/>
             <w:r>
-              <w:t>locus</w:t>
+              <w:rPr>
+                <w:rFonts w:ascii="Yu Gothic" w:hAnsi="Yu Gothic" w:eastAsia="Yu Gothic"/>
+              </w:rPr>
+              <w:t>0~2%</w:t>
             </w:r>
           </w:p>
         </w:tc>
         <w:tc>
           <w:tcPr>
-            <w:tcW w:type="dxa" w:w="3600"/>
+            <w:tcW w:type="dxa" w:w="6860"/>
           </w:tcPr>
           <w:p>
             <w:pPr>
-              <w:spacing w:after="40"/>
+              <w:spacing w:after="0"/>
             </w:pPr>
+            <w:r/>
             <w:r>
-              <w:t>基本はIGH。空欄locusは保持しQCに件数を記録。IGK/IGLは除外。</w:t>
-            </w:r>
-          </w:p>
-        </w:tc>
-        <w:tc>
-          <w:tcPr>
-            <w:tcW w:type="dxa" w:w="4160"/>
-          </w:tcPr>
-          <w:p>
-            <w:pPr>
-              <w:spacing w:after="40"/>
-            </w:pPr>
-            <w:r>
-              <w:t>OLGA human_B_heavyを使うため、IGHを前提にする。</w:t>
+              <w:rPr>
+                <w:rFonts w:ascii="Yu Gothic" w:hAnsi="Yu Gothic" w:eastAsia="Yu Gothic"/>
+              </w:rPr>
+              <w:t>0 &lt;= SHM &lt; 2</w:t>
             </w:r>
           </w:p>
         </w:tc>
@@ -421,40 +1216,35 @@
       <w:tr>
         <w:tc>
           <w:tcPr>
-            <w:tcW w:type="dxa" w:w="1600"/>
+            <w:tcW w:type="dxa" w:w="2500"/>
           </w:tcPr>
           <w:p>
             <w:pPr>
-              <w:spacing w:after="40"/>
+              <w:spacing w:after="0"/>
             </w:pPr>
+            <w:r/>
             <w:r>
-              <w:t>productive</w:t>
+              <w:rPr>
+                <w:rFonts w:ascii="Yu Gothic" w:hAnsi="Yu Gothic" w:eastAsia="Yu Gothic"/>
+              </w:rPr>
+              <w:t>2~4%</w:t>
             </w:r>
           </w:p>
         </w:tc>
         <w:tc>
           <w:tcPr>
-            <w:tcW w:type="dxa" w:w="3600"/>
+            <w:tcW w:type="dxa" w:w="6860"/>
           </w:tcPr>
           <w:p>
             <w:pPr>
-              <w:spacing w:after="40"/>
+              <w:spacing w:after="0"/>
             </w:pPr>
+            <w:r/>
             <w:r>
-              <w:t>productive == Tを採用。</w:t>
-            </w:r>
-          </w:p>
-        </w:tc>
-        <w:tc>
-          <w:tcPr>
-            <w:tcW w:type="dxa" w:w="4160"/>
-          </w:tcPr>
-          <w:p>
-            <w:pPr>
-              <w:spacing w:after="40"/>
-            </w:pPr>
-            <w:r>
-              <w:t>機能的なVDJ再構成を主対象にする。</w:t>
+              <w:rPr>
+                <w:rFonts w:ascii="Yu Gothic" w:hAnsi="Yu Gothic" w:eastAsia="Yu Gothic"/>
+              </w:rPr>
+              <w:t>2 &lt;= SHM &lt; 4</w:t>
             </w:r>
           </w:p>
         </w:tc>
@@ -462,40 +1252,35 @@
       <w:tr>
         <w:tc>
           <w:tcPr>
-            <w:tcW w:type="dxa" w:w="1600"/>
+            <w:tcW w:type="dxa" w:w="2500"/>
           </w:tcPr>
           <w:p>
             <w:pPr>
-              <w:spacing w:after="40"/>
+              <w:spacing w:after="0"/>
             </w:pPr>
+            <w:r/>
             <w:r>
-              <w:t>vj_in_frame</w:t>
+              <w:rPr>
+                <w:rFonts w:ascii="Yu Gothic" w:hAnsi="Yu Gothic" w:eastAsia="Yu Gothic"/>
+              </w:rPr>
+              <w:t>4~6%</w:t>
             </w:r>
           </w:p>
         </w:tc>
         <w:tc>
           <w:tcPr>
-            <w:tcW w:type="dxa" w:w="3600"/>
+            <w:tcW w:type="dxa" w:w="6860"/>
           </w:tcPr>
           <w:p>
             <w:pPr>
-              <w:spacing w:after="40"/>
+              <w:spacing w:after="0"/>
             </w:pPr>
+            <w:r/>
             <w:r>
-              <w:t>列がある場合はTを採用。</w:t>
-            </w:r>
-          </w:p>
-        </w:tc>
-        <w:tc>
-          <w:tcPr>
-            <w:tcW w:type="dxa" w:w="4160"/>
-          </w:tcPr>
-          <w:p>
-            <w:pPr>
-              <w:spacing w:after="40"/>
-            </w:pPr>
-            <w:r>
-              <w:t>フレーム外配列を除く。</w:t>
+              <w:rPr>
+                <w:rFonts w:ascii="Yu Gothic" w:hAnsi="Yu Gothic" w:eastAsia="Yu Gothic"/>
+              </w:rPr>
+              <w:t>4 &lt;= SHM &lt; 6</w:t>
             </w:r>
           </w:p>
         </w:tc>
@@ -503,40 +1288,35 @@
       <w:tr>
         <w:tc>
           <w:tcPr>
-            <w:tcW w:type="dxa" w:w="1600"/>
+            <w:tcW w:type="dxa" w:w="2500"/>
           </w:tcPr>
           <w:p>
             <w:pPr>
-              <w:spacing w:after="40"/>
+              <w:spacing w:after="0"/>
             </w:pPr>
+            <w:r/>
             <w:r>
-              <w:t>stop_codon</w:t>
+              <w:rPr>
+                <w:rFonts w:ascii="Yu Gothic" w:hAnsi="Yu Gothic" w:eastAsia="Yu Gothic"/>
+              </w:rPr>
+              <w:t>6~8%</w:t>
             </w:r>
           </w:p>
         </w:tc>
         <w:tc>
           <w:tcPr>
-            <w:tcW w:type="dxa" w:w="3600"/>
+            <w:tcW w:type="dxa" w:w="6860"/>
           </w:tcPr>
           <w:p>
             <w:pPr>
-              <w:spacing w:after="40"/>
+              <w:spacing w:after="0"/>
             </w:pPr>
+            <w:r/>
             <w:r>
-              <w:t>列がある場合はFを採用。</w:t>
-            </w:r>
-          </w:p>
-        </w:tc>
-        <w:tc>
-          <w:tcPr>
-            <w:tcW w:type="dxa" w:w="4160"/>
-          </w:tcPr>
-          <w:p>
-            <w:pPr>
-              <w:spacing w:after="40"/>
-            </w:pPr>
-            <w:r>
-              <w:t>停止コドンを含む配列を除く。</w:t>
+              <w:rPr>
+                <w:rFonts w:ascii="Yu Gothic" w:hAnsi="Yu Gothic" w:eastAsia="Yu Gothic"/>
+              </w:rPr>
+              <w:t>6 &lt;= SHM &lt; 8</w:t>
             </w:r>
           </w:p>
         </w:tc>
@@ -544,40 +1324,35 @@
       <w:tr>
         <w:tc>
           <w:tcPr>
-            <w:tcW w:type="dxa" w:w="1600"/>
+            <w:tcW w:type="dxa" w:w="2500"/>
           </w:tcPr>
           <w:p>
             <w:pPr>
-              <w:spacing w:after="40"/>
+              <w:spacing w:after="0"/>
             </w:pPr>
+            <w:r/>
             <w:r>
-              <w:t>junction</w:t>
+              <w:rPr>
+                <w:rFonts w:ascii="Yu Gothic" w:hAnsi="Yu Gothic" w:eastAsia="Yu Gothic"/>
+              </w:rPr>
+              <w:t>8~10%</w:t>
             </w:r>
           </w:p>
         </w:tc>
         <w:tc>
           <w:tcPr>
-            <w:tcW w:type="dxa" w:w="3600"/>
+            <w:tcW w:type="dxa" w:w="6860"/>
           </w:tcPr>
           <w:p>
             <w:pPr>
-              <w:spacing w:after="40"/>
+              <w:spacing w:after="0"/>
             </w:pPr>
+            <w:r/>
             <w:r>
-              <w:t>空でなく、A/C/G/Tのみ。Nや記号を含むものは除外。</w:t>
-            </w:r>
-          </w:p>
-        </w:tc>
-        <w:tc>
-          <w:tcPr>
-            <w:tcW w:type="dxa" w:w="4160"/>
-          </w:tcPr>
-          <w:p>
-            <w:pPr>
-              <w:spacing w:after="40"/>
-            </w:pPr>
-            <w:r>
-              <w:t>junction単位の集計とpGen連携を安定させる。</w:t>
+              <w:rPr>
+                <w:rFonts w:ascii="Yu Gothic" w:hAnsi="Yu Gothic" w:eastAsia="Yu Gothic"/>
+              </w:rPr>
+              <w:t>8 &lt;= SHM &lt; 10</w:t>
             </w:r>
           </w:p>
         </w:tc>
@@ -585,40 +1360,35 @@
       <w:tr>
         <w:tc>
           <w:tcPr>
-            <w:tcW w:type="dxa" w:w="1600"/>
+            <w:tcW w:type="dxa" w:w="2500"/>
           </w:tcPr>
           <w:p>
             <w:pPr>
-              <w:spacing w:after="40"/>
+              <w:spacing w:after="0"/>
             </w:pPr>
+            <w:r/>
             <w:r>
-              <w:t>junction_aa</w:t>
+              <w:rPr>
+                <w:rFonts w:ascii="Yu Gothic" w:hAnsi="Yu Gothic" w:eastAsia="Yu Gothic"/>
+              </w:rPr>
+              <w:t>10~12%</w:t>
             </w:r>
           </w:p>
         </w:tc>
         <w:tc>
           <w:tcPr>
-            <w:tcW w:type="dxa" w:w="3600"/>
+            <w:tcW w:type="dxa" w:w="6860"/>
           </w:tcPr>
           <w:p>
             <w:pPr>
-              <w:spacing w:after="40"/>
+              <w:spacing w:after="0"/>
             </w:pPr>
+            <w:r/>
             <w:r>
-              <w:t>空でなく、*やXを含まない英字。</w:t>
-            </w:r>
-          </w:p>
-        </w:tc>
-        <w:tc>
-          <w:tcPr>
-            <w:tcW w:type="dxa" w:w="4160"/>
-          </w:tcPr>
-          <w:p>
-            <w:pPr>
-              <w:spacing w:after="40"/>
-            </w:pPr>
-            <w:r>
-              <w:t>pGen計算に不適なCDR3 AAを除く。</w:t>
+              <w:rPr>
+                <w:rFonts w:ascii="Yu Gothic" w:hAnsi="Yu Gothic" w:eastAsia="Yu Gothic"/>
+              </w:rPr>
+              <w:t>10 &lt;= SHM &lt; 12</w:t>
             </w:r>
           </w:p>
         </w:tc>
@@ -626,40 +1396,308 @@
       <w:tr>
         <w:tc>
           <w:tcPr>
-            <w:tcW w:type="dxa" w:w="1600"/>
+            <w:tcW w:type="dxa" w:w="2500"/>
           </w:tcPr>
           <w:p>
             <w:pPr>
-              <w:spacing w:after="40"/>
+              <w:spacing w:after="0"/>
             </w:pPr>
+            <w:r/>
             <w:r>
-              <w:t>Min V alignment length</w:t>
+              <w:rPr>
+                <w:rFonts w:ascii="Yu Gothic" w:hAnsi="Yu Gothic" w:eastAsia="Yu Gothic"/>
+              </w:rPr>
+              <w:t>12~14%</w:t>
             </w:r>
           </w:p>
         </w:tc>
         <w:tc>
           <w:tcPr>
-            <w:tcW w:type="dxa" w:w="3600"/>
+            <w:tcW w:type="dxa" w:w="6860"/>
           </w:tcPr>
           <w:p>
             <w:pPr>
-              <w:spacing w:after="40"/>
+              <w:spacing w:after="0"/>
             </w:pPr>
+            <w:r/>
             <w:r>
-              <w:t>既定0。必要時のみ下限を設定。</w:t>
+              <w:rPr>
+                <w:rFonts w:ascii="Yu Gothic" w:hAnsi="Yu Gothic" w:eastAsia="Yu Gothic"/>
+              </w:rPr>
+              <w:t>12 &lt;= SHM &lt; 14</w:t>
+            </w:r>
+          </w:p>
+        </w:tc>
+      </w:tr>
+      <w:tr>
+        <w:tc>
+          <w:tcPr>
+            <w:tcW w:type="dxa" w:w="2500"/>
+          </w:tcPr>
+          <w:p>
+            <w:pPr>
+              <w:spacing w:after="0"/>
+            </w:pPr>
+            <w:r/>
+            <w:r>
+              <w:rPr>
+                <w:rFonts w:ascii="Yu Gothic" w:hAnsi="Yu Gothic" w:eastAsia="Yu Gothic"/>
+              </w:rPr>
+              <w:t>14~16%</w:t>
             </w:r>
           </w:p>
         </w:tc>
         <w:tc>
           <w:tcPr>
-            <w:tcW w:type="dxa" w:w="4160"/>
+            <w:tcW w:type="dxa" w:w="6860"/>
           </w:tcPr>
           <w:p>
             <w:pPr>
-              <w:spacing w:after="40"/>
+              <w:spacing w:after="0"/>
             </w:pPr>
+            <w:r/>
             <w:r>
-              <w:t>短いV alignment由来の不安定なSHMを除くための任意設定。</w:t>
+              <w:rPr>
+                <w:rFonts w:ascii="Yu Gothic" w:hAnsi="Yu Gothic" w:eastAsia="Yu Gothic"/>
+              </w:rPr>
+              <w:t>14 &lt;= SHM &lt; 16</w:t>
+            </w:r>
+          </w:p>
+        </w:tc>
+      </w:tr>
+      <w:tr>
+        <w:tc>
+          <w:tcPr>
+            <w:tcW w:type="dxa" w:w="2500"/>
+          </w:tcPr>
+          <w:p>
+            <w:pPr>
+              <w:spacing w:after="0"/>
+            </w:pPr>
+            <w:r/>
+            <w:r>
+              <w:rPr>
+                <w:rFonts w:ascii="Yu Gothic" w:hAnsi="Yu Gothic" w:eastAsia="Yu Gothic"/>
+              </w:rPr>
+              <w:t>16~18%</w:t>
+            </w:r>
+          </w:p>
+        </w:tc>
+        <w:tc>
+          <w:tcPr>
+            <w:tcW w:type="dxa" w:w="6860"/>
+          </w:tcPr>
+          <w:p>
+            <w:pPr>
+              <w:spacing w:after="0"/>
+            </w:pPr>
+            <w:r/>
+            <w:r>
+              <w:rPr>
+                <w:rFonts w:ascii="Yu Gothic" w:hAnsi="Yu Gothic" w:eastAsia="Yu Gothic"/>
+              </w:rPr>
+              <w:t>16 &lt;= SHM &lt; 18</w:t>
+            </w:r>
+          </w:p>
+        </w:tc>
+      </w:tr>
+      <w:tr>
+        <w:tc>
+          <w:tcPr>
+            <w:tcW w:type="dxa" w:w="2500"/>
+          </w:tcPr>
+          <w:p>
+            <w:pPr>
+              <w:spacing w:after="0"/>
+            </w:pPr>
+            <w:r/>
+            <w:r>
+              <w:rPr>
+                <w:rFonts w:ascii="Yu Gothic" w:hAnsi="Yu Gothic" w:eastAsia="Yu Gothic"/>
+              </w:rPr>
+              <w:t>18~20%</w:t>
+            </w:r>
+          </w:p>
+        </w:tc>
+        <w:tc>
+          <w:tcPr>
+            <w:tcW w:type="dxa" w:w="6860"/>
+          </w:tcPr>
+          <w:p>
+            <w:pPr>
+              <w:spacing w:after="0"/>
+            </w:pPr>
+            <w:r/>
+            <w:r>
+              <w:rPr>
+                <w:rFonts w:ascii="Yu Gothic" w:hAnsi="Yu Gothic" w:eastAsia="Yu Gothic"/>
+              </w:rPr>
+              <w:t>18 &lt;= SHM &lt; 20</w:t>
+            </w:r>
+          </w:p>
+        </w:tc>
+      </w:tr>
+      <w:tr>
+        <w:tc>
+          <w:tcPr>
+            <w:tcW w:type="dxa" w:w="2500"/>
+          </w:tcPr>
+          <w:p>
+            <w:pPr>
+              <w:spacing w:after="0"/>
+            </w:pPr>
+            <w:r/>
+            <w:r>
+              <w:rPr>
+                <w:rFonts w:ascii="Yu Gothic" w:hAnsi="Yu Gothic" w:eastAsia="Yu Gothic"/>
+              </w:rPr>
+              <w:t>20~%</w:t>
+            </w:r>
+          </w:p>
+        </w:tc>
+        <w:tc>
+          <w:tcPr>
+            <w:tcW w:type="dxa" w:w="6860"/>
+          </w:tcPr>
+          <w:p>
+            <w:pPr>
+              <w:spacing w:after="0"/>
+            </w:pPr>
+            <w:r/>
+            <w:r>
+              <w:rPr>
+                <w:rFonts w:ascii="Yu Gothic" w:hAnsi="Yu Gothic" w:eastAsia="Yu Gothic"/>
+              </w:rPr>
+              <w:t>20 &lt;= SHM</w:t>
+            </w:r>
+          </w:p>
+        </w:tc>
+      </w:tr>
+    </w:tbl>
+    <w:p/>
+    <w:tbl>
+      <w:tblPr>
+        <w:tblStyle w:val="TableGrid"/>
+        <w:tblW w:type="dxa" w:w="9360"/>
+        <w:jc w:val="left"/>
+        <w:tblLayout w:type="fixed"/>
+        <w:tblLook w:firstColumn="1" w:firstRow="1" w:lastColumn="0" w:lastRow="0" w:noHBand="0" w:noVBand="1" w:val="04A0"/>
+        <w:tblInd w:w="120" w:type="dxa"/>
+        <w:tblCellMar>
+          <w:top w:w="80" w:type="dxa"/>
+          <w:bottom w:w="80" w:type="dxa"/>
+          <w:start w:w="120" w:type="dxa"/>
+          <w:end w:w="120" w:type="dxa"/>
+        </w:tblCellMar>
+      </w:tblPr>
+      <w:tblGrid>
+        <w:gridCol w:w="3500"/>
+        <w:gridCol w:w="5860"/>
+      </w:tblGrid>
+      <w:tr>
+        <w:tc>
+          <w:tcPr>
+            <w:tcW w:type="dxa" w:w="3500"/>
+            <w:vAlign w:val="center"/>
+            <w:shd w:fill="E8EEF5"/>
+          </w:tcPr>
+          <w:p>
+            <w:r/>
+            <w:r>
+              <w:rPr>
+                <w:rFonts w:ascii="Yu Gothic" w:hAnsi="Yu Gothic" w:eastAsia="Yu Gothic"/>
+                <w:b/>
+              </w:rPr>
+              <w:t>出力</w:t>
+            </w:r>
+          </w:p>
+        </w:tc>
+        <w:tc>
+          <w:tcPr>
+            <w:tcW w:type="dxa" w:w="5860"/>
+            <w:vAlign w:val="center"/>
+            <w:shd w:fill="E8EEF5"/>
+          </w:tcPr>
+          <w:p>
+            <w:r/>
+            <w:r>
+              <w:rPr>
+                <w:rFonts w:ascii="Yu Gothic" w:hAnsi="Yu Gothic" w:eastAsia="Yu Gothic"/>
+                <w:b/>
+              </w:rPr>
+              <w:t>内容</w:t>
+            </w:r>
+          </w:p>
+        </w:tc>
+      </w:tr>
+      <w:tr>
+        <w:tc>
+          <w:tcPr>
+            <w:tcW w:type="dxa" w:w="3500"/>
+          </w:tcPr>
+          <w:p>
+            <w:pPr>
+              <w:spacing w:after="0"/>
+            </w:pPr>
+            <w:r/>
+            <w:r>
+              <w:rPr>
+                <w:rFonts w:ascii="Yu Gothic" w:hAnsi="Yu Gothic" w:eastAsia="Yu Gothic"/>
+              </w:rPr>
+              <w:t>*_shm_hist.tsv / *_shm_hist.png</w:t>
+            </w:r>
+          </w:p>
+        </w:tc>
+        <w:tc>
+          <w:tcPr>
+            <w:tcW w:type="dxa" w:w="5860"/>
+          </w:tcPr>
+          <w:p>
+            <w:pPr>
+              <w:spacing w:after="0"/>
+            </w:pPr>
+            <w:r/>
+            <w:r>
+              <w:rPr>
+                <w:rFonts w:ascii="Yu Gothic" w:hAnsi="Yu Gothic" w:eastAsia="Yu Gothic"/>
+              </w:rPr>
+              <w:t>row-levelの非重み付きSHM分布。</w:t>
+            </w:r>
+          </w:p>
+        </w:tc>
+      </w:tr>
+      <w:tr>
+        <w:tc>
+          <w:tcPr>
+            <w:tcW w:type="dxa" w:w="3500"/>
+          </w:tcPr>
+          <w:p>
+            <w:pPr>
+              <w:spacing w:after="0"/>
+            </w:pPr>
+            <w:r/>
+            <w:r>
+              <w:rPr>
+                <w:rFonts w:ascii="Yu Gothic" w:hAnsi="Yu Gothic" w:eastAsia="Yu Gothic"/>
+              </w:rPr>
+              <w:t>*_shm_hist_weighted.tsv / *_shm_hist_weighted.png</w:t>
+            </w:r>
+          </w:p>
+        </w:tc>
+        <w:tc>
+          <w:tcPr>
+            <w:tcW w:type="dxa" w:w="5860"/>
+          </w:tcPr>
+          <w:p>
+            <w:pPr>
+              <w:spacing w:after="0"/>
+            </w:pPr>
+            <w:r/>
+            <w:r>
+              <w:rPr>
+                <w:rFonts w:ascii="Yu Gothic" w:hAnsi="Yu Gothic" w:eastAsia="Yu Gothic"/>
+              </w:rPr>
+              <w:t>plot_weightを用いた重み付きSHM分布。</w:t>
             </w:r>
           </w:p>
         </w:tc>
@@ -671,71 +1709,78 @@
         <w:pStyle w:val="Heading1"/>
       </w:pPr>
       <w:r>
-        <w:t>3. SHM計算と保持する情報</w:t>
-      </w:r>
-    </w:p>
-    <w:p>
-      <w:r>
-        <w:t>現在の主方針は、同じjunction_aaであっても各sequence_idのSHMを潰さず残すことである。同じCDR3 AAでもV領域のmutation状態は別情報であり、medianに集約すると探索段階の情報を失う可能性がある。</w:t>
+        <w:t>7. Beta1方式との関係</w:t>
       </w:r>
     </w:p>
     <w:tbl>
       <w:tblPr>
         <w:tblStyle w:val="TableGrid"/>
         <w:tblW w:type="dxa" w:w="9360"/>
+        <w:jc w:val="left"/>
         <w:tblLayout w:type="fixed"/>
         <w:tblLook w:firstColumn="1" w:firstRow="1" w:lastColumn="0" w:lastRow="0" w:noHBand="0" w:noVBand="1" w:val="04A0"/>
         <w:tblInd w:w="120" w:type="dxa"/>
         <w:tblCellMar>
           <w:top w:w="80" w:type="dxa"/>
+          <w:bottom w:w="80" w:type="dxa"/>
           <w:start w:w="120" w:type="dxa"/>
-          <w:bottom w:w="80" w:type="dxa"/>
           <w:end w:w="120" w:type="dxa"/>
         </w:tblCellMar>
       </w:tblPr>
       <w:tblGrid>
-        <w:gridCol w:w="2200"/>
-        <w:gridCol w:w="7160"/>
+        <w:gridCol w:w="2400"/>
+        <w:gridCol w:w="3800"/>
+        <w:gridCol w:w="3160"/>
       </w:tblGrid>
       <w:tr>
-        <w:trPr>
-          <w:tblHeader w:val="true"/>
-        </w:trPr>
         <w:tc>
           <w:tcPr>
-            <w:tcW w:type="dxa" w:w="2200"/>
+            <w:tcW w:type="dxa" w:w="2400"/>
             <w:vAlign w:val="center"/>
             <w:shd w:fill="E8EEF5"/>
           </w:tcPr>
           <w:p>
-            <w:pPr>
-              <w:jc w:val="center"/>
-            </w:pPr>
+            <w:r/>
             <w:r>
               <w:rPr>
+                <w:rFonts w:ascii="Yu Gothic" w:hAnsi="Yu Gothic" w:eastAsia="Yu Gothic"/>
                 <w:b/>
-                <w:color w:val="0B2545"/>
               </w:rPr>
-              <w:t>出力列</w:t>
+              <w:t>方式</w:t>
             </w:r>
           </w:p>
         </w:tc>
         <w:tc>
           <w:tcPr>
-            <w:tcW w:type="dxa" w:w="7160"/>
+            <w:tcW w:type="dxa" w:w="3800"/>
             <w:vAlign w:val="center"/>
             <w:shd w:fill="E8EEF5"/>
           </w:tcPr>
           <w:p>
-            <w:pPr>
-              <w:jc w:val="center"/>
-            </w:pPr>
+            <w:r/>
             <w:r>
               <w:rPr>
+                <w:rFonts w:ascii="Yu Gothic" w:hAnsi="Yu Gothic" w:eastAsia="Yu Gothic"/>
                 <w:b/>
-                <w:color w:val="0B2545"/>
               </w:rPr>
-              <w:t>意味</w:t>
+              <w:t>SHMの扱い</w:t>
+            </w:r>
+          </w:p>
+        </w:tc>
+        <w:tc>
+          <w:tcPr>
+            <w:tcW w:type="dxa" w:w="3160"/>
+            <w:vAlign w:val="center"/>
+            <w:shd w:fill="E8EEF5"/>
+          </w:tcPr>
+          <w:p>
+            <w:r/>
+            <w:r>
+              <w:rPr>
+                <w:rFonts w:ascii="Yu Gothic" w:hAnsi="Yu Gothic" w:eastAsia="Yu Gothic"/>
+                <w:b/>
+              </w:rPr>
+              <w:t>用途</w:t>
             </w:r>
           </w:p>
         </w:tc>
@@ -743,27 +1788,52 @@
       <w:tr>
         <w:tc>
           <w:tcPr>
-            <w:tcW w:type="dxa" w:w="2200"/>
+            <w:tcW w:type="dxa" w:w="2400"/>
           </w:tcPr>
           <w:p>
             <w:pPr>
-              <w:spacing w:after="40"/>
+              <w:spacing w:after="0"/>
             </w:pPr>
+            <w:r/>
             <w:r>
-              <w:t>sequence_id</w:t>
+              <w:rPr>
+                <w:rFonts w:ascii="Yu Gothic" w:hAnsi="Yu Gothic" w:eastAsia="Yu Gothic"/>
+              </w:rPr>
+              <w:t>row-level主解析</w:t>
             </w:r>
           </w:p>
         </w:tc>
         <w:tc>
           <w:tcPr>
-            <w:tcW w:type="dxa" w:w="7160"/>
+            <w:tcW w:type="dxa" w:w="3800"/>
           </w:tcPr>
           <w:p>
             <w:pPr>
-              <w:spacing w:after="40"/>
+              <w:spacing w:after="0"/>
             </w:pPr>
+            <w:r/>
             <w:r>
-              <w:t>AIRR行の識別子。row-level解析の基本単位。</w:t>
+              <w:rPr>
+                <w:rFonts w:ascii="Yu Gothic" w:hAnsi="Yu Gothic" w:eastAsia="Yu Gothic"/>
+              </w:rPr>
+              <w:t>フィルタ後AIRR各行のSHMを保持する。</w:t>
+            </w:r>
+          </w:p>
+        </w:tc>
+        <w:tc>
+          <w:tcPr>
+            <w:tcW w:type="dxa" w:w="3160"/>
+          </w:tcPr>
+          <w:p>
+            <w:pPr>
+              <w:spacing w:after="0"/>
+            </w:pPr>
+            <w:r/>
+            <w:r>
+              <w:rPr>
+                <w:rFonts w:ascii="Yu Gothic" w:hAnsi="Yu Gothic" w:eastAsia="Yu Gothic"/>
+              </w:rPr>
+              <w:t>情報を潰さない主解析。</w:t>
             </w:r>
           </w:p>
         </w:tc>
@@ -771,139 +1841,52 @@
       <w:tr>
         <w:tc>
           <w:tcPr>
-            <w:tcW w:type="dxa" w:w="2200"/>
+            <w:tcW w:type="dxa" w:w="2400"/>
           </w:tcPr>
           <w:p>
             <w:pPr>
-              <w:spacing w:after="40"/>
+              <w:spacing w:after="0"/>
             </w:pPr>
+            <w:r/>
             <w:r>
-              <w:t>shm</w:t>
+              <w:rPr>
+                <w:rFonts w:ascii="Yu Gothic" w:hAnsi="Yu Gothic" w:eastAsia="Yu Gothic"/>
+              </w:rPr>
+              <w:t>Beta1互換</w:t>
             </w:r>
           </w:p>
         </w:tc>
         <w:tc>
           <w:tcPr>
-            <w:tcW w:type="dxa" w:w="7160"/>
+            <w:tcW w:type="dxa" w:w="3800"/>
           </w:tcPr>
           <w:p>
             <w:pPr>
-              <w:spacing w:after="40"/>
+              <w:spacing w:after="0"/>
             </w:pPr>
+            <w:r/>
             <w:r>
-              <w:t>v_identityから計算した%Mutation。</w:t>
-            </w:r>
-          </w:p>
-        </w:tc>
-      </w:tr>
-      <w:tr>
-        <w:tc>
-          <w:tcPr>
-            <w:tcW w:type="dxa" w:w="2200"/>
-          </w:tcPr>
-          <w:p>
-            <w:pPr>
-              <w:spacing w:after="40"/>
-            </w:pPr>
-            <w:r>
-              <w:t>v_identity</w:t>
+              <w:rPr>
+                <w:rFonts w:ascii="Yu Gothic" w:hAnsi="Yu Gothic" w:eastAsia="Yu Gothic"/>
+              </w:rPr>
+              <w:t>unique junctionごとにSHM medianを1点にする。</w:t>
             </w:r>
           </w:p>
         </w:tc>
         <w:tc>
           <w:tcPr>
-            <w:tcW w:type="dxa" w:w="7160"/>
+            <w:tcW w:type="dxa" w:w="3160"/>
           </w:tcPr>
           <w:p>
             <w:pPr>
-              <w:spacing w:after="40"/>
+              <w:spacing w:after="0"/>
             </w:pPr>
+            <w:r/>
             <w:r>
-              <w:t>SHM計算の元値。小数3桁程度まで出ることがあり、完全一致は限定的。</w:t>
-            </w:r>
-          </w:p>
-        </w:tc>
-      </w:tr>
-      <w:tr>
-        <w:tc>
-          <w:tcPr>
-            <w:tcW w:type="dxa" w:w="2200"/>
-          </w:tcPr>
-          <w:p>
-            <w:pPr>
-              <w:spacing w:after="40"/>
-            </w:pPr>
-            <w:r>
-              <w:t>junction / junction_aa</w:t>
-            </w:r>
-          </w:p>
-        </w:tc>
-        <w:tc>
-          <w:tcPr>
-            <w:tcW w:type="dxa" w:w="7160"/>
-          </w:tcPr>
-          <w:p>
-            <w:pPr>
-              <w:spacing w:after="40"/>
-            </w:pPr>
-            <w:r>
-              <w:t>CDR3 nt / AA。pGenとBeta1互換集計の連携に使う。</w:t>
-            </w:r>
-          </w:p>
-        </w:tc>
-      </w:tr>
-      <w:tr>
-        <w:tc>
-          <w:tcPr>
-            <w:tcW w:type="dxa" w:w="2200"/>
-          </w:tcPr>
-          <w:p>
-            <w:pPr>
-              <w:spacing w:after="40"/>
-            </w:pPr>
-            <w:r>
-              <w:t>v_call / j_call</w:t>
-            </w:r>
-          </w:p>
-        </w:tc>
-        <w:tc>
-          <w:tcPr>
-            <w:tcW w:type="dxa" w:w="7160"/>
-          </w:tcPr>
-          <w:p>
-            <w:pPr>
-              <w:spacing w:after="40"/>
-            </w:pPr>
-            <w:r>
-              <w:t>参考情報。pGen計算には直接使わないが解釈には重要。</w:t>
-            </w:r>
-          </w:p>
-        </w:tc>
-      </w:tr>
-      <w:tr>
-        <w:tc>
-          <w:tcPr>
-            <w:tcW w:type="dxa" w:w="2200"/>
-          </w:tcPr>
-          <w:p>
-            <w:pPr>
-              <w:spacing w:after="40"/>
-            </w:pPr>
-            <w:r>
-              <w:t>same_xy_count / plot_weight</w:t>
-            </w:r>
-          </w:p>
-        </w:tc>
-        <w:tc>
-          <w:tcPr>
-            <w:tcW w:type="dxa" w:w="7160"/>
-          </w:tcPr>
-          <w:p>
-            <w:pPr>
-              <w:spacing w:after="40"/>
-            </w:pPr>
-            <w:r>
-              <w:t>同一log10_pgen・SHM座標に重なるrow数と描画重み。</w:t>
+              <w:rPr>
+                <w:rFonts w:ascii="Yu Gothic" w:hAnsi="Yu Gothic" w:eastAsia="Yu Gothic"/>
+              </w:rPr>
+              <w:t>前任者法・旧Beta1との比較。</w:t>
             </w:r>
           </w:p>
         </w:tc>
@@ -915,71 +1898,29 @@
         <w:pStyle w:val="Heading1"/>
       </w:pPr>
       <w:r>
-        <w:t>4. Beta1方式との関係</w:t>
+        <w:t>8. 議論したポイント</w:t>
       </w:r>
     </w:p>
     <w:tbl>
       <w:tblPr>
         <w:tblStyle w:val="TableGrid"/>
         <w:tblW w:type="dxa" w:w="9360"/>
+        <w:jc w:val="left"/>
         <w:tblLayout w:type="fixed"/>
         <w:tblLook w:firstColumn="1" w:firstRow="1" w:lastColumn="0" w:lastRow="0" w:noHBand="0" w:noVBand="1" w:val="04A0"/>
         <w:tblInd w:w="120" w:type="dxa"/>
         <w:tblCellMar>
           <w:top w:w="80" w:type="dxa"/>
+          <w:bottom w:w="80" w:type="dxa"/>
           <w:start w:w="120" w:type="dxa"/>
-          <w:bottom w:w="80" w:type="dxa"/>
           <w:end w:w="120" w:type="dxa"/>
         </w:tblCellMar>
       </w:tblPr>
       <w:tblGrid>
-        <w:gridCol w:w="1600"/>
-        <w:gridCol w:w="2700"/>
         <w:gridCol w:w="2600"/>
-        <w:gridCol w:w="2460"/>
+        <w:gridCol w:w="6760"/>
       </w:tblGrid>
       <w:tr>
-        <w:trPr>
-          <w:tblHeader w:val="true"/>
-        </w:trPr>
-        <w:tc>
-          <w:tcPr>
-            <w:tcW w:type="dxa" w:w="1600"/>
-            <w:vAlign w:val="center"/>
-            <w:shd w:fill="E8EEF5"/>
-          </w:tcPr>
-          <w:p>
-            <w:pPr>
-              <w:jc w:val="center"/>
-            </w:pPr>
-            <w:r>
-              <w:rPr>
-                <w:b/>
-                <w:color w:val="0B2545"/>
-              </w:rPr>
-              <w:t>方式</w:t>
-            </w:r>
-          </w:p>
-        </w:tc>
-        <w:tc>
-          <w:tcPr>
-            <w:tcW w:type="dxa" w:w="2700"/>
-            <w:vAlign w:val="center"/>
-            <w:shd w:fill="E8EEF5"/>
-          </w:tcPr>
-          <w:p>
-            <w:pPr>
-              <w:jc w:val="center"/>
-            </w:pPr>
-            <w:r>
-              <w:rPr>
-                <w:b/>
-                <w:color w:val="0B2545"/>
-              </w:rPr>
-              <w:t>SHMの扱い</w:t>
-            </w:r>
-          </w:p>
-        </w:tc>
         <w:tc>
           <w:tcPr>
             <w:tcW w:type="dxa" w:w="2600"/>
@@ -987,34 +1928,30 @@
             <w:shd w:fill="E8EEF5"/>
           </w:tcPr>
           <w:p>
-            <w:pPr>
-              <w:jc w:val="center"/>
-            </w:pPr>
+            <w:r/>
             <w:r>
               <w:rPr>
+                <w:rFonts w:ascii="Yu Gothic" w:hAnsi="Yu Gothic" w:eastAsia="Yu Gothic"/>
                 <w:b/>
-                <w:color w:val="0B2545"/>
               </w:rPr>
-              <w:t>利点</w:t>
+              <w:t>論点</w:t>
             </w:r>
           </w:p>
         </w:tc>
         <w:tc>
           <w:tcPr>
-            <w:tcW w:type="dxa" w:w="2460"/>
+            <w:tcW w:type="dxa" w:w="6760"/>
             <w:vAlign w:val="center"/>
             <w:shd w:fill="E8EEF5"/>
           </w:tcPr>
           <w:p>
-            <w:pPr>
-              <w:jc w:val="center"/>
-            </w:pPr>
+            <w:r/>
             <w:r>
               <w:rPr>
+                <w:rFonts w:ascii="Yu Gothic" w:hAnsi="Yu Gothic" w:eastAsia="Yu Gothic"/>
                 <w:b/>
-                <w:color w:val="0B2545"/>
               </w:rPr>
-              <w:t>注意点</w:t>
+              <w:t>現行判断</w:t>
             </w:r>
           </w:p>
         </w:tc>
@@ -1022,53 +1959,35 @@
       <w:tr>
         <w:tc>
           <w:tcPr>
-            <w:tcW w:type="dxa" w:w="1600"/>
+            <w:tcW w:type="dxa" w:w="2600"/>
           </w:tcPr>
           <w:p>
             <w:pPr>
-              <w:spacing w:after="40"/>
+              <w:spacing w:after="0"/>
             </w:pPr>
+            <w:r/>
             <w:r>
-              <w:t>現在方式</w:t>
+              <w:rPr>
+                <w:rFonts w:ascii="Yu Gothic" w:hAnsi="Yu Gothic" w:eastAsia="Yu Gothic"/>
+              </w:rPr>
+              <w:t>同じjunction_aaでSHMが異なる場合</w:t>
             </w:r>
           </w:p>
         </w:tc>
         <w:tc>
           <w:tcPr>
-            <w:tcW w:type="dxa" w:w="2700"/>
+            <w:tcW w:type="dxa" w:w="6760"/>
           </w:tcPr>
           <w:p>
             <w:pPr>
-              <w:spacing w:after="40"/>
+              <w:spacing w:after="0"/>
             </w:pPr>
+            <w:r/>
             <w:r>
-              <w:t>各AIRR行のSHMをそのまま保持。</w:t>
-            </w:r>
-          </w:p>
-        </w:tc>
-        <w:tc>
-          <w:tcPr>
-            <w:tcW w:type="dxa" w:w="2600"/>
-          </w:tcPr>
-          <w:p>
-            <w:pPr>
-              <w:spacing w:after="40"/>
-            </w:pPr>
-            <w:r>
-              <w:t>情報を潰さず、scatterで存在確認しやすい。</w:t>
-            </w:r>
-          </w:p>
-        </w:tc>
-        <w:tc>
-          <w:tcPr>
-            <w:tcW w:type="dxa" w:w="2460"/>
-          </w:tcPr>
-          <w:p>
-            <w:pPr>
-              <w:spacing w:after="40"/>
-            </w:pPr>
-            <w:r>
-              <w:t>read abundanceやPCR増幅の影響を受ける。</w:t>
+              <w:rPr>
+                <w:rFonts w:ascii="Yu Gothic" w:hAnsi="Yu Gothic" w:eastAsia="Yu Gothic"/>
+              </w:rPr>
+              <w:t>生物学的に別情報なので、主解析では各sequence_id行を残す。</w:t>
             </w:r>
           </w:p>
         </w:tc>
@@ -1076,53 +1995,143 @@
       <w:tr>
         <w:tc>
           <w:tcPr>
-            <w:tcW w:type="dxa" w:w="1600"/>
+            <w:tcW w:type="dxa" w:w="2600"/>
           </w:tcPr>
           <w:p>
             <w:pPr>
-              <w:spacing w:after="40"/>
+              <w:spacing w:after="0"/>
             </w:pPr>
+            <w:r/>
             <w:r>
-              <w:t>Beta1互換</w:t>
+              <w:rPr>
+                <w:rFonts w:ascii="Yu Gothic" w:hAnsi="Yu Gothic" w:eastAsia="Yu Gothic"/>
+              </w:rPr>
+              <w:t>median化</w:t>
             </w:r>
           </w:p>
         </w:tc>
         <w:tc>
           <w:tcPr>
-            <w:tcW w:type="dxa" w:w="2700"/>
+            <w:tcW w:type="dxa" w:w="6760"/>
           </w:tcPr>
           <w:p>
             <w:pPr>
-              <w:spacing w:after="40"/>
+              <w:spacing w:after="0"/>
             </w:pPr>
+            <w:r/>
             <w:r>
-              <w:t>unique junction(nt)ごとにSHM medianを1点にする。</w:t>
+              <w:rPr>
+                <w:rFonts w:ascii="Yu Gothic" w:hAnsi="Yu Gothic" w:eastAsia="Yu Gothic"/>
+              </w:rPr>
+              <w:t>Beta1互換・比較用としては有用だが、主解析では情報を失うため行わない。</w:t>
             </w:r>
           </w:p>
         </w:tc>
+      </w:tr>
+      <w:tr>
         <w:tc>
           <w:tcPr>
             <w:tcW w:type="dxa" w:w="2600"/>
           </w:tcPr>
           <w:p>
             <w:pPr>
-              <w:spacing w:after="40"/>
+              <w:spacing w:after="0"/>
             </w:pPr>
+            <w:r/>
             <w:r>
-              <w:t>旧解析との比較、多様性寄りの視点に適する。</w:t>
+              <w:rPr>
+                <w:rFonts w:ascii="Yu Gothic" w:hAnsi="Yu Gothic" w:eastAsia="Yu Gothic"/>
+              </w:rPr>
+              <w:t>v_identityの小数桁</w:t>
             </w:r>
           </w:p>
         </w:tc>
         <w:tc>
           <w:tcPr>
-            <w:tcW w:type="dxa" w:w="2460"/>
+            <w:tcW w:type="dxa" w:w="6760"/>
           </w:tcPr>
           <w:p>
             <w:pPr>
-              <w:spacing w:after="40"/>
+              <w:spacing w:after="0"/>
             </w:pPr>
+            <w:r/>
             <w:r>
-              <w:t>同一junction内のSHMばらつきを失う。</w:t>
+              <w:rPr>
+                <w:rFonts w:ascii="Yu Gothic" w:hAnsi="Yu Gothic" w:eastAsia="Yu Gothic"/>
+              </w:rPr>
+              <w:t>小数3桁程度なら完全同一SHMは多くない想定だが、完全同一座標はsame_xy_countで把握する。</w:t>
+            </w:r>
+          </w:p>
+        </w:tc>
+      </w:tr>
+      <w:tr>
+        <w:tc>
+          <w:tcPr>
+            <w:tcW w:type="dxa" w:w="2600"/>
+          </w:tcPr>
+          <w:p>
+            <w:pPr>
+              <w:spacing w:after="0"/>
+            </w:pPr>
+            <w:r/>
+            <w:r>
+              <w:rPr>
+                <w:rFonts w:ascii="Yu Gothic" w:hAnsi="Yu Gothic" w:eastAsia="Yu Gothic"/>
+              </w:rPr>
+              <w:t>短いV alignment</w:t>
+            </w:r>
+          </w:p>
+        </w:tc>
+        <w:tc>
+          <w:tcPr>
+            <w:tcW w:type="dxa" w:w="6760"/>
+          </w:tcPr>
+          <w:p>
+            <w:pPr>
+              <w:spacing w:after="0"/>
+            </w:pPr>
+            <w:r/>
+            <w:r>
+              <w:rPr>
+                <w:rFonts w:ascii="Yu Gothic" w:hAnsi="Yu Gothic" w:eastAsia="Yu Gothic"/>
+              </w:rPr>
+              <w:t>初期既定では除外しない。必要に応じてMin V alignment lengthを設定し、QCで影響を確認する。</w:t>
+            </w:r>
+          </w:p>
+        </w:tc>
+      </w:tr>
+      <w:tr>
+        <w:tc>
+          <w:tcPr>
+            <w:tcW w:type="dxa" w:w="2600"/>
+          </w:tcPr>
+          <w:p>
+            <w:pPr>
+              <w:spacing w:after="0"/>
+            </w:pPr>
+            <w:r/>
+            <w:r>
+              <w:rPr>
+                <w:rFonts w:ascii="Yu Gothic" w:hAnsi="Yu Gothic" w:eastAsia="Yu Gothic"/>
+              </w:rPr>
+              <w:t>weighted SHM</w:t>
+            </w:r>
+          </w:p>
+        </w:tc>
+        <w:tc>
+          <w:tcPr>
+            <w:tcW w:type="dxa" w:w="6760"/>
+          </w:tcPr>
+          <w:p>
+            <w:pPr>
+              <w:spacing w:after="0"/>
+            </w:pPr>
+            <w:r/>
+            <w:r>
+              <w:rPr>
+                <w:rFonts w:ascii="Yu Gothic" w:hAnsi="Yu Gothic" w:eastAsia="Yu Gothic"/>
+              </w:rPr>
+              <w:t>read数やduplicate_countを反映できるが、PCR増幅やsamplingの影響も受ける。非重み付きと併用する。</w:t>
             </w:r>
           </w:p>
         </w:tc>
@@ -1134,87 +2143,246 @@
         <w:pStyle w:val="Heading1"/>
       </w:pPr>
       <w:r>
-        <w:t>5. SHMヒストグラム</w:t>
+        <w:t>9. 再現チェック</w:t>
       </w:r>
     </w:p>
-    <w:p>
-      <w:pPr>
-        <w:pStyle w:val="ListBullet"/>
-        <w:spacing w:after="80" w:line="300" w:lineRule="auto"/>
-        <w:ind w:left="540" w:hanging="271"/>
-      </w:pPr>
-      <w:r>
-        <w:t>非重み付きSHM histogramは、採用rowを1行1カウントとしてSHM binに入れる。</w:t>
-      </w:r>
-    </w:p>
-    <w:p>
-      <w:pPr>
-        <w:pStyle w:val="ListBullet"/>
-        <w:spacing w:after="80" w:line="300" w:lineRule="auto"/>
-        <w:ind w:left="540" w:hanging="271"/>
-      </w:pPr>
-      <w:r>
-        <w:t>weighted SHM histogramは、plot_weightを使う。通常はrow数と同じだが、duplicate_countを使う設定ではその重みに従う。</w:t>
-      </w:r>
-    </w:p>
-    <w:p>
-      <w:pPr>
-        <w:pStyle w:val="ListBullet"/>
-        <w:spacing w:after="80" w:line="300" w:lineRule="auto"/>
-        <w:ind w:left="540" w:hanging="271"/>
-      </w:pPr>
-      <w:r>
-        <w:t>binは0-2%, 2-4%, ... , 18-20%, 20%以上を使う。</w:t>
-      </w:r>
-    </w:p>
-    <w:p>
-      <w:pPr>
-        <w:pStyle w:val="ListBullet"/>
-        <w:spacing w:after="80" w:line="300" w:lineRule="auto"/>
-        <w:ind w:left="540" w:hanging="271"/>
-      </w:pPr>
-      <w:r>
-        <w:t>V alignment lengthが短い群でSHMが低く見える可能性があるため、QC summaryと必要に応じたMin V alignment length設定を確認する。</w:t>
-      </w:r>
-    </w:p>
-    <w:p>
-      <w:pPr>
-        <w:pStyle w:val="Heading1"/>
-      </w:pPr>
-      <w:r>
-        <w:t>6. 議論点と今後の確認事項</w:t>
-      </w:r>
-    </w:p>
-    <w:p>
-      <w:pPr>
-        <w:pStyle w:val="ListBullet"/>
-        <w:spacing w:after="80" w:line="300" w:lineRule="auto"/>
-        <w:ind w:left="540" w:hanging="271"/>
-      </w:pPr>
-      <w:r>
-        <w:t>SHMはV領域由来であり、CDR3のpGenとは別情報である。低SHM・高pGen領域の生物学的解釈では、V alignment品質も確認する。</w:t>
-      </w:r>
-    </w:p>
-    <w:p>
-      <w:pPr>
-        <w:pStyle w:val="ListBullet"/>
-        <w:spacing w:after="80" w:line="300" w:lineRule="auto"/>
-        <w:ind w:left="540" w:hanging="271"/>
-      </w:pPr>
-      <w:r>
-        <w:t>各点方式は探索に向くが、クローン増幅やread数の影響を受ける。多様性を見る場合はBeta1互換のunique junction集計を併用する。</w:t>
-      </w:r>
-    </w:p>
-    <w:p>
-      <w:pPr>
-        <w:pStyle w:val="ListBullet"/>
-        <w:spacing w:after="80" w:line="300" w:lineRule="auto"/>
-        <w:ind w:left="540" w:hanging="271"/>
-      </w:pPr>
-      <w:r>
-        <w:t>Min V alignment lengthを既定で入れるかは未確定。現時点では除外せず、必要に応じて再解析で評価する。</w:t>
-      </w:r>
-    </w:p>
+    <w:tbl>
+      <w:tblPr>
+        <w:tblStyle w:val="TableGrid"/>
+        <w:tblW w:type="dxa" w:w="9360"/>
+        <w:jc w:val="left"/>
+        <w:tblLayout w:type="fixed"/>
+        <w:tblLook w:firstColumn="1" w:firstRow="1" w:lastColumn="0" w:lastRow="0" w:noHBand="0" w:noVBand="1" w:val="04A0"/>
+        <w:tblInd w:w="120" w:type="dxa"/>
+        <w:tblCellMar>
+          <w:top w:w="80" w:type="dxa"/>
+          <w:bottom w:w="80" w:type="dxa"/>
+          <w:start w:w="120" w:type="dxa"/>
+          <w:end w:w="120" w:type="dxa"/>
+        </w:tblCellMar>
+      </w:tblPr>
+      <w:tblGrid>
+        <w:gridCol w:w="2500"/>
+        <w:gridCol w:w="6860"/>
+      </w:tblGrid>
+      <w:tr>
+        <w:tc>
+          <w:tcPr>
+            <w:tcW w:type="dxa" w:w="2500"/>
+            <w:vAlign w:val="center"/>
+            <w:shd w:fill="E8EEF5"/>
+          </w:tcPr>
+          <w:p>
+            <w:r/>
+            <w:r>
+              <w:rPr>
+                <w:rFonts w:ascii="Yu Gothic" w:hAnsi="Yu Gothic" w:eastAsia="Yu Gothic"/>
+                <w:b/>
+              </w:rPr>
+              <w:t>確認</w:t>
+            </w:r>
+          </w:p>
+        </w:tc>
+        <w:tc>
+          <w:tcPr>
+            <w:tcW w:type="dxa" w:w="6860"/>
+            <w:vAlign w:val="center"/>
+            <w:shd w:fill="E8EEF5"/>
+          </w:tcPr>
+          <w:p>
+            <w:r/>
+            <w:r>
+              <w:rPr>
+                <w:rFonts w:ascii="Yu Gothic" w:hAnsi="Yu Gothic" w:eastAsia="Yu Gothic"/>
+                <w:b/>
+              </w:rPr>
+              <w:t>期待される状態</w:t>
+            </w:r>
+          </w:p>
+        </w:tc>
+      </w:tr>
+      <w:tr>
+        <w:tc>
+          <w:tcPr>
+            <w:tcW w:type="dxa" w:w="2500"/>
+          </w:tcPr>
+          <w:p>
+            <w:pPr>
+              <w:spacing w:after="0"/>
+            </w:pPr>
+            <w:r/>
+            <w:r>
+              <w:rPr>
+                <w:rFonts w:ascii="Yu Gothic" w:hAnsi="Yu Gothic" w:eastAsia="Yu Gothic"/>
+              </w:rPr>
+              <w:t>v_identity</w:t>
+            </w:r>
+          </w:p>
+        </w:tc>
+        <w:tc>
+          <w:tcPr>
+            <w:tcW w:type="dxa" w:w="6860"/>
+          </w:tcPr>
+          <w:p>
+            <w:pPr>
+              <w:spacing w:after="0"/>
+            </w:pPr>
+            <w:r/>
+            <w:r>
+              <w:rPr>
+                <w:rFonts w:ascii="Yu Gothic" w:hAnsi="Yu Gothic" w:eastAsia="Yu Gothic"/>
+              </w:rPr>
+              <w:t>欠損・非数値が除外され、shm列が作成される。</w:t>
+            </w:r>
+          </w:p>
+        </w:tc>
+      </w:tr>
+      <w:tr>
+        <w:tc>
+          <w:tcPr>
+            <w:tcW w:type="dxa" w:w="2500"/>
+          </w:tcPr>
+          <w:p>
+            <w:pPr>
+              <w:spacing w:after="0"/>
+            </w:pPr>
+            <w:r/>
+            <w:r>
+              <w:rPr>
+                <w:rFonts w:ascii="Yu Gothic" w:hAnsi="Yu Gothic" w:eastAsia="Yu Gothic"/>
+              </w:rPr>
+              <w:t>SHM範囲</w:t>
+            </w:r>
+          </w:p>
+        </w:tc>
+        <w:tc>
+          <w:tcPr>
+            <w:tcW w:type="dxa" w:w="6860"/>
+          </w:tcPr>
+          <w:p>
+            <w:pPr>
+              <w:spacing w:after="0"/>
+            </w:pPr>
+            <w:r/>
+            <w:r>
+              <w:rPr>
+                <w:rFonts w:ascii="Yu Gothic" w:hAnsi="Yu Gothic" w:eastAsia="Yu Gothic"/>
+              </w:rPr>
+              <w:t>負値は0に補正される。</w:t>
+            </w:r>
+          </w:p>
+        </w:tc>
+      </w:tr>
+      <w:tr>
+        <w:tc>
+          <w:tcPr>
+            <w:tcW w:type="dxa" w:w="2500"/>
+          </w:tcPr>
+          <w:p>
+            <w:pPr>
+              <w:spacing w:after="0"/>
+            </w:pPr>
+            <w:r/>
+            <w:r>
+              <w:rPr>
+                <w:rFonts w:ascii="Yu Gothic" w:hAnsi="Yu Gothic" w:eastAsia="Yu Gothic"/>
+              </w:rPr>
+              <w:t>row-level保持</w:t>
+            </w:r>
+          </w:p>
+        </w:tc>
+        <w:tc>
+          <w:tcPr>
+            <w:tcW w:type="dxa" w:w="6860"/>
+          </w:tcPr>
+          <w:p>
+            <w:pPr>
+              <w:spacing w:after="0"/>
+            </w:pPr>
+            <w:r/>
+            <w:r>
+              <w:rPr>
+                <w:rFonts w:ascii="Yu Gothic" w:hAnsi="Yu Gothic" w:eastAsia="Yu Gothic"/>
+              </w:rPr>
+              <w:t>同じjunction_aaでもsequence_idごとのshmが残る。</w:t>
+            </w:r>
+          </w:p>
+        </w:tc>
+      </w:tr>
+      <w:tr>
+        <w:tc>
+          <w:tcPr>
+            <w:tcW w:type="dxa" w:w="2500"/>
+          </w:tcPr>
+          <w:p>
+            <w:pPr>
+              <w:spacing w:after="0"/>
+            </w:pPr>
+            <w:r/>
+            <w:r>
+              <w:rPr>
+                <w:rFonts w:ascii="Yu Gothic" w:hAnsi="Yu Gothic" w:eastAsia="Yu Gothic"/>
+              </w:rPr>
+              <w:t>SHM histogram</w:t>
+            </w:r>
+          </w:p>
+        </w:tc>
+        <w:tc>
+          <w:tcPr>
+            <w:tcW w:type="dxa" w:w="6860"/>
+          </w:tcPr>
+          <w:p>
+            <w:pPr>
+              <w:spacing w:after="0"/>
+            </w:pPr>
+            <w:r/>
+            <w:r>
+              <w:rPr>
+                <w:rFonts w:ascii="Yu Gothic" w:hAnsi="Yu Gothic" w:eastAsia="Yu Gothic"/>
+              </w:rPr>
+              <w:t>非重み付き版と重み付き版が両方出力される。</w:t>
+            </w:r>
+          </w:p>
+        </w:tc>
+      </w:tr>
+      <w:tr>
+        <w:tc>
+          <w:tcPr>
+            <w:tcW w:type="dxa" w:w="2500"/>
+          </w:tcPr>
+          <w:p>
+            <w:pPr>
+              <w:spacing w:after="0"/>
+            </w:pPr>
+            <w:r/>
+            <w:r>
+              <w:rPr>
+                <w:rFonts w:ascii="Yu Gothic" w:hAnsi="Yu Gothic" w:eastAsia="Yu Gothic"/>
+              </w:rPr>
+              <w:t>pGen-SHM plot</w:t>
+            </w:r>
+          </w:p>
+        </w:tc>
+        <w:tc>
+          <w:tcPr>
+            <w:tcW w:type="dxa" w:w="6860"/>
+          </w:tcPr>
+          <w:p>
+            <w:pPr>
+              <w:spacing w:after="0"/>
+            </w:pPr>
+            <w:r/>
+            <w:r>
+              <w:rPr>
+                <w:rFonts w:ascii="Yu Gothic" w:hAnsi="Yu Gothic" w:eastAsia="Yu Gothic"/>
+              </w:rPr>
+              <w:t>y軸にrow-levelのshmを使う。Beta1互換plotではshm_medianを使う。</w:t>
+            </w:r>
+          </w:p>
+        </w:tc>
+      </w:tr>
+    </w:tbl>
+    <w:p/>
     <w:sectPr>
       <w:footerReference w:type="default" r:id="rId9"/>
       <w:pgSz w:w="12240" w:h="15840"/>
@@ -1235,10 +2403,11 @@
     </w:pPr>
     <w:r>
       <w:rPr>
-        <w:color w:val="555555"/>
-        <w:sz w:val="16"/>
-      </w:rPr>
-      <w:t>SHM specification / row-level and beta1-compatible handoff</w:t>
+        <w:rFonts w:ascii="Yu Gothic" w:hAnsi="Yu Gothic" w:eastAsia="Yu Gothic"/>
+        <w:color w:val="666666"/>
+        <w:sz w:val="18"/>
+      </w:rPr>
+      <w:t>SHM calculation specification</w:t>
     </w:r>
   </w:p>
 </w:ftr>
@@ -1611,7 +2780,7 @@
       <w:spacing w:after="120" w:line="300" w:lineRule="auto"/>
     </w:pPr>
     <w:rPr>
-      <w:rFonts w:ascii="Calibri" w:hAnsi="Calibri"/>
+      <w:rFonts w:ascii="Yu Gothic" w:hAnsi="Yu Gothic" w:eastAsia="Yu Gothic"/>
       <w:sz w:val="22"/>
     </w:rPr>
   </w:style>
@@ -1670,11 +2839,11 @@
     <w:pPr>
       <w:keepNext/>
       <w:keepLines/>
-      <w:spacing w:before="360" w:after="200"/>
+      <w:spacing w:before="360" w:after="200" w:line="300" w:lineRule="auto"/>
       <w:outlineLvl w:val="0"/>
     </w:pPr>
     <w:rPr>
-      <w:rFonts w:asciiTheme="majorHAnsi" w:eastAsiaTheme="majorEastAsia" w:hAnsiTheme="majorHAnsi" w:cstheme="majorBidi" w:ascii="Calibri" w:hAnsi="Calibri"/>
+      <w:rFonts w:asciiTheme="majorHAnsi" w:eastAsiaTheme="majorEastAsia" w:hAnsiTheme="majorHAnsi" w:cstheme="majorBidi" w:ascii="Yu Gothic" w:hAnsi="Yu Gothic" w:eastAsia="Yu Gothic"/>
       <w:b/>
       <w:bCs/>
       <w:color w:val="2E74B5"/>
@@ -1694,11 +2863,11 @@
     <w:pPr>
       <w:keepNext/>
       <w:keepLines/>
-      <w:spacing w:before="280" w:after="140"/>
+      <w:spacing w:before="280" w:after="140" w:line="300" w:lineRule="auto"/>
       <w:outlineLvl w:val="1"/>
     </w:pPr>
     <w:rPr>
-      <w:rFonts w:asciiTheme="majorHAnsi" w:eastAsiaTheme="majorEastAsia" w:hAnsiTheme="majorHAnsi" w:cstheme="majorBidi" w:ascii="Calibri" w:hAnsi="Calibri"/>
+      <w:rFonts w:asciiTheme="majorHAnsi" w:eastAsiaTheme="majorEastAsia" w:hAnsiTheme="majorHAnsi" w:cstheme="majorBidi" w:ascii="Yu Gothic" w:hAnsi="Yu Gothic" w:eastAsia="Yu Gothic"/>
       <w:b/>
       <w:bCs/>
       <w:color w:val="2E74B5"/>
@@ -1718,11 +2887,11 @@
     <w:pPr>
       <w:keepNext/>
       <w:keepLines/>
-      <w:spacing w:before="200" w:after="100"/>
+      <w:spacing w:before="200" w:after="100" w:line="300" w:lineRule="auto"/>
       <w:outlineLvl w:val="2"/>
     </w:pPr>
     <w:rPr>
-      <w:rFonts w:asciiTheme="majorHAnsi" w:eastAsiaTheme="majorEastAsia" w:hAnsiTheme="majorHAnsi" w:cstheme="majorBidi" w:ascii="Calibri" w:hAnsi="Calibri"/>
+      <w:rFonts w:asciiTheme="majorHAnsi" w:eastAsiaTheme="majorEastAsia" w:hAnsiTheme="majorHAnsi" w:cstheme="majorBidi" w:ascii="Yu Gothic" w:hAnsi="Yu Gothic" w:eastAsia="Yu Gothic"/>
       <w:b/>
       <w:bCs/>
       <w:color w:val="1F4D78"/>

</xml_diff>

<commit_message>
Expand prose in pGen SHM specifications
</commit_message>
<xml_diff>
--- a/TSVからSHMデータ作成仕様書_20260607.docx
+++ b/TSVからSHMデータ作成仕様書_20260607.docx
@@ -92,6 +92,16 @@
       </w:pPr>
       <w:r>
         <w:t>同じjunction_aaでも、V領域のmutation状態は異なり得る。したがって主解析では、同じjunction_aaをmedianに潰さず、各sequence_id行のSHMを保持する。</w:t>
+      </w:r>
+    </w:p>
+    <w:p>
+      <w:r>
+        <w:t>SHMは縦軸の値を決める情報であり、同じjunction_aaの中に複数のSHMが存在すること自体が重要な観察対象になり得る。したがって、SHM計算後はまずrow-level表にshm列として保存し、そこからSHM histogramやpGen-SHM plotへ展開する。</w:t>
+      </w:r>
+    </w:p>
+    <w:p>
+      <w:r>
+        <w:t>この設計では、同じjunction_aaが同じpGenを持っていても、v_identityが異なればpGen-SHM plot上では同じx座標に複数のy座標が現れる。これは重複ではなく、V領域のmutation状態を保持した結果である。</w:t>
       </w:r>
     </w:p>
     <w:p>
@@ -839,6 +849,16 @@
       </w:pPr>
       <w:r>
         <w:t>5. row-level SHM保持</w:t>
+      </w:r>
+    </w:p>
+    <w:p>
+      <w:r>
+        <w:t>row-level SHM保持では、各sequence_idのSHMをそのまま残す。完全に同じSHM値になる行が複数あっても、Excel/TSVでは行を消さない。pGen-SHM plot上で同一座標になった場合だけ、描画時にsame_xy_countやplot_weightとして扱う。</w:t>
+      </w:r>
+    </w:p>
+    <w:p>
+      <w:r>
+        <w:t>SHMをunique junctionやunique junction_aa単位でmedian化する方法は、過去Ver比較や多様性寄りの見方には有用である。しかし、主解析でこれを行うと、同じCDR3 AAに紐づくV領域mutationのばらつきが見えなくなるため、row-levelを中心にする。</w:t>
       </w:r>
     </w:p>
     <w:tbl>

</xml_diff>